<commit_message>
feat: Atualização da documentação
</commit_message>
<xml_diff>
--- a/docs/sistema de detecção de anomalias.docx
+++ b/docs/sistema de detecção de anomalias.docx
@@ -1,6 +1,6 @@
 
 <file path=word/document.xml><?xml version="1.0" encoding="utf-8"?>
-<w:document xmlns:wpc="http://schemas.microsoft.com/office/word/2010/wordprocessingCanvas" xmlns:cx="http://schemas.microsoft.com/office/drawing/2014/chartex" xmlns:cx1="http://schemas.microsoft.com/office/drawing/2015/9/8/chartex" xmlns:cx2="http://schemas.microsoft.com/office/drawing/2015/10/21/chartex" xmlns:cx3="http://schemas.microsoft.com/office/drawing/2016/5/9/chartex" xmlns:cx4="http://schemas.microsoft.com/office/drawing/2016/5/10/chartex" xmlns:cx5="http://schemas.microsoft.com/office/drawing/2016/5/11/chartex" xmlns:cx6="http://schemas.microsoft.com/office/drawing/2016/5/12/chartex" xmlns:cx7="http://schemas.microsoft.com/office/drawing/2016/5/13/chartex" xmlns:cx8="http://schemas.microsoft.com/office/drawing/2016/5/14/chartex" xmlns:mc="http://schemas.openxmlformats.org/markup-compatibility/2006" xmlns:aink="http://schemas.microsoft.com/office/drawing/2016/ink" xmlns:am3d="http://schemas.microsoft.com/office/drawing/2017/model3d" xmlns:o="urn:schemas-microsoft-com:office:office" xmlns:oel="http://schemas.microsoft.com/office/2019/extlst" xmlns:r="http://schemas.openxmlformats.org/officeDocument/2006/relationships" xmlns:m="http://schemas.openxmlformats.org/officeDocument/2006/math" xmlns:v="urn:schemas-microsoft-com:vml" xmlns:wp14="http://schemas.microsoft.com/office/word/2010/wordprocessingDrawing" xmlns:wp="http://schemas.openxmlformats.org/drawingml/2006/wordprocessingDrawing" xmlns:w10="urn:schemas-microsoft-com:office:word" xmlns:w="http://schemas.openxmlformats.org/wordprocessingml/2006/main" xmlns:w14="http://schemas.microsoft.com/office/word/2010/wordml" xmlns:w15="http://schemas.microsoft.com/office/word/2012/wordml" xmlns:w16cex="http://schemas.microsoft.com/office/word/2018/wordml/cex" xmlns:w16cid="http://schemas.microsoft.com/office/word/2016/wordml/cid" xmlns:w16="http://schemas.microsoft.com/office/word/2018/wordml" xmlns:w16sdtdh="http://schemas.microsoft.com/office/word/2020/wordml/sdtdatahash" xmlns:w16se="http://schemas.microsoft.com/office/word/2015/wordml/symex" xmlns:wpg="http://schemas.microsoft.com/office/word/2010/wordprocessingGroup" xmlns:wpi="http://schemas.microsoft.com/office/word/2010/wordprocessingInk" xmlns:wne="http://schemas.microsoft.com/office/word/2006/wordml" xmlns:wps="http://schemas.microsoft.com/office/word/2010/wordprocessingShape" mc:Ignorable="w14 w15 w16se w16cid w16 w16cex w16sdtdh wp14">
+<w:document xmlns:wpc="http://schemas.microsoft.com/office/word/2010/wordprocessingCanvas" xmlns:cx="http://schemas.microsoft.com/office/drawing/2014/chartex" xmlns:cx1="http://schemas.microsoft.com/office/drawing/2015/9/8/chartex" xmlns:cx2="http://schemas.microsoft.com/office/drawing/2015/10/21/chartex" xmlns:cx3="http://schemas.microsoft.com/office/drawing/2016/5/9/chartex" xmlns:cx4="http://schemas.microsoft.com/office/drawing/2016/5/10/chartex" xmlns:cx5="http://schemas.microsoft.com/office/drawing/2016/5/11/chartex" xmlns:cx6="http://schemas.microsoft.com/office/drawing/2016/5/12/chartex" xmlns:cx7="http://schemas.microsoft.com/office/drawing/2016/5/13/chartex" xmlns:cx8="http://schemas.microsoft.com/office/drawing/2016/5/14/chartex" xmlns:mc="http://schemas.openxmlformats.org/markup-compatibility/2006" xmlns:aink="http://schemas.microsoft.com/office/drawing/2016/ink" xmlns:am3d="http://schemas.microsoft.com/office/drawing/2017/model3d" xmlns:o="urn:schemas-microsoft-com:office:office" xmlns:oel="http://schemas.microsoft.com/office/2019/extlst" xmlns:r="http://schemas.openxmlformats.org/officeDocument/2006/relationships" xmlns:m="http://schemas.openxmlformats.org/officeDocument/2006/math" xmlns:v="urn:schemas-microsoft-com:vml" xmlns:wp14="http://schemas.microsoft.com/office/word/2010/wordprocessingDrawing" xmlns:wp="http://schemas.openxmlformats.org/drawingml/2006/wordprocessingDrawing" xmlns:w10="urn:schemas-microsoft-com:office:word" xmlns:w="http://schemas.openxmlformats.org/wordprocessingml/2006/main" xmlns:w14="http://schemas.microsoft.com/office/word/2010/wordml" xmlns:w15="http://schemas.microsoft.com/office/word/2012/wordml" xmlns:w16cex="http://schemas.microsoft.com/office/word/2018/wordml/cex" xmlns:w16cid="http://schemas.microsoft.com/office/word/2016/wordml/cid" xmlns:w16="http://schemas.microsoft.com/office/word/2018/wordml" xmlns:w16du="http://schemas.microsoft.com/office/word/2023/wordml/word16du" xmlns:w16sdtdh="http://schemas.microsoft.com/office/word/2020/wordml/sdtdatahash" xmlns:w16sdtfl="http://schemas.microsoft.com/office/word/2024/wordml/sdtformatlock" xmlns:w16se="http://schemas.microsoft.com/office/word/2015/wordml/symex" xmlns:wpg="http://schemas.microsoft.com/office/word/2010/wordprocessingGroup" xmlns:wpi="http://schemas.microsoft.com/office/word/2010/wordprocessingInk" xmlns:wne="http://schemas.microsoft.com/office/word/2006/wordml" xmlns:wps="http://schemas.microsoft.com/office/word/2010/wordprocessingShape" mc:Ignorable="w14 w15 w16se w16cid w16 w16cex w16sdtdh w16sdtfl w16du wp14">
   <w:body>
     <w:p>
       <w:pPr>
@@ -192,23 +192,13 @@
           <w:rFonts w:ascii="Arial" w:hAnsi="Arial" w:cs="Arial"/>
         </w:rPr>
       </w:pPr>
-      <w:proofErr w:type="spellStart"/>
       <w:r>
         <w:rPr>
           <w:rFonts w:ascii="Arial" w:hAnsi="Arial" w:cs="Arial"/>
           <w:b/>
           <w:bCs/>
         </w:rPr>
-        <w:t>Luis</w:t>
-      </w:r>
-      <w:proofErr w:type="spellEnd"/>
-      <w:r>
-        <w:rPr>
-          <w:rFonts w:ascii="Arial" w:hAnsi="Arial" w:cs="Arial"/>
-          <w:b/>
-          <w:bCs/>
-        </w:rPr>
-        <w:t xml:space="preserve"> Felipe Nassif</w:t>
+        <w:t>Luis Felipe Nassif</w:t>
       </w:r>
       <w:r>
         <w:rPr>
@@ -588,23 +578,13 @@
           <w:rFonts w:ascii="Arial" w:hAnsi="Arial" w:cs="Arial"/>
         </w:rPr>
       </w:pPr>
-      <w:proofErr w:type="spellStart"/>
       <w:r>
         <w:rPr>
           <w:rFonts w:ascii="Arial" w:hAnsi="Arial" w:cs="Arial"/>
           <w:b/>
           <w:bCs/>
         </w:rPr>
-        <w:t>Luis</w:t>
-      </w:r>
-      <w:proofErr w:type="spellEnd"/>
-      <w:r>
-        <w:rPr>
-          <w:rFonts w:ascii="Arial" w:hAnsi="Arial" w:cs="Arial"/>
-          <w:b/>
-          <w:bCs/>
-        </w:rPr>
-        <w:t xml:space="preserve"> Felipe Nassif </w:t>
+        <w:t xml:space="preserve">Luis Felipe Nassif </w:t>
       </w:r>
       <w:r>
         <w:rPr>
@@ -738,7 +718,7 @@
         <w:rPr>
           <w:rFonts w:ascii="Arial" w:hAnsi="Arial" w:cs="Arial"/>
         </w:rPr>
-        <w:t xml:space="preserve">Trabalho de </w:t>
+        <w:t xml:space="preserve">Trabalho </w:t>
       </w:r>
       <w:r>
         <w:rPr>
@@ -872,7 +852,13 @@
     <w:sdt>
       <w:sdtPr>
         <w:rPr>
-          <w:rFonts w:ascii="Arial" w:hAnsi="Arial" w:cs="Arial"/>
+          <w:rFonts w:ascii="Arial" w:eastAsiaTheme="minorHAnsi" w:hAnsi="Arial" w:cs="Arial"/>
+          <w:color w:val="auto"/>
+          <w:kern w:val="2"/>
+          <w:sz w:val="24"/>
+          <w:szCs w:val="24"/>
+          <w:lang w:eastAsia="en-US"/>
+          <w14:ligatures w14:val="standardContextual"/>
         </w:rPr>
         <w:id w:val="-2063940661"/>
         <w:docPartObj>
@@ -882,15 +868,8 @@
       </w:sdtPr>
       <w:sdtEndPr>
         <w:rPr>
-          <w:rFonts w:eastAsiaTheme="minorHAnsi"/>
           <w:b/>
           <w:bCs/>
-          <w:color w:val="auto"/>
-          <w:kern w:val="2"/>
-          <w:sz w:val="24"/>
-          <w:szCs w:val="24"/>
-          <w:lang w:eastAsia="en-US"/>
-          <w14:ligatures w14:val="standardContextual"/>
         </w:rPr>
       </w:sdtEndPr>
       <w:sdtContent>
@@ -3593,6 +3572,7 @@
     <w:p>
       <w:pPr>
         <w:spacing w:before="100" w:beforeAutospacing="1" w:after="100" w:afterAutospacing="1" w:line="240" w:lineRule="auto"/>
+        <w:ind w:firstLine="708"/>
         <w:rPr>
           <w:rFonts w:ascii="Arial" w:eastAsia="Times New Roman" w:hAnsi="Arial" w:cs="Arial"/>
           <w:kern w:val="0"/>
@@ -4076,7 +4056,7 @@
           <w:lang w:eastAsia="pt-BR"/>
           <w14:ligatures w14:val="none"/>
         </w:rPr>
-        <w:t>Neste projeto, o Arduino é utilizado como sistema embarcado responsável pela leitura dos sensores MQ2, MQ7 e DHT22, pelo tratamento básico de valores inválidos e pelo envio estruturado das informações via comunicação serial. Por se tratar de uma plataforma amplamente difundida, com vasta documentação e bibliotecas disponíveis, o Arduino facilita o desenvolvimento de protótipos funcionais de forma rápida e acessível.</w:t>
+        <w:t>Neste projeto, o Arduino é utilizado como sistema embarcado responsável pela leitura dos sensores, tratamento básico de valores inválidos e pelo envio estruturado das informações via comunicação serial. Por se tratar de uma plataforma amplamente difundida, com vasta documentação e bibliotecas disponíveis, o Arduino facilita o desenvolvimento de protótipos funcionais de forma rápida e acessível.</w:t>
       </w:r>
     </w:p>
     <w:p>
@@ -4118,7 +4098,7 @@
     <w:p>
       <w:pPr>
         <w:spacing w:before="100" w:beforeAutospacing="1" w:after="100" w:afterAutospacing="1" w:line="240" w:lineRule="auto"/>
-        <w:ind w:firstLine="360"/>
+        <w:ind w:firstLine="708"/>
         <w:rPr>
           <w:rFonts w:ascii="Arial" w:eastAsia="Times New Roman" w:hAnsi="Arial" w:cs="Arial"/>
           <w:kern w:val="0"/>
@@ -4244,7 +4224,7 @@
     <w:p>
       <w:pPr>
         <w:spacing w:before="100" w:beforeAutospacing="1" w:after="100" w:afterAutospacing="1" w:line="240" w:lineRule="auto"/>
-        <w:ind w:firstLine="360"/>
+        <w:ind w:firstLine="708"/>
         <w:rPr>
           <w:rFonts w:ascii="Arial" w:eastAsia="Times New Roman" w:hAnsi="Arial" w:cs="Arial"/>
           <w:kern w:val="0"/>
@@ -4322,7 +4302,7 @@
     <w:p>
       <w:pPr>
         <w:spacing w:before="100" w:beforeAutospacing="1" w:after="100" w:afterAutospacing="1" w:line="240" w:lineRule="auto"/>
-        <w:ind w:firstLine="360"/>
+        <w:ind w:firstLine="708"/>
         <w:rPr>
           <w:rFonts w:ascii="Arial" w:eastAsia="Times New Roman" w:hAnsi="Arial" w:cs="Arial"/>
           <w:kern w:val="0"/>
@@ -4362,7 +4342,7 @@
           <w14:ligatures w14:val="none"/>
         </w:rPr>
         <w:lastRenderedPageBreak/>
-        <w:t>Ler periodicamente as saídas dos sensores MQ2, MQ7 e DHT22;</w:t>
+        <w:t>Ler periodicamente as saídas dos sensores;</w:t>
       </w:r>
     </w:p>
     <w:p>
@@ -4745,6 +4725,193 @@
     <w:p>
       <w:pPr>
         <w:spacing w:before="100" w:beforeAutospacing="1" w:after="100" w:afterAutospacing="1" w:line="240" w:lineRule="auto"/>
+        <w:rPr>
+          <w:rFonts w:ascii="Arial" w:eastAsia="Times New Roman" w:hAnsi="Arial" w:cs="Arial"/>
+          <w:kern w:val="0"/>
+          <w:lang w:eastAsia="pt-BR"/>
+          <w14:ligatures w14:val="none"/>
+        </w:rPr>
+      </w:pPr>
+      <w:r>
+        <w:rPr>
+          <w:rFonts w:ascii="Arial" w:eastAsia="Times New Roman" w:hAnsi="Arial" w:cs="Arial"/>
+          <w:b/>
+          <w:bCs/>
+          <w:kern w:val="0"/>
+          <w:lang w:eastAsia="pt-BR"/>
+          <w14:ligatures w14:val="none"/>
+        </w:rPr>
+        <w:t xml:space="preserve">3.7 </w:t>
+      </w:r>
+      <w:proofErr w:type="spellStart"/>
+      <w:r>
+        <w:rPr>
+          <w:rFonts w:ascii="Arial" w:eastAsia="Times New Roman" w:hAnsi="Arial" w:cs="Arial"/>
+          <w:kern w:val="0"/>
+          <w:lang w:eastAsia="pt-BR"/>
+          <w14:ligatures w14:val="none"/>
+        </w:rPr>
+        <w:t>Isolation</w:t>
+      </w:r>
+      <w:proofErr w:type="spellEnd"/>
+      <w:r>
+        <w:rPr>
+          <w:rFonts w:ascii="Arial" w:eastAsia="Times New Roman" w:hAnsi="Arial" w:cs="Arial"/>
+          <w:kern w:val="0"/>
+          <w:lang w:eastAsia="pt-BR"/>
+          <w14:ligatures w14:val="none"/>
+        </w:rPr>
+        <w:t xml:space="preserve"> Forest</w:t>
+      </w:r>
+    </w:p>
+    <w:p>
+      <w:pPr>
+        <w:spacing w:before="100" w:beforeAutospacing="1" w:after="100" w:afterAutospacing="1" w:line="240" w:lineRule="auto"/>
+        <w:ind w:firstLine="708"/>
+        <w:rPr>
+          <w:rFonts w:ascii="Arial" w:eastAsia="Times New Roman" w:hAnsi="Arial" w:cs="Arial"/>
+          <w:kern w:val="0"/>
+          <w:lang w:eastAsia="pt-BR"/>
+          <w14:ligatures w14:val="none"/>
+        </w:rPr>
+      </w:pPr>
+      <w:r>
+        <w:rPr>
+          <w:rFonts w:ascii="Arial" w:eastAsia="Times New Roman" w:hAnsi="Arial" w:cs="Arial"/>
+          <w:kern w:val="0"/>
+          <w:lang w:eastAsia="pt-BR"/>
+          <w14:ligatures w14:val="none"/>
+        </w:rPr>
+        <w:t xml:space="preserve">O </w:t>
+      </w:r>
+      <w:proofErr w:type="spellStart"/>
+      <w:r>
+        <w:rPr>
+          <w:rFonts w:ascii="Arial" w:eastAsia="Times New Roman" w:hAnsi="Arial" w:cs="Arial"/>
+          <w:kern w:val="0"/>
+          <w:lang w:eastAsia="pt-BR"/>
+          <w14:ligatures w14:val="none"/>
+        </w:rPr>
+        <w:t>Isolation</w:t>
+      </w:r>
+      <w:proofErr w:type="spellEnd"/>
+      <w:r>
+        <w:rPr>
+          <w:rFonts w:ascii="Arial" w:eastAsia="Times New Roman" w:hAnsi="Arial" w:cs="Arial"/>
+          <w:kern w:val="0"/>
+          <w:lang w:eastAsia="pt-BR"/>
+          <w14:ligatures w14:val="none"/>
+        </w:rPr>
+        <w:t xml:space="preserve"> Forest é um algoritmo de aprendizado de máquina amplamente utilizado para detecção de anomalias em conjuntos de dados multidimensionais. Diferentemente de métodos tradicionais que modelam explicitamente o comportamento normal dos dados, o </w:t>
+      </w:r>
+      <w:proofErr w:type="spellStart"/>
+      <w:r>
+        <w:rPr>
+          <w:rFonts w:ascii="Arial" w:eastAsia="Times New Roman" w:hAnsi="Arial" w:cs="Arial"/>
+          <w:kern w:val="0"/>
+          <w:lang w:eastAsia="pt-BR"/>
+          <w14:ligatures w14:val="none"/>
+        </w:rPr>
+        <w:t>Isolation</w:t>
+      </w:r>
+      <w:proofErr w:type="spellEnd"/>
+      <w:r>
+        <w:rPr>
+          <w:rFonts w:ascii="Arial" w:eastAsia="Times New Roman" w:hAnsi="Arial" w:cs="Arial"/>
+          <w:kern w:val="0"/>
+          <w:lang w:eastAsia="pt-BR"/>
+          <w14:ligatures w14:val="none"/>
+        </w:rPr>
+        <w:t xml:space="preserve"> Forest baseia-</w:t>
+      </w:r>
+      <w:r>
+        <w:rPr>
+          <w:rFonts w:ascii="Arial" w:eastAsia="Times New Roman" w:hAnsi="Arial" w:cs="Arial"/>
+          <w:kern w:val="0"/>
+          <w:lang w:eastAsia="pt-BR"/>
+          <w14:ligatures w14:val="none"/>
+        </w:rPr>
+        <w:lastRenderedPageBreak/>
+        <w:t>se no princípio de que anomalias são observações raras e, portanto, mais fáceis de isolar do restante do conjunto.</w:t>
+      </w:r>
+    </w:p>
+    <w:p>
+      <w:pPr>
+        <w:spacing w:before="100" w:beforeAutospacing="1" w:after="100" w:afterAutospacing="1" w:line="240" w:lineRule="auto"/>
+        <w:ind w:firstLine="708"/>
+        <w:rPr>
+          <w:rFonts w:ascii="Arial" w:eastAsia="Times New Roman" w:hAnsi="Arial" w:cs="Arial"/>
+          <w:kern w:val="0"/>
+          <w:lang w:eastAsia="pt-BR"/>
+          <w14:ligatures w14:val="none"/>
+        </w:rPr>
+      </w:pPr>
+      <w:r>
+        <w:rPr>
+          <w:rFonts w:ascii="Arial" w:eastAsia="Times New Roman" w:hAnsi="Arial" w:cs="Arial"/>
+          <w:kern w:val="0"/>
+          <w:lang w:eastAsia="pt-BR"/>
+          <w14:ligatures w14:val="none"/>
+        </w:rPr>
+        <w:t>O algoritmo funciona por meio da construção de múltiplas árvores de decisão aleatórias, conhecidas como árvores de isolamento. Em cada árvore, os dados são particionados recursivamente por meio da seleção aleatória de uma variável e de um ponto de corte dentro do intervalo dessa variável. Como as anomalias tendem a apresentar valores extremos ou combinações incomuns de atributos, elas geralmente são isoladas em menos divisões quando comparadas às observações normais. Dessa forma, o comprimento médio do caminho necessário para isolar uma amostra torna-se uma métrica para determinar seu grau de anormalidade.</w:t>
+      </w:r>
+    </w:p>
+    <w:p>
+      <w:pPr>
+        <w:spacing w:before="100" w:beforeAutospacing="1" w:after="100" w:afterAutospacing="1" w:line="240" w:lineRule="auto"/>
+        <w:ind w:firstLine="708"/>
+        <w:rPr>
+          <w:rFonts w:ascii="Arial" w:eastAsia="Times New Roman" w:hAnsi="Arial" w:cs="Arial"/>
+          <w:kern w:val="0"/>
+          <w:lang w:eastAsia="pt-BR"/>
+          <w14:ligatures w14:val="none"/>
+        </w:rPr>
+      </w:pPr>
+      <w:r>
+        <w:rPr>
+          <w:rFonts w:ascii="Arial" w:eastAsia="Times New Roman" w:hAnsi="Arial" w:cs="Arial"/>
+          <w:kern w:val="0"/>
+          <w:lang w:eastAsia="pt-BR"/>
+          <w14:ligatures w14:val="none"/>
+        </w:rPr>
+        <w:t xml:space="preserve">Uma das principais vantagens do </w:t>
+      </w:r>
+      <w:proofErr w:type="spellStart"/>
+      <w:r>
+        <w:rPr>
+          <w:rFonts w:ascii="Arial" w:eastAsia="Times New Roman" w:hAnsi="Arial" w:cs="Arial"/>
+          <w:kern w:val="0"/>
+          <w:lang w:eastAsia="pt-BR"/>
+          <w14:ligatures w14:val="none"/>
+        </w:rPr>
+        <w:t>Isolation</w:t>
+      </w:r>
+      <w:proofErr w:type="spellEnd"/>
+      <w:r>
+        <w:rPr>
+          <w:rFonts w:ascii="Arial" w:eastAsia="Times New Roman" w:hAnsi="Arial" w:cs="Arial"/>
+          <w:kern w:val="0"/>
+          <w:lang w:eastAsia="pt-BR"/>
+          <w14:ligatures w14:val="none"/>
+        </w:rPr>
+        <w:t xml:space="preserve"> Forest é sua eficiência computacional, especialmente em grandes volumes de dados, além de não exigir rotulagem prévia das amostras. Isso o torna particularmente adequado para cenários reais em que eventos anômalos são raros e difíceis de catalogar previamente.</w:t>
+      </w:r>
+    </w:p>
+    <w:p>
+      <w:pPr>
+        <w:spacing w:before="100" w:beforeAutospacing="1" w:after="100" w:afterAutospacing="1" w:line="240" w:lineRule="auto"/>
+        <w:ind w:firstLine="708"/>
+        <w:rPr>
+          <w:rFonts w:ascii="Arial" w:eastAsia="Times New Roman" w:hAnsi="Arial" w:cs="Arial"/>
+          <w:kern w:val="0"/>
+          <w:lang w:eastAsia="pt-BR"/>
+          <w14:ligatures w14:val="none"/>
+        </w:rPr>
+      </w:pPr>
+    </w:p>
+    <w:p>
+      <w:pPr>
+        <w:spacing w:before="100" w:beforeAutospacing="1" w:after="100" w:afterAutospacing="1" w:line="240" w:lineRule="auto"/>
         <w:outlineLvl w:val="1"/>
         <w:rPr>
           <w:rFonts w:ascii="Arial" w:eastAsia="Times New Roman" w:hAnsi="Arial" w:cs="Arial"/>
@@ -4813,7 +4980,6 @@
           <w:lang w:eastAsia="pt-BR"/>
           <w14:ligatures w14:val="none"/>
         </w:rPr>
-        <w:lastRenderedPageBreak/>
         <w:t xml:space="preserve">4.1 </w:t>
       </w:r>
       <w:r>
@@ -5043,6 +5209,17 @@
     </w:p>
     <w:p>
       <w:pPr>
+        <w:spacing w:before="100" w:beforeAutospacing="1" w:after="100" w:afterAutospacing="1" w:line="240" w:lineRule="auto"/>
+        <w:rPr>
+          <w:rFonts w:ascii="Arial" w:eastAsia="Times New Roman" w:hAnsi="Arial" w:cs="Arial"/>
+          <w:kern w:val="0"/>
+          <w:lang w:eastAsia="pt-BR"/>
+          <w14:ligatures w14:val="none"/>
+        </w:rPr>
+      </w:pPr>
+    </w:p>
+    <w:p>
+      <w:pPr>
         <w:numPr>
           <w:ilvl w:val="0"/>
           <w:numId w:val="8"/>
@@ -5064,6 +5241,7 @@
           <w:lang w:eastAsia="pt-BR"/>
           <w14:ligatures w14:val="none"/>
         </w:rPr>
+        <w:lastRenderedPageBreak/>
         <w:t>Hardware</w:t>
       </w:r>
     </w:p>
@@ -5225,6 +5403,32 @@
     <w:p>
       <w:pPr>
         <w:numPr>
+          <w:ilvl w:val="0"/>
+          <w:numId w:val="8"/>
+        </w:numPr>
+        <w:spacing w:before="100" w:beforeAutospacing="1" w:after="100" w:afterAutospacing="1" w:line="240" w:lineRule="auto"/>
+        <w:rPr>
+          <w:rFonts w:ascii="Arial" w:eastAsia="Times New Roman" w:hAnsi="Arial" w:cs="Arial"/>
+          <w:kern w:val="0"/>
+          <w:lang w:eastAsia="pt-BR"/>
+          <w14:ligatures w14:val="none"/>
+        </w:rPr>
+      </w:pPr>
+      <w:r>
+        <w:rPr>
+          <w:rFonts w:ascii="Arial" w:eastAsia="Times New Roman" w:hAnsi="Arial" w:cs="Arial"/>
+          <w:b/>
+          <w:bCs/>
+          <w:kern w:val="0"/>
+          <w:lang w:eastAsia="pt-BR"/>
+          <w14:ligatures w14:val="none"/>
+        </w:rPr>
+        <w:t>Software</w:t>
+      </w:r>
+    </w:p>
+    <w:p>
+      <w:pPr>
+        <w:numPr>
           <w:ilvl w:val="1"/>
           <w:numId w:val="8"/>
         </w:numPr>
@@ -5243,7 +5447,167 @@
           <w:lang w:eastAsia="pt-BR"/>
           <w14:ligatures w14:val="none"/>
         </w:rPr>
-        <w:t>Protoboard, jumpers e resistores.</w:t>
+        <w:t>Linguagem C/C++ para programação do Arduino;</w:t>
+      </w:r>
+    </w:p>
+    <w:p>
+      <w:pPr>
+        <w:numPr>
+          <w:ilvl w:val="1"/>
+          <w:numId w:val="8"/>
+        </w:numPr>
+        <w:spacing w:before="100" w:beforeAutospacing="1" w:after="100" w:afterAutospacing="1" w:line="240" w:lineRule="auto"/>
+        <w:rPr>
+          <w:rFonts w:ascii="Arial" w:eastAsia="Times New Roman" w:hAnsi="Arial" w:cs="Arial"/>
+          <w:kern w:val="0"/>
+          <w:lang w:eastAsia="pt-BR"/>
+          <w14:ligatures w14:val="none"/>
+        </w:rPr>
+      </w:pPr>
+      <w:r>
+        <w:rPr>
+          <w:rFonts w:ascii="Arial" w:eastAsia="Times New Roman" w:hAnsi="Arial" w:cs="Arial"/>
+          <w:kern w:val="0"/>
+          <w:lang w:eastAsia="pt-BR"/>
+          <w14:ligatures w14:val="none"/>
+        </w:rPr>
+        <w:t>Linguagem Python para desenvolvimento da aplicação principal;</w:t>
+      </w:r>
+    </w:p>
+    <w:p>
+      <w:pPr>
+        <w:numPr>
+          <w:ilvl w:val="1"/>
+          <w:numId w:val="8"/>
+        </w:numPr>
+        <w:spacing w:before="100" w:beforeAutospacing="1" w:after="100" w:afterAutospacing="1" w:line="240" w:lineRule="auto"/>
+        <w:rPr>
+          <w:rFonts w:ascii="Arial" w:eastAsia="Times New Roman" w:hAnsi="Arial" w:cs="Arial"/>
+          <w:kern w:val="0"/>
+          <w:lang w:eastAsia="pt-BR"/>
+          <w14:ligatures w14:val="none"/>
+        </w:rPr>
+      </w:pPr>
+      <w:r>
+        <w:rPr>
+          <w:rFonts w:ascii="Arial" w:eastAsia="Times New Roman" w:hAnsi="Arial" w:cs="Arial"/>
+          <w:kern w:val="0"/>
+          <w:lang w:eastAsia="pt-BR"/>
+          <w14:ligatures w14:val="none"/>
+        </w:rPr>
+        <w:t xml:space="preserve">Biblioteca de comunicação serial (como </w:t>
+      </w:r>
+      <w:proofErr w:type="spellStart"/>
+      <w:r>
+        <w:rPr>
+          <w:rFonts w:ascii="Arial" w:eastAsia="Times New Roman" w:hAnsi="Arial" w:cs="Arial"/>
+          <w:kern w:val="0"/>
+          <w:sz w:val="20"/>
+          <w:szCs w:val="20"/>
+          <w:lang w:eastAsia="pt-BR"/>
+          <w14:ligatures w14:val="none"/>
+        </w:rPr>
+        <w:t>pyserial</w:t>
+      </w:r>
+      <w:proofErr w:type="spellEnd"/>
+      <w:r>
+        <w:rPr>
+          <w:rFonts w:ascii="Arial" w:eastAsia="Times New Roman" w:hAnsi="Arial" w:cs="Arial"/>
+          <w:kern w:val="0"/>
+          <w:lang w:eastAsia="pt-BR"/>
+          <w14:ligatures w14:val="none"/>
+        </w:rPr>
+        <w:t>);</w:t>
+      </w:r>
+    </w:p>
+    <w:p>
+      <w:pPr>
+        <w:numPr>
+          <w:ilvl w:val="1"/>
+          <w:numId w:val="8"/>
+        </w:numPr>
+        <w:spacing w:before="100" w:beforeAutospacing="1" w:after="100" w:afterAutospacing="1" w:line="240" w:lineRule="auto"/>
+        <w:rPr>
+          <w:rFonts w:ascii="Arial" w:eastAsia="Times New Roman" w:hAnsi="Arial" w:cs="Arial"/>
+          <w:kern w:val="0"/>
+          <w:lang w:eastAsia="pt-BR"/>
+          <w14:ligatures w14:val="none"/>
+        </w:rPr>
+      </w:pPr>
+      <w:r>
+        <w:rPr>
+          <w:rFonts w:ascii="Arial" w:eastAsia="Times New Roman" w:hAnsi="Arial" w:cs="Arial"/>
+          <w:kern w:val="0"/>
+          <w:lang w:eastAsia="pt-BR"/>
+          <w14:ligatures w14:val="none"/>
+        </w:rPr>
+        <w:t xml:space="preserve">Biblioteca </w:t>
+      </w:r>
+      <w:proofErr w:type="spellStart"/>
+      <w:r>
+        <w:rPr>
+          <w:rFonts w:ascii="Arial" w:eastAsia="Times New Roman" w:hAnsi="Arial" w:cs="Arial"/>
+          <w:kern w:val="0"/>
+          <w:sz w:val="20"/>
+          <w:szCs w:val="20"/>
+          <w:lang w:eastAsia="pt-BR"/>
+          <w14:ligatures w14:val="none"/>
+        </w:rPr>
+        <w:t>joblib</w:t>
+      </w:r>
+      <w:proofErr w:type="spellEnd"/>
+      <w:r>
+        <w:rPr>
+          <w:rFonts w:ascii="Arial" w:eastAsia="Times New Roman" w:hAnsi="Arial" w:cs="Arial"/>
+          <w:kern w:val="0"/>
+          <w:lang w:eastAsia="pt-BR"/>
+          <w14:ligatures w14:val="none"/>
+        </w:rPr>
+        <w:t xml:space="preserve"> para carregamento do modelo de Machine Learning e do </w:t>
+      </w:r>
+      <w:proofErr w:type="spellStart"/>
+      <w:r>
+        <w:rPr>
+          <w:rFonts w:ascii="Arial" w:eastAsia="Times New Roman" w:hAnsi="Arial" w:cs="Arial"/>
+          <w:kern w:val="0"/>
+          <w:lang w:eastAsia="pt-BR"/>
+          <w14:ligatures w14:val="none"/>
+        </w:rPr>
+        <w:t>scaler</w:t>
+      </w:r>
+      <w:proofErr w:type="spellEnd"/>
+      <w:r>
+        <w:rPr>
+          <w:rFonts w:ascii="Arial" w:eastAsia="Times New Roman" w:hAnsi="Arial" w:cs="Arial"/>
+          <w:kern w:val="0"/>
+          <w:lang w:eastAsia="pt-BR"/>
+          <w14:ligatures w14:val="none"/>
+        </w:rPr>
+        <w:t>;</w:t>
+      </w:r>
+    </w:p>
+    <w:p>
+      <w:pPr>
+        <w:numPr>
+          <w:ilvl w:val="1"/>
+          <w:numId w:val="8"/>
+        </w:numPr>
+        <w:spacing w:before="100" w:beforeAutospacing="1" w:after="100" w:afterAutospacing="1" w:line="240" w:lineRule="auto"/>
+        <w:rPr>
+          <w:rFonts w:ascii="Arial" w:eastAsia="Times New Roman" w:hAnsi="Arial" w:cs="Arial"/>
+          <w:kern w:val="0"/>
+          <w:lang w:eastAsia="pt-BR"/>
+          <w14:ligatures w14:val="none"/>
+        </w:rPr>
+      </w:pPr>
+      <w:r>
+        <w:rPr>
+          <w:rFonts w:ascii="Arial" w:eastAsia="Times New Roman" w:hAnsi="Arial" w:cs="Arial"/>
+          <w:kern w:val="0"/>
+          <w:lang w:eastAsia="pt-BR"/>
+          <w14:ligatures w14:val="none"/>
+        </w:rPr>
+        <w:t>Ferramentas de versionamento com Git.</w:t>
       </w:r>
     </w:p>
     <w:p>
@@ -5269,7 +5633,7 @@
           <w:lang w:eastAsia="pt-BR"/>
           <w14:ligatures w14:val="none"/>
         </w:rPr>
-        <w:t>Software</w:t>
+        <w:t>Modelo de Machine Learning</w:t>
       </w:r>
     </w:p>
     <w:p>
@@ -5293,7 +5657,36 @@
           <w:lang w:eastAsia="pt-BR"/>
           <w14:ligatures w14:val="none"/>
         </w:rPr>
-        <w:t>Linguagem C/C++ para programação do Arduino;</w:t>
+        <w:t>Algoritmo de detecção de anomalias treinado previamente (</w:t>
+      </w:r>
+      <w:proofErr w:type="spellStart"/>
+      <w:r>
+        <w:rPr>
+          <w:rFonts w:ascii="Arial" w:eastAsia="Times New Roman" w:hAnsi="Arial" w:cs="Arial"/>
+          <w:kern w:val="0"/>
+          <w:lang w:eastAsia="pt-BR"/>
+          <w14:ligatures w14:val="none"/>
+        </w:rPr>
+        <w:t>Isolation</w:t>
+      </w:r>
+      <w:proofErr w:type="spellEnd"/>
+      <w:r>
+        <w:rPr>
+          <w:rFonts w:ascii="Arial" w:eastAsia="Times New Roman" w:hAnsi="Arial" w:cs="Arial"/>
+          <w:kern w:val="0"/>
+          <w:lang w:eastAsia="pt-BR"/>
+          <w14:ligatures w14:val="none"/>
+        </w:rPr>
+        <w:t xml:space="preserve"> Forest</w:t>
+      </w:r>
+      <w:r>
+        <w:rPr>
+          <w:rFonts w:ascii="Arial" w:eastAsia="Times New Roman" w:hAnsi="Arial" w:cs="Arial"/>
+          <w:kern w:val="0"/>
+          <w:lang w:eastAsia="pt-BR"/>
+          <w14:ligatures w14:val="none"/>
+        </w:rPr>
+        <w:t>);</w:t>
       </w:r>
     </w:p>
     <w:p>
@@ -5310,50 +5703,15 @@
           <w14:ligatures w14:val="none"/>
         </w:rPr>
       </w:pPr>
-      <w:r>
-        <w:rPr>
-          <w:rFonts w:ascii="Arial" w:eastAsia="Times New Roman" w:hAnsi="Arial" w:cs="Arial"/>
-          <w:kern w:val="0"/>
-          <w:lang w:eastAsia="pt-BR"/>
-          <w14:ligatures w14:val="none"/>
-        </w:rPr>
-        <w:t>Linguagem Python para desenvolvimento da aplicação principal;</w:t>
-      </w:r>
-    </w:p>
-    <w:p>
-      <w:pPr>
-        <w:numPr>
-          <w:ilvl w:val="1"/>
-          <w:numId w:val="8"/>
-        </w:numPr>
-        <w:spacing w:before="100" w:beforeAutospacing="1" w:after="100" w:afterAutospacing="1" w:line="240" w:lineRule="auto"/>
-        <w:rPr>
-          <w:rFonts w:ascii="Arial" w:eastAsia="Times New Roman" w:hAnsi="Arial" w:cs="Arial"/>
-          <w:kern w:val="0"/>
-          <w:lang w:eastAsia="pt-BR"/>
-          <w14:ligatures w14:val="none"/>
-        </w:rPr>
-      </w:pPr>
-      <w:r>
-        <w:rPr>
-          <w:rFonts w:ascii="Arial" w:eastAsia="Times New Roman" w:hAnsi="Arial" w:cs="Arial"/>
-          <w:kern w:val="0"/>
-          <w:lang w:eastAsia="pt-BR"/>
-          <w14:ligatures w14:val="none"/>
-        </w:rPr>
-        <w:t xml:space="preserve">Biblioteca de comunicação serial (como </w:t>
-      </w:r>
       <w:proofErr w:type="spellStart"/>
       <w:r>
         <w:rPr>
           <w:rFonts w:ascii="Arial" w:eastAsia="Times New Roman" w:hAnsi="Arial" w:cs="Arial"/>
           <w:kern w:val="0"/>
-          <w:sz w:val="20"/>
-          <w:szCs w:val="20"/>
-          <w:lang w:eastAsia="pt-BR"/>
-          <w14:ligatures w14:val="none"/>
-        </w:rPr>
-        <w:t>pyserial</w:t>
+          <w:lang w:eastAsia="pt-BR"/>
+          <w14:ligatures w14:val="none"/>
+        </w:rPr>
+        <w:t>Scaler</w:t>
       </w:r>
       <w:proofErr w:type="spellEnd"/>
       <w:r>
@@ -5363,182 +5721,7 @@
           <w:lang w:eastAsia="pt-BR"/>
           <w14:ligatures w14:val="none"/>
         </w:rPr>
-        <w:t>);</w:t>
-      </w:r>
-    </w:p>
-    <w:p>
-      <w:pPr>
-        <w:numPr>
-          <w:ilvl w:val="1"/>
-          <w:numId w:val="8"/>
-        </w:numPr>
-        <w:spacing w:before="100" w:beforeAutospacing="1" w:after="100" w:afterAutospacing="1" w:line="240" w:lineRule="auto"/>
-        <w:rPr>
-          <w:rFonts w:ascii="Arial" w:eastAsia="Times New Roman" w:hAnsi="Arial" w:cs="Arial"/>
-          <w:kern w:val="0"/>
-          <w:lang w:eastAsia="pt-BR"/>
-          <w14:ligatures w14:val="none"/>
-        </w:rPr>
-      </w:pPr>
-      <w:r>
-        <w:rPr>
-          <w:rFonts w:ascii="Arial" w:eastAsia="Times New Roman" w:hAnsi="Arial" w:cs="Arial"/>
-          <w:kern w:val="0"/>
-          <w:lang w:eastAsia="pt-BR"/>
-          <w14:ligatures w14:val="none"/>
-        </w:rPr>
-        <w:t xml:space="preserve">Biblioteca </w:t>
-      </w:r>
-      <w:proofErr w:type="spellStart"/>
-      <w:r>
-        <w:rPr>
-          <w:rFonts w:ascii="Arial" w:eastAsia="Times New Roman" w:hAnsi="Arial" w:cs="Arial"/>
-          <w:kern w:val="0"/>
-          <w:sz w:val="20"/>
-          <w:szCs w:val="20"/>
-          <w:lang w:eastAsia="pt-BR"/>
-          <w14:ligatures w14:val="none"/>
-        </w:rPr>
-        <w:t>joblib</w:t>
-      </w:r>
-      <w:proofErr w:type="spellEnd"/>
-      <w:r>
-        <w:rPr>
-          <w:rFonts w:ascii="Arial" w:eastAsia="Times New Roman" w:hAnsi="Arial" w:cs="Arial"/>
-          <w:kern w:val="0"/>
-          <w:lang w:eastAsia="pt-BR"/>
-          <w14:ligatures w14:val="none"/>
-        </w:rPr>
-        <w:t xml:space="preserve"> para carregamento do modelo de Machine Learning e do </w:t>
-      </w:r>
-      <w:proofErr w:type="spellStart"/>
-      <w:r>
-        <w:rPr>
-          <w:rFonts w:ascii="Arial" w:eastAsia="Times New Roman" w:hAnsi="Arial" w:cs="Arial"/>
-          <w:kern w:val="0"/>
-          <w:lang w:eastAsia="pt-BR"/>
-          <w14:ligatures w14:val="none"/>
-        </w:rPr>
-        <w:t>scaler</w:t>
-      </w:r>
-      <w:proofErr w:type="spellEnd"/>
-      <w:r>
-        <w:rPr>
-          <w:rFonts w:ascii="Arial" w:eastAsia="Times New Roman" w:hAnsi="Arial" w:cs="Arial"/>
-          <w:kern w:val="0"/>
-          <w:lang w:eastAsia="pt-BR"/>
-          <w14:ligatures w14:val="none"/>
-        </w:rPr>
-        <w:t>;</w:t>
-      </w:r>
-    </w:p>
-    <w:p>
-      <w:pPr>
-        <w:numPr>
-          <w:ilvl w:val="1"/>
-          <w:numId w:val="8"/>
-        </w:numPr>
-        <w:spacing w:before="100" w:beforeAutospacing="1" w:after="100" w:afterAutospacing="1" w:line="240" w:lineRule="auto"/>
-        <w:rPr>
-          <w:rFonts w:ascii="Arial" w:eastAsia="Times New Roman" w:hAnsi="Arial" w:cs="Arial"/>
-          <w:kern w:val="0"/>
-          <w:lang w:eastAsia="pt-BR"/>
-          <w14:ligatures w14:val="none"/>
-        </w:rPr>
-      </w:pPr>
-      <w:r>
-        <w:rPr>
-          <w:rFonts w:ascii="Arial" w:eastAsia="Times New Roman" w:hAnsi="Arial" w:cs="Arial"/>
-          <w:kern w:val="0"/>
-          <w:lang w:eastAsia="pt-BR"/>
-          <w14:ligatures w14:val="none"/>
-        </w:rPr>
-        <w:t>Ferramentas de versionamento com Git.</w:t>
-      </w:r>
-    </w:p>
-    <w:p>
-      <w:pPr>
-        <w:numPr>
-          <w:ilvl w:val="0"/>
-          <w:numId w:val="8"/>
-        </w:numPr>
-        <w:spacing w:before="100" w:beforeAutospacing="1" w:after="100" w:afterAutospacing="1" w:line="240" w:lineRule="auto"/>
-        <w:rPr>
-          <w:rFonts w:ascii="Arial" w:eastAsia="Times New Roman" w:hAnsi="Arial" w:cs="Arial"/>
-          <w:kern w:val="0"/>
-          <w:lang w:eastAsia="pt-BR"/>
-          <w14:ligatures w14:val="none"/>
-        </w:rPr>
-      </w:pPr>
-      <w:r>
-        <w:rPr>
-          <w:rFonts w:ascii="Arial" w:eastAsia="Times New Roman" w:hAnsi="Arial" w:cs="Arial"/>
-          <w:b/>
-          <w:bCs/>
-          <w:kern w:val="0"/>
-          <w:lang w:eastAsia="pt-BR"/>
-          <w14:ligatures w14:val="none"/>
-        </w:rPr>
-        <w:t>Modelo de Machine Learning</w:t>
-      </w:r>
-    </w:p>
-    <w:p>
-      <w:pPr>
-        <w:numPr>
-          <w:ilvl w:val="1"/>
-          <w:numId w:val="8"/>
-        </w:numPr>
-        <w:spacing w:before="100" w:beforeAutospacing="1" w:after="100" w:afterAutospacing="1" w:line="240" w:lineRule="auto"/>
-        <w:rPr>
-          <w:rFonts w:ascii="Arial" w:eastAsia="Times New Roman" w:hAnsi="Arial" w:cs="Arial"/>
-          <w:kern w:val="0"/>
-          <w:lang w:eastAsia="pt-BR"/>
-          <w14:ligatures w14:val="none"/>
-        </w:rPr>
-      </w:pPr>
-      <w:r>
-        <w:rPr>
-          <w:rFonts w:ascii="Arial" w:eastAsia="Times New Roman" w:hAnsi="Arial" w:cs="Arial"/>
-          <w:kern w:val="0"/>
-          <w:lang w:eastAsia="pt-BR"/>
-          <w14:ligatures w14:val="none"/>
-        </w:rPr>
-        <w:t>Algoritmo de detecção de anomalias treinado previamente (por exemplo, um modelo baseado em florestas de isolamento ou técnica similar);</w:t>
-      </w:r>
-    </w:p>
-    <w:p>
-      <w:pPr>
-        <w:numPr>
-          <w:ilvl w:val="1"/>
-          <w:numId w:val="8"/>
-        </w:numPr>
-        <w:spacing w:before="100" w:beforeAutospacing="1" w:after="100" w:afterAutospacing="1" w:line="240" w:lineRule="auto"/>
-        <w:rPr>
-          <w:rFonts w:ascii="Arial" w:eastAsia="Times New Roman" w:hAnsi="Arial" w:cs="Arial"/>
-          <w:kern w:val="0"/>
-          <w:lang w:eastAsia="pt-BR"/>
-          <w14:ligatures w14:val="none"/>
-        </w:rPr>
-      </w:pPr>
-      <w:proofErr w:type="spellStart"/>
-      <w:r>
-        <w:rPr>
-          <w:rFonts w:ascii="Arial" w:eastAsia="Times New Roman" w:hAnsi="Arial" w:cs="Arial"/>
-          <w:kern w:val="0"/>
-          <w:lang w:eastAsia="pt-BR"/>
-          <w14:ligatures w14:val="none"/>
-        </w:rPr>
-        <w:t>Scaler</w:t>
-      </w:r>
-      <w:proofErr w:type="spellEnd"/>
-      <w:r>
-        <w:rPr>
-          <w:rFonts w:ascii="Arial" w:eastAsia="Times New Roman" w:hAnsi="Arial" w:cs="Arial"/>
-          <w:kern w:val="0"/>
-          <w:lang w:eastAsia="pt-BR"/>
-          <w14:ligatures w14:val="none"/>
-        </w:rPr>
-        <w:t xml:space="preserve"> para padronização dos dados (por exemplo, </w:t>
+        <w:t xml:space="preserve"> para padronização dos dados (</w:t>
       </w:r>
       <w:proofErr w:type="spellStart"/>
       <w:r>
@@ -5665,7 +5848,6 @@
           <w:lang w:eastAsia="pt-BR"/>
           <w14:ligatures w14:val="none"/>
         </w:rPr>
-        <w:lastRenderedPageBreak/>
         <w:t>Organização dos dados em uma mensagem contendo identificador e valores de cada sensor;</w:t>
       </w:r>
     </w:p>
@@ -5716,25 +5898,41 @@
         </w:rPr>
         <w:t xml:space="preserve">Recepção da </w:t>
       </w:r>
-      <w:proofErr w:type="spellStart"/>
-      <w:r>
-        <w:rPr>
-          <w:rFonts w:ascii="Arial" w:eastAsia="Times New Roman" w:hAnsi="Arial" w:cs="Arial"/>
-          <w:kern w:val="0"/>
-          <w:lang w:eastAsia="pt-BR"/>
-          <w14:ligatures w14:val="none"/>
-        </w:rPr>
-        <w:t>string</w:t>
-      </w:r>
-      <w:proofErr w:type="spellEnd"/>
-      <w:r>
-        <w:rPr>
-          <w:rFonts w:ascii="Arial" w:eastAsia="Times New Roman" w:hAnsi="Arial" w:cs="Arial"/>
-          <w:kern w:val="0"/>
-          <w:lang w:eastAsia="pt-BR"/>
-          <w14:ligatures w14:val="none"/>
-        </w:rPr>
-        <w:t xml:space="preserve"> pela aplicação em Python e conversão para estrutura de dados (por exemplo, dicionário ou vetor numérico);</w:t>
+      <w:r>
+        <w:rPr>
+          <w:rFonts w:ascii="Arial" w:eastAsia="Times New Roman" w:hAnsi="Arial" w:cs="Arial"/>
+          <w:kern w:val="0"/>
+          <w:lang w:eastAsia="pt-BR"/>
+          <w14:ligatures w14:val="none"/>
+        </w:rPr>
+        <w:t>mensagem</w:t>
+      </w:r>
+      <w:r>
+        <w:rPr>
+          <w:rFonts w:ascii="Arial" w:eastAsia="Times New Roman" w:hAnsi="Arial" w:cs="Arial"/>
+          <w:kern w:val="0"/>
+          <w:lang w:eastAsia="pt-BR"/>
+          <w14:ligatures w14:val="none"/>
+        </w:rPr>
+        <w:t xml:space="preserve"> pela aplicação em Python e conversão para estrutura de dados</w:t>
+      </w:r>
+      <w:r>
+        <w:rPr>
+          <w:rFonts w:ascii="Arial" w:eastAsia="Times New Roman" w:hAnsi="Arial" w:cs="Arial"/>
+          <w:kern w:val="0"/>
+          <w:lang w:eastAsia="pt-BR"/>
+          <w14:ligatures w14:val="none"/>
+        </w:rPr>
+        <w:t xml:space="preserve"> padronizados</w:t>
+      </w:r>
+      <w:r>
+        <w:rPr>
+          <w:rFonts w:ascii="Arial" w:eastAsia="Times New Roman" w:hAnsi="Arial" w:cs="Arial"/>
+          <w:kern w:val="0"/>
+          <w:lang w:eastAsia="pt-BR"/>
+          <w14:ligatures w14:val="none"/>
+        </w:rPr>
+        <w:t>;</w:t>
       </w:r>
     </w:p>
     <w:p>
@@ -5994,6 +6192,7 @@
           <w:lang w:eastAsia="pt-BR"/>
           <w14:ligatures w14:val="none"/>
         </w:rPr>
+        <w:lastRenderedPageBreak/>
         <w:t>Camada de aquisição de dados (hardware)</w:t>
       </w:r>
       <w:r>
@@ -6386,7 +6585,6 @@
           <w:lang w:eastAsia="pt-BR"/>
           <w14:ligatures w14:val="none"/>
         </w:rPr>
-        <w:lastRenderedPageBreak/>
         <w:t>A aplicação em Python foi projetada para atuar como intermediária entre o hardware e o modelo de Machine Learning. Entre as principais funções, destacam-se:</w:t>
       </w:r>
     </w:p>
@@ -6459,7 +6657,7 @@
           <w:lang w:eastAsia="pt-BR"/>
           <w14:ligatures w14:val="none"/>
         </w:rPr>
-        <w:t>Filtrar mensagens não relacionadas às leituras (por exemplo, mensagens de log ou depuração do Arduino);</w:t>
+        <w:t>Filtrar mensagens não relacionadas às leituras (mensagens de log ou depuração do Arduino);</w:t>
       </w:r>
     </w:p>
     <w:p>
@@ -6527,7 +6725,7 @@
           <w:lang w:eastAsia="pt-BR"/>
           <w14:ligatures w14:val="none"/>
         </w:rPr>
-        <w:t xml:space="preserve">Validar a presença dos campos obrigatórios (por exemplo, </w:t>
+        <w:t>Validar a presença dos campos obrigatórios (</w:t>
       </w:r>
       <w:r>
         <w:rPr>
@@ -6808,6 +7006,7 @@
           <w:lang w:eastAsia="pt-BR"/>
           <w14:ligatures w14:val="none"/>
         </w:rPr>
+        <w:lastRenderedPageBreak/>
         <w:t>A manutenção de buffers e médias móveis é essencial para reduzir a sensibilidade do sistema a variações momentâneas e leituras isoladas atípicas, contribuindo para a redução de falsos positivos.</w:t>
       </w:r>
     </w:p>
@@ -6843,7 +7042,7 @@
           <w:lang w:eastAsia="pt-BR"/>
           <w14:ligatures w14:val="none"/>
         </w:rPr>
-        <w:t>Camada de inteligência (modelo de Machine Learning)</w:t>
+        <w:t xml:space="preserve">Camada de inteligência </w:t>
       </w:r>
       <w:bookmarkEnd w:id="19"/>
     </w:p>
@@ -7147,17 +7346,7 @@
           <w:lang w:eastAsia="pt-BR"/>
           <w14:ligatures w14:val="none"/>
         </w:rPr>
-        <w:t xml:space="preserve">O mecanismo de alerta físico é acionado sempre que uma anomalia é confirmada pela camada de inteligência. Nesse caso, a aplicação em Python </w:t>
-      </w:r>
-      <w:r>
-        <w:rPr>
-          <w:rFonts w:ascii="Arial" w:eastAsia="Times New Roman" w:hAnsi="Arial" w:cs="Arial"/>
-          <w:kern w:val="0"/>
-          <w:lang w:eastAsia="pt-BR"/>
-          <w14:ligatures w14:val="none"/>
-        </w:rPr>
-        <w:lastRenderedPageBreak/>
-        <w:t xml:space="preserve">envia um comando pela porta serial para o Arduino, informando a necessidade de ativar o LED e o </w:t>
+        <w:t xml:space="preserve">O mecanismo de alerta físico é acionado sempre que uma anomalia é confirmada pela camada de inteligência. Nesse caso, a aplicação em Python envia um comando pela porta serial para o Arduino, informando a necessidade de ativar o LED e o </w:t>
       </w:r>
       <w:proofErr w:type="spellStart"/>
       <w:r>
@@ -7315,7 +7504,7 @@
     <w:p>
       <w:pPr>
         <w:spacing w:before="100" w:beforeAutospacing="1" w:after="100" w:afterAutospacing="1" w:line="240" w:lineRule="auto"/>
-        <w:ind w:firstLine="360"/>
+        <w:ind w:firstLine="708"/>
         <w:rPr>
           <w:rFonts w:ascii="Arial" w:eastAsia="Times New Roman" w:hAnsi="Arial" w:cs="Arial"/>
           <w:kern w:val="0"/>
@@ -7358,7 +7547,11 @@
         </w:rPr>
       </w:pPr>
       <w:bookmarkStart w:id="21" w:name="_Toc222344282"/>
-      <w:r>
+    </w:p>
+    <w:p>
+      <w:pPr>
+        <w:spacing w:before="100" w:beforeAutospacing="1" w:after="100" w:afterAutospacing="1" w:line="240" w:lineRule="auto"/>
+        <w:outlineLvl w:val="1"/>
         <w:rPr>
           <w:rFonts w:ascii="Arial" w:eastAsia="Times New Roman" w:hAnsi="Arial" w:cs="Arial"/>
           <w:b/>
@@ -7367,6 +7560,31 @@
           <w:lang w:eastAsia="pt-BR"/>
           <w14:ligatures w14:val="none"/>
         </w:rPr>
+      </w:pPr>
+    </w:p>
+    <w:p>
+      <w:pPr>
+        <w:spacing w:before="100" w:beforeAutospacing="1" w:after="100" w:afterAutospacing="1" w:line="240" w:lineRule="auto"/>
+        <w:outlineLvl w:val="1"/>
+        <w:rPr>
+          <w:rFonts w:ascii="Arial" w:eastAsia="Times New Roman" w:hAnsi="Arial" w:cs="Arial"/>
+          <w:b/>
+          <w:bCs/>
+          <w:kern w:val="0"/>
+          <w:lang w:eastAsia="pt-BR"/>
+          <w14:ligatures w14:val="none"/>
+        </w:rPr>
+      </w:pPr>
+      <w:r>
+        <w:rPr>
+          <w:rFonts w:ascii="Arial" w:eastAsia="Times New Roman" w:hAnsi="Arial" w:cs="Arial"/>
+          <w:b/>
+          <w:bCs/>
+          <w:kern w:val="0"/>
+          <w:lang w:eastAsia="pt-BR"/>
+          <w14:ligatures w14:val="none"/>
+        </w:rPr>
+        <w:lastRenderedPageBreak/>
         <w:t>6 RESULTADOS E DISCUSSÃO</w:t>
       </w:r>
       <w:bookmarkEnd w:id="21"/>
@@ -7534,8 +7752,109 @@
           <w:lang w:eastAsia="pt-BR"/>
           <w14:ligatures w14:val="none"/>
         </w:rPr>
-        <w:t xml:space="preserve">De forma geral, os resultados demonstram a viabilidade da integração entre sensores físicos, sistemas embarcados e técnicas de aprendizado de </w:t>
-      </w:r>
+        <w:t>De forma geral, os resultados demonstram a viabilidade da integração entre sensores físicos, sistemas embarcados e técnicas de aprendizado de máquina para monitoramento ambiental inteligente. O sistema apresentou desempenho funcional adequado ao escopo proposto, evidenciando a aplicabilidade prática da solução desenvolvida em ambientes que exigem monitoramento contínuo de variáveis críticas.</w:t>
+      </w:r>
+    </w:p>
+    <w:p>
+      <w:pPr>
+        <w:spacing w:before="100" w:beforeAutospacing="1" w:after="100" w:afterAutospacing="1" w:line="240" w:lineRule="auto"/>
+        <w:outlineLvl w:val="1"/>
+        <w:rPr>
+          <w:rFonts w:ascii="Arial" w:eastAsia="Times New Roman" w:hAnsi="Arial" w:cs="Arial"/>
+          <w:b/>
+          <w:bCs/>
+          <w:kern w:val="0"/>
+          <w:lang w:eastAsia="pt-BR"/>
+          <w14:ligatures w14:val="none"/>
+        </w:rPr>
+      </w:pPr>
+      <w:bookmarkStart w:id="22" w:name="_Toc222344283"/>
+      <w:r>
+        <w:rPr>
+          <w:rFonts w:ascii="Arial" w:eastAsia="Times New Roman" w:hAnsi="Arial" w:cs="Arial"/>
+          <w:b/>
+          <w:bCs/>
+          <w:kern w:val="0"/>
+          <w:lang w:eastAsia="pt-BR"/>
+          <w14:ligatures w14:val="none"/>
+        </w:rPr>
+        <w:t>7 DESAFIOS ENFRENTADOS E LIMITAÇÕES</w:t>
+      </w:r>
+      <w:bookmarkEnd w:id="22"/>
+    </w:p>
+    <w:p>
+      <w:pPr>
+        <w:spacing w:before="100" w:beforeAutospacing="1" w:after="100" w:afterAutospacing="1" w:line="240" w:lineRule="auto"/>
+        <w:ind w:firstLine="708"/>
+        <w:rPr>
+          <w:rFonts w:ascii="Arial" w:eastAsia="Times New Roman" w:hAnsi="Arial" w:cs="Arial"/>
+          <w:kern w:val="0"/>
+          <w:lang w:eastAsia="pt-BR"/>
+          <w14:ligatures w14:val="none"/>
+        </w:rPr>
+      </w:pPr>
+      <w:r>
+        <w:rPr>
+          <w:rFonts w:ascii="Arial" w:eastAsia="Times New Roman" w:hAnsi="Arial" w:cs="Arial"/>
+          <w:kern w:val="0"/>
+          <w:lang w:eastAsia="pt-BR"/>
+          <w14:ligatures w14:val="none"/>
+        </w:rPr>
+        <w:t>Durante o desenvolvimento do projeto, foram identificados e enfrentados diversos desafios técnicos.</w:t>
+      </w:r>
+    </w:p>
+    <w:p>
+      <w:pPr>
+        <w:spacing w:before="100" w:beforeAutospacing="1" w:after="100" w:afterAutospacing="1" w:line="240" w:lineRule="auto"/>
+        <w:ind w:firstLine="708"/>
+        <w:rPr>
+          <w:rFonts w:ascii="Arial" w:eastAsia="Times New Roman" w:hAnsi="Arial" w:cs="Arial"/>
+          <w:kern w:val="0"/>
+          <w:lang w:eastAsia="pt-BR"/>
+          <w14:ligatures w14:val="none"/>
+        </w:rPr>
+      </w:pPr>
+      <w:r>
+        <w:rPr>
+          <w:rFonts w:ascii="Arial" w:eastAsia="Times New Roman" w:hAnsi="Arial" w:cs="Arial"/>
+          <w:kern w:val="0"/>
+          <w:lang w:eastAsia="pt-BR"/>
+          <w14:ligatures w14:val="none"/>
+        </w:rPr>
+        <w:t xml:space="preserve">Um dos primeiros desafios esteve relacionado à comunicação serial. Inicialmente, ocorreram problemas de sincronização entre as mensagens enviadas pelo Arduino e a leitura realizada pela aplicação em Python, resultando em recepção de trechos incompletos ou mistura de mensagens. Esse problema foi mitigado com a padronização do formato da mensagem e a implementação de verificações mais rigorosas na etapa de </w:t>
+      </w:r>
+      <w:proofErr w:type="spellStart"/>
+      <w:r>
+        <w:rPr>
+          <w:rFonts w:ascii="Arial" w:eastAsia="Times New Roman" w:hAnsi="Arial" w:cs="Arial"/>
+          <w:kern w:val="0"/>
+          <w:lang w:eastAsia="pt-BR"/>
+          <w14:ligatures w14:val="none"/>
+        </w:rPr>
+        <w:t>parsing</w:t>
+      </w:r>
+      <w:proofErr w:type="spellEnd"/>
+      <w:r>
+        <w:rPr>
+          <w:rFonts w:ascii="Arial" w:eastAsia="Times New Roman" w:hAnsi="Arial" w:cs="Arial"/>
+          <w:kern w:val="0"/>
+          <w:lang w:eastAsia="pt-BR"/>
+          <w14:ligatures w14:val="none"/>
+        </w:rPr>
+        <w:t>, garantindo que apenas linhas completas fossem consideradas válidas.</w:t>
+      </w:r>
+    </w:p>
+    <w:p>
+      <w:pPr>
+        <w:spacing w:before="100" w:beforeAutospacing="1" w:after="100" w:afterAutospacing="1" w:line="240" w:lineRule="auto"/>
+        <w:ind w:firstLine="708"/>
+        <w:rPr>
+          <w:rFonts w:ascii="Arial" w:eastAsia="Times New Roman" w:hAnsi="Arial" w:cs="Arial"/>
+          <w:kern w:val="0"/>
+          <w:lang w:eastAsia="pt-BR"/>
+          <w14:ligatures w14:val="none"/>
+        </w:rPr>
+      </w:pPr>
       <w:r>
         <w:rPr>
           <w:rFonts w:ascii="Arial" w:eastAsia="Times New Roman" w:hAnsi="Arial" w:cs="Arial"/>
@@ -7544,35 +7863,8 @@
           <w14:ligatures w14:val="none"/>
         </w:rPr>
         <w:lastRenderedPageBreak/>
-        <w:t>máquina para monitoramento ambiental inteligente. O sistema apresentou desempenho funcional adequado ao escopo proposto, evidenciando a aplicabilidade prática da solução desenvolvida em ambientes que exigem monitoramento contínuo de variáveis críticas.</w:t>
-      </w:r>
-    </w:p>
-    <w:p>
-      <w:pPr>
-        <w:spacing w:before="100" w:beforeAutospacing="1" w:after="100" w:afterAutospacing="1" w:line="240" w:lineRule="auto"/>
-        <w:outlineLvl w:val="1"/>
-        <w:rPr>
-          <w:rFonts w:ascii="Arial" w:eastAsia="Times New Roman" w:hAnsi="Arial" w:cs="Arial"/>
-          <w:b/>
-          <w:bCs/>
-          <w:kern w:val="0"/>
-          <w:lang w:eastAsia="pt-BR"/>
-          <w14:ligatures w14:val="none"/>
-        </w:rPr>
-      </w:pPr>
-      <w:bookmarkStart w:id="22" w:name="_Toc222344283"/>
-      <w:r>
-        <w:rPr>
-          <w:rFonts w:ascii="Arial" w:eastAsia="Times New Roman" w:hAnsi="Arial" w:cs="Arial"/>
-          <w:b/>
-          <w:bCs/>
-          <w:kern w:val="0"/>
-          <w:lang w:eastAsia="pt-BR"/>
-          <w14:ligatures w14:val="none"/>
-        </w:rPr>
-        <w:t>7 DESAFIOS ENFRENTADOS E LIMITAÇÕES</w:t>
-      </w:r>
-      <w:bookmarkEnd w:id="22"/>
+        <w:t>Outro desafio importante foi a consistência entre a ordem das variáveis utilizadas no treinamento do modelo e aquela empregada durante a execução do sistema em tempo real. Em versões iniciais, a ordem incorreta de montagem do vetor de entrada causou predições inconsistentes. Esse problema foi resolvido com a definição explícita de uma lista de sensores na ordem correta e a construção do vetor com base nessa referência.</w:t>
+      </w:r>
     </w:p>
     <w:p>
       <w:pPr>
@@ -7592,90 +7884,16 @@
           <w:lang w:eastAsia="pt-BR"/>
           <w14:ligatures w14:val="none"/>
         </w:rPr>
-        <w:t>Durante o desenvolvimento do projeto, foram identificados e enfrentados diversos desafios técnicos.</w:t>
-      </w:r>
-    </w:p>
-    <w:p>
-      <w:pPr>
-        <w:spacing w:before="100" w:beforeAutospacing="1" w:after="100" w:afterAutospacing="1" w:line="240" w:lineRule="auto"/>
-        <w:ind w:firstLine="708"/>
-        <w:rPr>
-          <w:rFonts w:ascii="Arial" w:eastAsia="Times New Roman" w:hAnsi="Arial" w:cs="Arial"/>
-          <w:kern w:val="0"/>
-          <w:lang w:eastAsia="pt-BR"/>
-          <w14:ligatures w14:val="none"/>
-        </w:rPr>
-      </w:pPr>
-      <w:r>
-        <w:rPr>
-          <w:rFonts w:ascii="Arial" w:eastAsia="Times New Roman" w:hAnsi="Arial" w:cs="Arial"/>
-          <w:kern w:val="0"/>
-          <w:lang w:eastAsia="pt-BR"/>
-          <w14:ligatures w14:val="none"/>
-        </w:rPr>
-        <w:t xml:space="preserve">Um dos primeiros desafios esteve relacionado à comunicação serial. Inicialmente, ocorreram problemas de sincronização entre as mensagens enviadas pelo Arduino e a leitura realizada pela aplicação em Python, resultando em recepção de trechos incompletos ou mistura de mensagens. Esse problema foi mitigado com a padronização do formato da mensagem e a implementação de verificações mais rigorosas na etapa de </w:t>
-      </w:r>
-      <w:proofErr w:type="spellStart"/>
-      <w:r>
-        <w:rPr>
-          <w:rFonts w:ascii="Arial" w:eastAsia="Times New Roman" w:hAnsi="Arial" w:cs="Arial"/>
-          <w:kern w:val="0"/>
-          <w:lang w:eastAsia="pt-BR"/>
-          <w14:ligatures w14:val="none"/>
-        </w:rPr>
-        <w:t>parsing</w:t>
-      </w:r>
-      <w:proofErr w:type="spellEnd"/>
-      <w:r>
-        <w:rPr>
-          <w:rFonts w:ascii="Arial" w:eastAsia="Times New Roman" w:hAnsi="Arial" w:cs="Arial"/>
-          <w:kern w:val="0"/>
-          <w:lang w:eastAsia="pt-BR"/>
-          <w14:ligatures w14:val="none"/>
-        </w:rPr>
-        <w:t>, garantindo que apenas linhas completas fossem consideradas válidas.</w:t>
-      </w:r>
-    </w:p>
-    <w:p>
-      <w:pPr>
-        <w:spacing w:before="100" w:beforeAutospacing="1" w:after="100" w:afterAutospacing="1" w:line="240" w:lineRule="auto"/>
-        <w:ind w:firstLine="708"/>
-        <w:rPr>
-          <w:rFonts w:ascii="Arial" w:eastAsia="Times New Roman" w:hAnsi="Arial" w:cs="Arial"/>
-          <w:kern w:val="0"/>
-          <w:lang w:eastAsia="pt-BR"/>
-          <w14:ligatures w14:val="none"/>
-        </w:rPr>
-      </w:pPr>
-      <w:r>
-        <w:rPr>
-          <w:rFonts w:ascii="Arial" w:eastAsia="Times New Roman" w:hAnsi="Arial" w:cs="Arial"/>
-          <w:kern w:val="0"/>
-          <w:lang w:eastAsia="pt-BR"/>
-          <w14:ligatures w14:val="none"/>
-        </w:rPr>
-        <w:t>Outro desafio importante foi a consistência entre a ordem das variáveis utilizadas no treinamento do modelo e aquela empregada durante a execução do sistema em tempo real. Em versões iniciais, a ordem incorreta de montagem do vetor de entrada causou predições inconsistentes. Esse problema foi resolvido com a definição explícita de uma lista de sensores na ordem correta e a construção do vetor com base nessa referência.</w:t>
-      </w:r>
-    </w:p>
-    <w:p>
-      <w:pPr>
-        <w:spacing w:before="100" w:beforeAutospacing="1" w:after="100" w:afterAutospacing="1" w:line="240" w:lineRule="auto"/>
-        <w:ind w:firstLine="708"/>
-        <w:rPr>
-          <w:rFonts w:ascii="Arial" w:eastAsia="Times New Roman" w:hAnsi="Arial" w:cs="Arial"/>
-          <w:kern w:val="0"/>
-          <w:lang w:eastAsia="pt-BR"/>
-          <w14:ligatures w14:val="none"/>
-        </w:rPr>
-      </w:pPr>
-      <w:r>
-        <w:rPr>
-          <w:rFonts w:ascii="Arial" w:eastAsia="Times New Roman" w:hAnsi="Arial" w:cs="Arial"/>
-          <w:kern w:val="0"/>
-          <w:lang w:eastAsia="pt-BR"/>
-          <w14:ligatures w14:val="none"/>
-        </w:rPr>
-        <w:t>O tratamento de leituras inválidas do sensor DHT22 também se mostrou necessário, uma vez que o sensor pode eventualmente retornar valores não numéricos. A ausência desse tratamento impactava na conversão dos dados em Python e na padronização dos valores. A solução adotada foi descartar leituras inválidas ou repetir a última medição válida, conforme o comportamento desejado.</w:t>
+        <w:t>O tratamento de leituras inválidas do sensor DHT22 também se mostrou necessário, uma vez que o sensor pode eventualmente retornar valores não numéricos. A ausência desse tratamento impactava na conversão dos dados em Python e na padronização dos valores. A solução adotada foi descartar leituras inválidas</w:t>
+      </w:r>
+      <w:r>
+        <w:rPr>
+          <w:rFonts w:ascii="Arial" w:eastAsia="Times New Roman" w:hAnsi="Arial" w:cs="Arial"/>
+          <w:kern w:val="0"/>
+          <w:lang w:eastAsia="pt-BR"/>
+          <w14:ligatures w14:val="none"/>
+        </w:rPr>
+        <w:t>.</w:t>
       </w:r>
     </w:p>
     <w:p>
@@ -7782,7 +8000,6 @@
           <w:lang w:eastAsia="pt-BR"/>
           <w14:ligatures w14:val="none"/>
         </w:rPr>
-        <w:lastRenderedPageBreak/>
         <w:t>Base de treinamento relativamente pequena;</w:t>
       </w:r>
     </w:p>
@@ -7969,6 +8186,7 @@
           <w:lang w:eastAsia="pt-BR"/>
           <w14:ligatures w14:val="none"/>
         </w:rPr>
+        <w:lastRenderedPageBreak/>
         <w:t>Outra linha de evolução diz respeito ao armazenamento dos dados em banco de dados, seja local ou em nuvem. Com isso, seria possível realizar análises históricas mais aprofundadas, comparar períodos distintos, verificar tendências e treinar novos modelos com maior quantidade de informações.</w:t>
       </w:r>
     </w:p>
@@ -8088,6 +8306,7 @@
     <w:p>
       <w:pPr>
         <w:spacing w:before="100" w:beforeAutospacing="1" w:after="100" w:afterAutospacing="1" w:line="240" w:lineRule="auto"/>
+        <w:ind w:firstLine="708"/>
         <w:rPr>
           <w:rFonts w:ascii="Arial" w:eastAsia="Times New Roman" w:hAnsi="Arial" w:cs="Arial"/>
           <w:kern w:val="0"/>
@@ -8150,17 +8369,7 @@
           <w:lang w:eastAsia="pt-BR"/>
           <w14:ligatures w14:val="none"/>
         </w:rPr>
-        <w:t xml:space="preserve">O desenvolvimento do Sistema de Detecção de Anomalias para Monitoramento Ambiental permitiu integrar, em um único projeto, conceitos de Internet das Coisas, sistemas embarcados, comunicação serial, processamento de dados e técnicas de aprendizado de máquina. A solução proposta demonstrou ser capaz de monitorar variáveis ambientais em tempo real e </w:t>
-      </w:r>
-      <w:r>
-        <w:rPr>
-          <w:rFonts w:ascii="Arial" w:eastAsia="Times New Roman" w:hAnsi="Arial" w:cs="Arial"/>
-          <w:kern w:val="0"/>
-          <w:lang w:eastAsia="pt-BR"/>
-          <w14:ligatures w14:val="none"/>
-        </w:rPr>
-        <w:lastRenderedPageBreak/>
-        <w:t>identificar situações potencialmente anormais, acionando alerta físico quando necessário.</w:t>
+        <w:t>O desenvolvimento do Sistema de Detecção de Anomalias para Monitoramento Ambiental permitiu integrar, em um único projeto, conceitos de Internet das Coisas, sistemas embarcados, comunicação serial, processamento de dados e técnicas de aprendizado de máquina. A solução proposta demonstrou ser capaz de monitorar variáveis ambientais em tempo real e identificar situações potencialmente anormais, acionando alerta físico quando necessário.</w:t>
       </w:r>
     </w:p>
     <w:p>
@@ -8207,27 +8416,6 @@
     </w:p>
     <w:p>
       <w:pPr>
-        <w:spacing w:before="100" w:beforeAutospacing="1" w:after="100" w:afterAutospacing="1" w:line="240" w:lineRule="auto"/>
-        <w:ind w:firstLine="708"/>
-        <w:rPr>
-          <w:rFonts w:ascii="Arial" w:eastAsia="Times New Roman" w:hAnsi="Arial" w:cs="Arial"/>
-          <w:kern w:val="0"/>
-          <w:lang w:eastAsia="pt-BR"/>
-          <w14:ligatures w14:val="none"/>
-        </w:rPr>
-      </w:pPr>
-      <w:r>
-        <w:rPr>
-          <w:rFonts w:ascii="Arial" w:eastAsia="Times New Roman" w:hAnsi="Arial" w:cs="Arial"/>
-          <w:kern w:val="0"/>
-          <w:lang w:eastAsia="pt-BR"/>
-          <w14:ligatures w14:val="none"/>
-        </w:rPr>
-        <w:t>Além de atender às exigências da Atividade Prática Supervisionada, o trabalho contribuiu para o desenvolvimento de competências técnicas dos integrantes do grupo, especialmente nas áreas de integração hardware–software, tratamento de dados e aplicação prática de modelos de inteligência artificial. Como continuidade, são recomendadas as melhorias e extensões descritas na seção de trabalhos futuros, com vistas à evolução do sistema para um nível mais próximo de aplicação profissional.</w:t>
-      </w:r>
-    </w:p>
-    <w:p>
-      <w:pPr>
         <w:spacing w:after="0" w:line="240" w:lineRule="auto"/>
         <w:rPr>
           <w:rFonts w:ascii="Arial" w:eastAsia="Times New Roman" w:hAnsi="Arial" w:cs="Arial"/>
@@ -8272,248 +8460,6 @@
     </w:p>
     <w:p>
       <w:pPr>
-        <w:spacing w:after="0" w:line="240" w:lineRule="auto"/>
-        <w:rPr>
-          <w:rFonts w:ascii="Arial" w:eastAsia="Times New Roman" w:hAnsi="Arial" w:cs="Arial"/>
-          <w:kern w:val="0"/>
-          <w:lang w:eastAsia="pt-BR"/>
-          <w14:ligatures w14:val="none"/>
-        </w:rPr>
-      </w:pPr>
-    </w:p>
-    <w:p>
-      <w:pPr>
-        <w:spacing w:after="0" w:line="240" w:lineRule="auto"/>
-        <w:rPr>
-          <w:rFonts w:ascii="Arial" w:eastAsia="Times New Roman" w:hAnsi="Arial" w:cs="Arial"/>
-          <w:kern w:val="0"/>
-          <w:lang w:eastAsia="pt-BR"/>
-          <w14:ligatures w14:val="none"/>
-        </w:rPr>
-      </w:pPr>
-    </w:p>
-    <w:p>
-      <w:pPr>
-        <w:spacing w:after="0" w:line="240" w:lineRule="auto"/>
-        <w:rPr>
-          <w:rFonts w:ascii="Arial" w:eastAsia="Times New Roman" w:hAnsi="Arial" w:cs="Arial"/>
-          <w:kern w:val="0"/>
-          <w:lang w:eastAsia="pt-BR"/>
-          <w14:ligatures w14:val="none"/>
-        </w:rPr>
-      </w:pPr>
-    </w:p>
-    <w:p>
-      <w:pPr>
-        <w:spacing w:after="0" w:line="240" w:lineRule="auto"/>
-        <w:rPr>
-          <w:rFonts w:ascii="Arial" w:eastAsia="Times New Roman" w:hAnsi="Arial" w:cs="Arial"/>
-          <w:kern w:val="0"/>
-          <w:lang w:eastAsia="pt-BR"/>
-          <w14:ligatures w14:val="none"/>
-        </w:rPr>
-      </w:pPr>
-    </w:p>
-    <w:p>
-      <w:pPr>
-        <w:spacing w:after="0" w:line="240" w:lineRule="auto"/>
-        <w:rPr>
-          <w:rFonts w:ascii="Arial" w:eastAsia="Times New Roman" w:hAnsi="Arial" w:cs="Arial"/>
-          <w:kern w:val="0"/>
-          <w:lang w:eastAsia="pt-BR"/>
-          <w14:ligatures w14:val="none"/>
-        </w:rPr>
-      </w:pPr>
-    </w:p>
-    <w:p>
-      <w:pPr>
-        <w:spacing w:after="0" w:line="240" w:lineRule="auto"/>
-        <w:rPr>
-          <w:rFonts w:ascii="Arial" w:eastAsia="Times New Roman" w:hAnsi="Arial" w:cs="Arial"/>
-          <w:kern w:val="0"/>
-          <w:lang w:eastAsia="pt-BR"/>
-          <w14:ligatures w14:val="none"/>
-        </w:rPr>
-      </w:pPr>
-    </w:p>
-    <w:p>
-      <w:pPr>
-        <w:spacing w:after="0" w:line="240" w:lineRule="auto"/>
-        <w:rPr>
-          <w:rFonts w:ascii="Arial" w:eastAsia="Times New Roman" w:hAnsi="Arial" w:cs="Arial"/>
-          <w:kern w:val="0"/>
-          <w:lang w:eastAsia="pt-BR"/>
-          <w14:ligatures w14:val="none"/>
-        </w:rPr>
-      </w:pPr>
-    </w:p>
-    <w:p>
-      <w:pPr>
-        <w:spacing w:after="0" w:line="240" w:lineRule="auto"/>
-        <w:rPr>
-          <w:rFonts w:ascii="Arial" w:eastAsia="Times New Roman" w:hAnsi="Arial" w:cs="Arial"/>
-          <w:kern w:val="0"/>
-          <w:lang w:eastAsia="pt-BR"/>
-          <w14:ligatures w14:val="none"/>
-        </w:rPr>
-      </w:pPr>
-    </w:p>
-    <w:p>
-      <w:pPr>
-        <w:spacing w:after="0" w:line="240" w:lineRule="auto"/>
-        <w:rPr>
-          <w:rFonts w:ascii="Arial" w:eastAsia="Times New Roman" w:hAnsi="Arial" w:cs="Arial"/>
-          <w:kern w:val="0"/>
-          <w:lang w:eastAsia="pt-BR"/>
-          <w14:ligatures w14:val="none"/>
-        </w:rPr>
-      </w:pPr>
-    </w:p>
-    <w:p>
-      <w:pPr>
-        <w:spacing w:after="0" w:line="240" w:lineRule="auto"/>
-        <w:rPr>
-          <w:rFonts w:ascii="Arial" w:eastAsia="Times New Roman" w:hAnsi="Arial" w:cs="Arial"/>
-          <w:kern w:val="0"/>
-          <w:lang w:eastAsia="pt-BR"/>
-          <w14:ligatures w14:val="none"/>
-        </w:rPr>
-      </w:pPr>
-    </w:p>
-    <w:p>
-      <w:pPr>
-        <w:spacing w:after="0" w:line="240" w:lineRule="auto"/>
-        <w:rPr>
-          <w:rFonts w:ascii="Arial" w:eastAsia="Times New Roman" w:hAnsi="Arial" w:cs="Arial"/>
-          <w:kern w:val="0"/>
-          <w:lang w:eastAsia="pt-BR"/>
-          <w14:ligatures w14:val="none"/>
-        </w:rPr>
-      </w:pPr>
-    </w:p>
-    <w:p>
-      <w:pPr>
-        <w:spacing w:after="0" w:line="240" w:lineRule="auto"/>
-        <w:rPr>
-          <w:rFonts w:ascii="Arial" w:eastAsia="Times New Roman" w:hAnsi="Arial" w:cs="Arial"/>
-          <w:kern w:val="0"/>
-          <w:lang w:eastAsia="pt-BR"/>
-          <w14:ligatures w14:val="none"/>
-        </w:rPr>
-      </w:pPr>
-    </w:p>
-    <w:p>
-      <w:pPr>
-        <w:spacing w:after="0" w:line="240" w:lineRule="auto"/>
-        <w:rPr>
-          <w:rFonts w:ascii="Arial" w:eastAsia="Times New Roman" w:hAnsi="Arial" w:cs="Arial"/>
-          <w:kern w:val="0"/>
-          <w:lang w:eastAsia="pt-BR"/>
-          <w14:ligatures w14:val="none"/>
-        </w:rPr>
-      </w:pPr>
-    </w:p>
-    <w:p>
-      <w:pPr>
-        <w:spacing w:after="0" w:line="240" w:lineRule="auto"/>
-        <w:rPr>
-          <w:rFonts w:ascii="Arial" w:eastAsia="Times New Roman" w:hAnsi="Arial" w:cs="Arial"/>
-          <w:kern w:val="0"/>
-          <w:lang w:eastAsia="pt-BR"/>
-          <w14:ligatures w14:val="none"/>
-        </w:rPr>
-      </w:pPr>
-    </w:p>
-    <w:p>
-      <w:pPr>
-        <w:spacing w:after="0" w:line="240" w:lineRule="auto"/>
-        <w:rPr>
-          <w:rFonts w:ascii="Arial" w:eastAsia="Times New Roman" w:hAnsi="Arial" w:cs="Arial"/>
-          <w:kern w:val="0"/>
-          <w:lang w:eastAsia="pt-BR"/>
-          <w14:ligatures w14:val="none"/>
-        </w:rPr>
-      </w:pPr>
-    </w:p>
-    <w:p>
-      <w:pPr>
-        <w:spacing w:after="0" w:line="240" w:lineRule="auto"/>
-        <w:rPr>
-          <w:rFonts w:ascii="Arial" w:eastAsia="Times New Roman" w:hAnsi="Arial" w:cs="Arial"/>
-          <w:kern w:val="0"/>
-          <w:lang w:eastAsia="pt-BR"/>
-          <w14:ligatures w14:val="none"/>
-        </w:rPr>
-      </w:pPr>
-    </w:p>
-    <w:p>
-      <w:pPr>
-        <w:spacing w:after="0" w:line="240" w:lineRule="auto"/>
-        <w:rPr>
-          <w:rFonts w:ascii="Arial" w:eastAsia="Times New Roman" w:hAnsi="Arial" w:cs="Arial"/>
-          <w:kern w:val="0"/>
-          <w:lang w:eastAsia="pt-BR"/>
-          <w14:ligatures w14:val="none"/>
-        </w:rPr>
-      </w:pPr>
-    </w:p>
-    <w:p>
-      <w:pPr>
-        <w:spacing w:after="0" w:line="240" w:lineRule="auto"/>
-        <w:rPr>
-          <w:rFonts w:ascii="Arial" w:eastAsia="Times New Roman" w:hAnsi="Arial" w:cs="Arial"/>
-          <w:kern w:val="0"/>
-          <w:lang w:eastAsia="pt-BR"/>
-          <w14:ligatures w14:val="none"/>
-        </w:rPr>
-      </w:pPr>
-    </w:p>
-    <w:p>
-      <w:pPr>
-        <w:spacing w:after="0" w:line="240" w:lineRule="auto"/>
-        <w:rPr>
-          <w:rFonts w:ascii="Arial" w:eastAsia="Times New Roman" w:hAnsi="Arial" w:cs="Arial"/>
-          <w:kern w:val="0"/>
-          <w:lang w:eastAsia="pt-BR"/>
-          <w14:ligatures w14:val="none"/>
-        </w:rPr>
-      </w:pPr>
-    </w:p>
-    <w:p>
-      <w:pPr>
-        <w:spacing w:after="0" w:line="240" w:lineRule="auto"/>
-        <w:rPr>
-          <w:rFonts w:ascii="Arial" w:eastAsia="Times New Roman" w:hAnsi="Arial" w:cs="Arial"/>
-          <w:kern w:val="0"/>
-          <w:lang w:eastAsia="pt-BR"/>
-          <w14:ligatures w14:val="none"/>
-        </w:rPr>
-      </w:pPr>
-    </w:p>
-    <w:p>
-      <w:pPr>
-        <w:spacing w:after="0" w:line="240" w:lineRule="auto"/>
-        <w:rPr>
-          <w:rFonts w:ascii="Arial" w:eastAsia="Times New Roman" w:hAnsi="Arial" w:cs="Arial"/>
-          <w:kern w:val="0"/>
-          <w:lang w:eastAsia="pt-BR"/>
-          <w14:ligatures w14:val="none"/>
-        </w:rPr>
-      </w:pPr>
-    </w:p>
-    <w:p>
-      <w:pPr>
-        <w:spacing w:after="0" w:line="240" w:lineRule="auto"/>
-        <w:rPr>
-          <w:rFonts w:ascii="Arial" w:eastAsia="Times New Roman" w:hAnsi="Arial" w:cs="Arial"/>
-          <w:kern w:val="0"/>
-          <w:lang w:eastAsia="pt-BR"/>
-          <w14:ligatures w14:val="none"/>
-        </w:rPr>
-      </w:pPr>
-    </w:p>
-    <w:p>
-      <w:pPr>
         <w:spacing w:before="100" w:beforeAutospacing="1" w:after="100" w:afterAutospacing="1" w:line="240" w:lineRule="auto"/>
         <w:outlineLvl w:val="1"/>
         <w:rPr>
@@ -8535,7 +8481,6 @@
           <w:lang w:eastAsia="pt-BR"/>
           <w14:ligatures w14:val="none"/>
         </w:rPr>
-        <w:lastRenderedPageBreak/>
         <w:t>REFERÊNCIAS</w:t>
       </w:r>
       <w:bookmarkEnd w:id="25"/>
@@ -8543,51 +8488,45 @@
     <w:p>
       <w:pPr>
         <w:spacing w:before="100" w:beforeAutospacing="1" w:after="100" w:afterAutospacing="1" w:line="240" w:lineRule="auto"/>
-        <w:rPr>
-          <w:rFonts w:ascii="Arial" w:eastAsia="Times New Roman" w:hAnsi="Arial" w:cs="Arial"/>
-          <w:kern w:val="0"/>
-          <w:lang w:eastAsia="pt-BR"/>
-          <w14:ligatures w14:val="none"/>
-        </w:rPr>
-      </w:pPr>
-      <w:r>
-        <w:rPr>
-          <w:rFonts w:ascii="Arial" w:eastAsia="Times New Roman" w:hAnsi="Arial" w:cs="Arial"/>
-          <w:kern w:val="0"/>
-          <w:lang w:eastAsia="pt-BR"/>
-          <w14:ligatures w14:val="none"/>
-        </w:rPr>
-        <w:t>(Exemplos genéricos – ajuste conforme as fontes que vocês realmente usaram.)</w:t>
-      </w:r>
-    </w:p>
-    <w:p>
-      <w:pPr>
-        <w:spacing w:before="100" w:beforeAutospacing="1" w:after="100" w:afterAutospacing="1" w:line="240" w:lineRule="auto"/>
-        <w:rPr>
-          <w:rFonts w:ascii="Arial" w:eastAsia="Times New Roman" w:hAnsi="Arial" w:cs="Arial"/>
-          <w:kern w:val="0"/>
-          <w:lang w:eastAsia="pt-BR"/>
-          <w14:ligatures w14:val="none"/>
-        </w:rPr>
-      </w:pPr>
-      <w:r>
-        <w:rPr>
-          <w:rFonts w:ascii="Arial" w:eastAsia="Times New Roman" w:hAnsi="Arial" w:cs="Arial"/>
-          <w:kern w:val="0"/>
-          <w:lang w:eastAsia="pt-BR"/>
-          <w14:ligatures w14:val="none"/>
-        </w:rPr>
-        <w:t xml:space="preserve">ALPAYDIN, </w:t>
+        <w:jc w:val="both"/>
+        <w:rPr>
+          <w:rFonts w:ascii="Arial" w:eastAsia="Times New Roman" w:hAnsi="Arial" w:cs="Arial"/>
+          <w:kern w:val="0"/>
+          <w:lang w:eastAsia="pt-BR"/>
+          <w14:ligatures w14:val="none"/>
+        </w:rPr>
+      </w:pPr>
+      <w:r>
+        <w:rPr>
+          <w:rFonts w:ascii="Arial" w:eastAsia="Times New Roman" w:hAnsi="Arial" w:cs="Arial"/>
+          <w:kern w:val="0"/>
+          <w:lang w:eastAsia="pt-BR"/>
+          <w14:ligatures w14:val="none"/>
+        </w:rPr>
+        <w:t xml:space="preserve">ARDUINO. </w:t>
+      </w:r>
+      <w:r>
+        <w:rPr>
+          <w:rFonts w:ascii="Arial" w:eastAsia="Times New Roman" w:hAnsi="Arial" w:cs="Arial"/>
+          <w:b/>
+          <w:bCs/>
+          <w:kern w:val="0"/>
+          <w:lang w:eastAsia="pt-BR"/>
+          <w14:ligatures w14:val="none"/>
+        </w:rPr>
+        <w:t xml:space="preserve">Arduino </w:t>
       </w:r>
       <w:proofErr w:type="spellStart"/>
       <w:r>
         <w:rPr>
           <w:rFonts w:ascii="Arial" w:eastAsia="Times New Roman" w:hAnsi="Arial" w:cs="Arial"/>
-          <w:kern w:val="0"/>
-          <w:lang w:eastAsia="pt-BR"/>
-          <w14:ligatures w14:val="none"/>
-        </w:rPr>
-        <w:t>Ethem</w:t>
+          <w:b/>
+          <w:bCs/>
+          <w:kern w:val="0"/>
+          <w:lang w:eastAsia="pt-BR"/>
+          <w14:ligatures w14:val="none"/>
+        </w:rPr>
+        <w:t>Documentation</w:t>
       </w:r>
       <w:proofErr w:type="spellEnd"/>
       <w:r>
@@ -8597,7 +8536,142 @@
           <w:lang w:eastAsia="pt-BR"/>
           <w14:ligatures w14:val="none"/>
         </w:rPr>
-        <w:t xml:space="preserve">. </w:t>
+        <w:t xml:space="preserve">. Disponível em: </w:t>
+      </w:r>
+      <w:r>
+        <w:rPr>
+          <w:color w:val="000000" w:themeColor="text1"/>
+        </w:rPr>
+        <w:fldChar w:fldCharType="begin"/>
+      </w:r>
+      <w:r>
+        <w:rPr>
+          <w:color w:val="000000" w:themeColor="text1"/>
+        </w:rPr>
+        <w:instrText>HYPERLINK "https://docs.arduino.cc/" \t "_new"</w:instrText>
+      </w:r>
+      <w:r>
+        <w:rPr>
+          <w:color w:val="000000" w:themeColor="text1"/>
+        </w:rPr>
+      </w:r>
+      <w:r>
+        <w:rPr>
+          <w:color w:val="000000" w:themeColor="text1"/>
+        </w:rPr>
+        <w:fldChar w:fldCharType="separate"/>
+      </w:r>
+      <w:r>
+        <w:rPr>
+          <w:rFonts w:ascii="Arial" w:eastAsia="Times New Roman" w:hAnsi="Arial" w:cs="Arial"/>
+          <w:color w:val="000000" w:themeColor="text1"/>
+          <w:kern w:val="0"/>
+          <w:u w:val="single"/>
+          <w:lang w:eastAsia="pt-BR"/>
+          <w14:ligatures w14:val="none"/>
+        </w:rPr>
+        <w:t>https://docs.arduino.cc/</w:t>
+      </w:r>
+      <w:r>
+        <w:rPr>
+          <w:color w:val="000000" w:themeColor="text1"/>
+        </w:rPr>
+        <w:fldChar w:fldCharType="end"/>
+      </w:r>
+      <w:r>
+        <w:rPr>
+          <w:rFonts w:ascii="Arial" w:eastAsia="Times New Roman" w:hAnsi="Arial" w:cs="Arial"/>
+          <w:kern w:val="0"/>
+          <w:lang w:eastAsia="pt-BR"/>
+          <w14:ligatures w14:val="none"/>
+        </w:rPr>
+        <w:t>. Acesso em: 10 fev. 2026.</w:t>
+      </w:r>
+    </w:p>
+    <w:p>
+      <w:pPr>
+        <w:spacing w:before="100" w:beforeAutospacing="1" w:after="100" w:afterAutospacing="1" w:line="240" w:lineRule="auto"/>
+        <w:jc w:val="both"/>
+        <w:rPr>
+          <w:rFonts w:ascii="Arial" w:eastAsia="Times New Roman" w:hAnsi="Arial" w:cs="Arial"/>
+          <w:kern w:val="0"/>
+          <w:lang w:eastAsia="pt-BR"/>
+          <w14:ligatures w14:val="none"/>
+        </w:rPr>
+      </w:pPr>
+      <w:r>
+        <w:rPr>
+          <w:rFonts w:ascii="Arial" w:eastAsia="Times New Roman" w:hAnsi="Arial" w:cs="Arial"/>
+          <w:kern w:val="0"/>
+          <w:lang w:eastAsia="pt-BR"/>
+          <w14:ligatures w14:val="none"/>
+        </w:rPr>
+        <w:t>C</w:t>
+      </w:r>
+      <w:r>
+        <w:rPr>
+          <w:rFonts w:ascii="Arial" w:eastAsia="Times New Roman" w:hAnsi="Arial" w:cs="Arial"/>
+          <w:kern w:val="0"/>
+          <w:lang w:eastAsia="pt-BR"/>
+          <w14:ligatures w14:val="none"/>
+        </w:rPr>
+        <w:t>avalcante</w:t>
+      </w:r>
+      <w:r>
+        <w:rPr>
+          <w:rFonts w:ascii="Arial" w:eastAsia="Times New Roman" w:hAnsi="Arial" w:cs="Arial"/>
+          <w:kern w:val="0"/>
+          <w:lang w:eastAsia="pt-BR"/>
+          <w14:ligatures w14:val="none"/>
+        </w:rPr>
+        <w:t>, Anderson Rodrigues; M</w:t>
+      </w:r>
+      <w:r>
+        <w:rPr>
+          <w:rFonts w:ascii="Arial" w:eastAsia="Times New Roman" w:hAnsi="Arial" w:cs="Arial"/>
+          <w:kern w:val="0"/>
+          <w:lang w:eastAsia="pt-BR"/>
+          <w14:ligatures w14:val="none"/>
+        </w:rPr>
+        <w:t>edeiros</w:t>
+      </w:r>
+      <w:r>
+        <w:rPr>
+          <w:rFonts w:ascii="Arial" w:eastAsia="Times New Roman" w:hAnsi="Arial" w:cs="Arial"/>
+          <w:kern w:val="0"/>
+          <w:lang w:eastAsia="pt-BR"/>
+          <w14:ligatures w14:val="none"/>
+        </w:rPr>
+        <w:t>, Victor Wanderley Costa de; G</w:t>
+      </w:r>
+      <w:r>
+        <w:rPr>
+          <w:rFonts w:ascii="Arial" w:eastAsia="Times New Roman" w:hAnsi="Arial" w:cs="Arial"/>
+          <w:kern w:val="0"/>
+          <w:lang w:eastAsia="pt-BR"/>
+          <w14:ligatures w14:val="none"/>
+        </w:rPr>
+        <w:t>onçalves</w:t>
+      </w:r>
+      <w:r>
+        <w:rPr>
+          <w:rFonts w:ascii="Arial" w:eastAsia="Times New Roman" w:hAnsi="Arial" w:cs="Arial"/>
+          <w:kern w:val="0"/>
+          <w:lang w:eastAsia="pt-BR"/>
+          <w14:ligatures w14:val="none"/>
+        </w:rPr>
+        <w:t xml:space="preserve">, Glauco Estácio. </w:t>
+      </w:r>
+      <w:r>
+        <w:rPr>
+          <w:rFonts w:ascii="Arial" w:eastAsia="Times New Roman" w:hAnsi="Arial" w:cs="Arial"/>
+          <w:b/>
+          <w:bCs/>
+          <w:kern w:val="0"/>
+          <w:lang w:eastAsia="pt-BR"/>
+          <w14:ligatures w14:val="none"/>
+        </w:rPr>
+        <w:t xml:space="preserve">Detecção de anomalias em dados meteorológicos do Sertão de Pernambuco utilizando </w:t>
       </w:r>
       <w:proofErr w:type="spellStart"/>
       <w:r>
@@ -8609,7 +8683,7 @@
           <w:lang w:eastAsia="pt-BR"/>
           <w14:ligatures w14:val="none"/>
         </w:rPr>
-        <w:t>Introduction</w:t>
+        <w:t>Isolation</w:t>
       </w:r>
       <w:proofErr w:type="spellEnd"/>
       <w:r>
@@ -8621,6 +8695,142 @@
           <w:lang w:eastAsia="pt-BR"/>
           <w14:ligatures w14:val="none"/>
         </w:rPr>
+        <w:t xml:space="preserve"> Forest e DBSCAN</w:t>
+      </w:r>
+      <w:r>
+        <w:rPr>
+          <w:rFonts w:ascii="Arial" w:eastAsia="Times New Roman" w:hAnsi="Arial" w:cs="Arial"/>
+          <w:kern w:val="0"/>
+          <w:lang w:eastAsia="pt-BR"/>
+          <w14:ligatures w14:val="none"/>
+        </w:rPr>
+        <w:t xml:space="preserve">. In: WORKSHOP DE COMPUTAÇÃO APLICADA À GESTÃO DO MEIO AMBIENTE E RECURSOS NATURAIS (WCAMA), 2023. </w:t>
+      </w:r>
+    </w:p>
+    <w:p>
+      <w:pPr>
+        <w:spacing w:before="100" w:beforeAutospacing="1" w:after="100" w:afterAutospacing="1" w:line="240" w:lineRule="auto"/>
+        <w:jc w:val="both"/>
+        <w:rPr>
+          <w:rFonts w:ascii="Arial" w:eastAsia="Times New Roman" w:hAnsi="Arial" w:cs="Arial"/>
+          <w:kern w:val="0"/>
+          <w:lang w:eastAsia="pt-BR"/>
+          <w14:ligatures w14:val="none"/>
+        </w:rPr>
+      </w:pPr>
+      <w:proofErr w:type="spellStart"/>
+      <w:r>
+        <w:rPr>
+          <w:rFonts w:ascii="Arial" w:eastAsia="Times New Roman" w:hAnsi="Arial" w:cs="Arial"/>
+          <w:kern w:val="0"/>
+          <w:lang w:eastAsia="pt-BR"/>
+          <w14:ligatures w14:val="none"/>
+        </w:rPr>
+        <w:t>Gubbi</w:t>
+      </w:r>
+      <w:proofErr w:type="spellEnd"/>
+      <w:r>
+        <w:rPr>
+          <w:rFonts w:ascii="Arial" w:eastAsia="Times New Roman" w:hAnsi="Arial" w:cs="Arial"/>
+          <w:kern w:val="0"/>
+          <w:lang w:eastAsia="pt-BR"/>
+          <w14:ligatures w14:val="none"/>
+        </w:rPr>
+        <w:t xml:space="preserve">, J., </w:t>
+      </w:r>
+      <w:proofErr w:type="spellStart"/>
+      <w:r>
+        <w:rPr>
+          <w:rFonts w:ascii="Arial" w:eastAsia="Times New Roman" w:hAnsi="Arial" w:cs="Arial"/>
+          <w:kern w:val="0"/>
+          <w:lang w:eastAsia="pt-BR"/>
+          <w14:ligatures w14:val="none"/>
+        </w:rPr>
+        <w:t>Buyya</w:t>
+      </w:r>
+      <w:proofErr w:type="spellEnd"/>
+      <w:r>
+        <w:rPr>
+          <w:rFonts w:ascii="Arial" w:eastAsia="Times New Roman" w:hAnsi="Arial" w:cs="Arial"/>
+          <w:kern w:val="0"/>
+          <w:lang w:eastAsia="pt-BR"/>
+          <w14:ligatures w14:val="none"/>
+        </w:rPr>
+        <w:t xml:space="preserve">, R., </w:t>
+      </w:r>
+      <w:proofErr w:type="spellStart"/>
+      <w:r>
+        <w:rPr>
+          <w:rFonts w:ascii="Arial" w:eastAsia="Times New Roman" w:hAnsi="Arial" w:cs="Arial"/>
+          <w:kern w:val="0"/>
+          <w:lang w:eastAsia="pt-BR"/>
+          <w14:ligatures w14:val="none"/>
+        </w:rPr>
+        <w:t>Marusic</w:t>
+      </w:r>
+      <w:proofErr w:type="spellEnd"/>
+      <w:r>
+        <w:rPr>
+          <w:rFonts w:ascii="Arial" w:eastAsia="Times New Roman" w:hAnsi="Arial" w:cs="Arial"/>
+          <w:kern w:val="0"/>
+          <w:lang w:eastAsia="pt-BR"/>
+          <w14:ligatures w14:val="none"/>
+        </w:rPr>
+        <w:t xml:space="preserve">, S., &amp; </w:t>
+      </w:r>
+      <w:proofErr w:type="spellStart"/>
+      <w:r>
+        <w:rPr>
+          <w:rFonts w:ascii="Arial" w:eastAsia="Times New Roman" w:hAnsi="Arial" w:cs="Arial"/>
+          <w:kern w:val="0"/>
+          <w:lang w:eastAsia="pt-BR"/>
+          <w14:ligatures w14:val="none"/>
+        </w:rPr>
+        <w:t>Palaniswami</w:t>
+      </w:r>
+      <w:proofErr w:type="spellEnd"/>
+      <w:r>
+        <w:rPr>
+          <w:rFonts w:ascii="Arial" w:eastAsia="Times New Roman" w:hAnsi="Arial" w:cs="Arial"/>
+          <w:kern w:val="0"/>
+          <w:lang w:eastAsia="pt-BR"/>
+          <w14:ligatures w14:val="none"/>
+        </w:rPr>
+        <w:t xml:space="preserve">, M. (2013). </w:t>
+      </w:r>
+      <w:r>
+        <w:rPr>
+          <w:rFonts w:ascii="Arial" w:eastAsia="Times New Roman" w:hAnsi="Arial" w:cs="Arial"/>
+          <w:b/>
+          <w:bCs/>
+          <w:kern w:val="0"/>
+          <w:lang w:eastAsia="pt-BR"/>
+          <w14:ligatures w14:val="none"/>
+        </w:rPr>
+        <w:t xml:space="preserve">Internet </w:t>
+      </w:r>
+      <w:proofErr w:type="spellStart"/>
+      <w:r>
+        <w:rPr>
+          <w:rFonts w:ascii="Arial" w:eastAsia="Times New Roman" w:hAnsi="Arial" w:cs="Arial"/>
+          <w:b/>
+          <w:bCs/>
+          <w:kern w:val="0"/>
+          <w:lang w:eastAsia="pt-BR"/>
+          <w14:ligatures w14:val="none"/>
+        </w:rPr>
+        <w:t>of</w:t>
+      </w:r>
+      <w:proofErr w:type="spellEnd"/>
+      <w:r>
+        <w:rPr>
+          <w:rFonts w:ascii="Arial" w:eastAsia="Times New Roman" w:hAnsi="Arial" w:cs="Arial"/>
+          <w:b/>
+          <w:bCs/>
+          <w:kern w:val="0"/>
+          <w:lang w:eastAsia="pt-BR"/>
+          <w14:ligatures w14:val="none"/>
+        </w:rPr>
         <w:t xml:space="preserve"> </w:t>
       </w:r>
       <w:proofErr w:type="spellStart"/>
@@ -8633,7 +8843,7 @@
           <w:lang w:eastAsia="pt-BR"/>
           <w14:ligatures w14:val="none"/>
         </w:rPr>
-        <w:t>to</w:t>
+        <w:t>Things</w:t>
       </w:r>
       <w:proofErr w:type="spellEnd"/>
       <w:r>
@@ -8645,37 +8855,9 @@
           <w:lang w:eastAsia="pt-BR"/>
           <w14:ligatures w14:val="none"/>
         </w:rPr>
-        <w:t xml:space="preserve"> Machine Learning</w:t>
-      </w:r>
-      <w:r>
-        <w:rPr>
-          <w:rFonts w:ascii="Arial" w:eastAsia="Times New Roman" w:hAnsi="Arial" w:cs="Arial"/>
-          <w:kern w:val="0"/>
-          <w:lang w:eastAsia="pt-BR"/>
-          <w14:ligatures w14:val="none"/>
-        </w:rPr>
-        <w:t>. 4. ed. Cambridge: MIT Press, 2020.</w:t>
-      </w:r>
-    </w:p>
-    <w:p>
-      <w:pPr>
-        <w:spacing w:before="100" w:beforeAutospacing="1" w:after="100" w:afterAutospacing="1" w:line="240" w:lineRule="auto"/>
-        <w:rPr>
-          <w:rFonts w:ascii="Arial" w:eastAsia="Times New Roman" w:hAnsi="Arial" w:cs="Arial"/>
-          <w:kern w:val="0"/>
-          <w:lang w:eastAsia="pt-BR"/>
-          <w14:ligatures w14:val="none"/>
-        </w:rPr>
-      </w:pPr>
-      <w:r>
-        <w:rPr>
-          <w:rFonts w:ascii="Arial" w:eastAsia="Times New Roman" w:hAnsi="Arial" w:cs="Arial"/>
-          <w:kern w:val="0"/>
-          <w:lang w:eastAsia="pt-BR"/>
-          <w14:ligatures w14:val="none"/>
-        </w:rPr>
-        <w:t xml:space="preserve">ARDUINO. </w:t>
-      </w:r>
+        <w:t xml:space="preserve"> (IoT): A </w:t>
+      </w:r>
+      <w:proofErr w:type="spellStart"/>
       <w:r>
         <w:rPr>
           <w:rFonts w:ascii="Arial" w:eastAsia="Times New Roman" w:hAnsi="Arial" w:cs="Arial"/>
@@ -8685,7 +8867,19 @@
           <w:lang w:eastAsia="pt-BR"/>
           <w14:ligatures w14:val="none"/>
         </w:rPr>
-        <w:t xml:space="preserve">Arduino </w:t>
+        <w:t>vision</w:t>
+      </w:r>
+      <w:proofErr w:type="spellEnd"/>
+      <w:r>
+        <w:rPr>
+          <w:rFonts w:ascii="Arial" w:eastAsia="Times New Roman" w:hAnsi="Arial" w:cs="Arial"/>
+          <w:b/>
+          <w:bCs/>
+          <w:kern w:val="0"/>
+          <w:lang w:eastAsia="pt-BR"/>
+          <w14:ligatures w14:val="none"/>
+        </w:rPr>
+        <w:t xml:space="preserve">, </w:t>
       </w:r>
       <w:proofErr w:type="spellStart"/>
       <w:r>
@@ -8697,419 +8891,670 @@
           <w:lang w:eastAsia="pt-BR"/>
           <w14:ligatures w14:val="none"/>
         </w:rPr>
+        <w:t>architectural</w:t>
+      </w:r>
+      <w:proofErr w:type="spellEnd"/>
+      <w:r>
+        <w:rPr>
+          <w:rFonts w:ascii="Arial" w:eastAsia="Times New Roman" w:hAnsi="Arial" w:cs="Arial"/>
+          <w:b/>
+          <w:bCs/>
+          <w:kern w:val="0"/>
+          <w:lang w:eastAsia="pt-BR"/>
+          <w14:ligatures w14:val="none"/>
+        </w:rPr>
+        <w:t xml:space="preserve"> </w:t>
+      </w:r>
+      <w:proofErr w:type="spellStart"/>
+      <w:r>
+        <w:rPr>
+          <w:rFonts w:ascii="Arial" w:eastAsia="Times New Roman" w:hAnsi="Arial" w:cs="Arial"/>
+          <w:b/>
+          <w:bCs/>
+          <w:kern w:val="0"/>
+          <w:lang w:eastAsia="pt-BR"/>
+          <w14:ligatures w14:val="none"/>
+        </w:rPr>
+        <w:t>elements</w:t>
+      </w:r>
+      <w:proofErr w:type="spellEnd"/>
+      <w:r>
+        <w:rPr>
+          <w:rFonts w:ascii="Arial" w:eastAsia="Times New Roman" w:hAnsi="Arial" w:cs="Arial"/>
+          <w:b/>
+          <w:bCs/>
+          <w:kern w:val="0"/>
+          <w:lang w:eastAsia="pt-BR"/>
+          <w14:ligatures w14:val="none"/>
+        </w:rPr>
+        <w:t xml:space="preserve">, </w:t>
+      </w:r>
+      <w:proofErr w:type="spellStart"/>
+      <w:r>
+        <w:rPr>
+          <w:rFonts w:ascii="Arial" w:eastAsia="Times New Roman" w:hAnsi="Arial" w:cs="Arial"/>
+          <w:b/>
+          <w:bCs/>
+          <w:kern w:val="0"/>
+          <w:lang w:eastAsia="pt-BR"/>
+          <w14:ligatures w14:val="none"/>
+        </w:rPr>
+        <w:t>and</w:t>
+      </w:r>
+      <w:proofErr w:type="spellEnd"/>
+      <w:r>
+        <w:rPr>
+          <w:rFonts w:ascii="Arial" w:eastAsia="Times New Roman" w:hAnsi="Arial" w:cs="Arial"/>
+          <w:b/>
+          <w:bCs/>
+          <w:kern w:val="0"/>
+          <w:lang w:eastAsia="pt-BR"/>
+          <w14:ligatures w14:val="none"/>
+        </w:rPr>
+        <w:t xml:space="preserve"> future </w:t>
+      </w:r>
+      <w:proofErr w:type="spellStart"/>
+      <w:r>
+        <w:rPr>
+          <w:rFonts w:ascii="Arial" w:eastAsia="Times New Roman" w:hAnsi="Arial" w:cs="Arial"/>
+          <w:b/>
+          <w:bCs/>
+          <w:kern w:val="0"/>
+          <w:lang w:eastAsia="pt-BR"/>
+          <w14:ligatures w14:val="none"/>
+        </w:rPr>
+        <w:t>directions</w:t>
+      </w:r>
+      <w:proofErr w:type="spellEnd"/>
+      <w:r>
+        <w:rPr>
+          <w:rFonts w:ascii="Arial" w:eastAsia="Times New Roman" w:hAnsi="Arial" w:cs="Arial"/>
+          <w:kern w:val="0"/>
+          <w:lang w:eastAsia="pt-BR"/>
+          <w14:ligatures w14:val="none"/>
+        </w:rPr>
+        <w:t xml:space="preserve">. Future Generation Computer Systems. </w:t>
+      </w:r>
+      <w:hyperlink r:id="rId8" w:history="1">
+        <w:r>
+          <w:rPr>
+            <w:rStyle w:val="Hyperlink"/>
+            <w:rFonts w:ascii="Arial" w:eastAsia="Times New Roman" w:hAnsi="Arial" w:cs="Arial"/>
+            <w:color w:val="000000" w:themeColor="text1"/>
+            <w:kern w:val="0"/>
+            <w:lang w:eastAsia="pt-BR"/>
+            <w14:ligatures w14:val="none"/>
+          </w:rPr>
+          <w:t>https://doi.org/10.1016/j.future.2013.01.010</w:t>
+        </w:r>
+      </w:hyperlink>
+      <w:r>
+        <w:rPr>
+          <w:rFonts w:ascii="Arial" w:eastAsia="Times New Roman" w:hAnsi="Arial" w:cs="Arial"/>
+          <w:kern w:val="0"/>
+          <w:lang w:eastAsia="pt-BR"/>
+          <w14:ligatures w14:val="none"/>
+        </w:rPr>
+        <w:t>.</w:t>
+      </w:r>
+      <w:r>
+        <w:rPr>
+          <w:rFonts w:ascii="Arial" w:eastAsia="Times New Roman" w:hAnsi="Arial" w:cs="Arial"/>
+          <w:kern w:val="0"/>
+          <w:lang w:eastAsia="pt-BR"/>
+          <w14:ligatures w14:val="none"/>
+        </w:rPr>
+        <w:t xml:space="preserve"> Acesso em 31 dez. 2025.</w:t>
+      </w:r>
+    </w:p>
+    <w:p>
+      <w:pPr>
+        <w:spacing w:before="100" w:beforeAutospacing="1" w:after="100" w:afterAutospacing="1" w:line="240" w:lineRule="auto"/>
+        <w:jc w:val="both"/>
+        <w:rPr>
+          <w:rFonts w:ascii="Arial" w:eastAsia="Times New Roman" w:hAnsi="Arial" w:cs="Arial"/>
+          <w:b/>
+          <w:bCs/>
+          <w:kern w:val="0"/>
+          <w:lang w:eastAsia="pt-BR"/>
+          <w14:ligatures w14:val="none"/>
+        </w:rPr>
+      </w:pPr>
+      <w:proofErr w:type="spellStart"/>
+      <w:r>
+        <w:rPr>
+          <w:rFonts w:ascii="Arial" w:eastAsia="Times New Roman" w:hAnsi="Arial" w:cs="Arial"/>
+          <w:kern w:val="0"/>
+          <w:lang w:eastAsia="pt-BR"/>
+          <w14:ligatures w14:val="none"/>
+        </w:rPr>
+        <w:t>Liechti</w:t>
+      </w:r>
+      <w:proofErr w:type="spellEnd"/>
+      <w:r>
+        <w:rPr>
+          <w:rFonts w:ascii="Arial" w:eastAsia="Times New Roman" w:hAnsi="Arial" w:cs="Arial"/>
+          <w:kern w:val="0"/>
+          <w:lang w:eastAsia="pt-BR"/>
+          <w14:ligatures w14:val="none"/>
+        </w:rPr>
+        <w:t>, C. (</w:t>
+      </w:r>
+      <w:proofErr w:type="spellStart"/>
+      <w:r>
+        <w:rPr>
+          <w:rFonts w:ascii="Arial" w:eastAsia="Times New Roman" w:hAnsi="Arial" w:cs="Arial"/>
+          <w:kern w:val="0"/>
+          <w:lang w:eastAsia="pt-BR"/>
+          <w14:ligatures w14:val="none"/>
+        </w:rPr>
+        <w:t>n.d</w:t>
+      </w:r>
+      <w:proofErr w:type="spellEnd"/>
+      <w:r>
+        <w:rPr>
+          <w:rFonts w:ascii="Arial" w:eastAsia="Times New Roman" w:hAnsi="Arial" w:cs="Arial"/>
+          <w:kern w:val="0"/>
+          <w:lang w:eastAsia="pt-BR"/>
+          <w14:ligatures w14:val="none"/>
+        </w:rPr>
+        <w:t xml:space="preserve">.). </w:t>
+      </w:r>
+      <w:proofErr w:type="spellStart"/>
+      <w:r>
+        <w:rPr>
+          <w:rFonts w:ascii="Arial" w:eastAsia="Times New Roman" w:hAnsi="Arial" w:cs="Arial"/>
+          <w:b/>
+          <w:bCs/>
+          <w:kern w:val="0"/>
+          <w:lang w:eastAsia="pt-BR"/>
+          <w14:ligatures w14:val="none"/>
+        </w:rPr>
+        <w:t>pySerial</w:t>
+      </w:r>
+      <w:proofErr w:type="spellEnd"/>
+      <w:r>
+        <w:rPr>
+          <w:rFonts w:ascii="Arial" w:eastAsia="Times New Roman" w:hAnsi="Arial" w:cs="Arial"/>
+          <w:kern w:val="0"/>
+          <w:lang w:eastAsia="pt-BR"/>
+          <w14:ligatures w14:val="none"/>
+        </w:rPr>
+        <w:t>.</w:t>
+      </w:r>
+      <w:r>
+        <w:rPr>
+          <w:rFonts w:ascii="Arial" w:eastAsia="Times New Roman" w:hAnsi="Arial" w:cs="Arial"/>
+          <w:b/>
+          <w:bCs/>
+          <w:kern w:val="0"/>
+          <w:lang w:eastAsia="pt-BR"/>
+          <w14:ligatures w14:val="none"/>
+        </w:rPr>
+        <w:t xml:space="preserve"> </w:t>
+      </w:r>
+      <w:proofErr w:type="spellStart"/>
+      <w:r>
+        <w:rPr>
+          <w:rFonts w:ascii="Arial" w:eastAsia="Times New Roman" w:hAnsi="Arial" w:cs="Arial"/>
+          <w:b/>
+          <w:bCs/>
+          <w:kern w:val="0"/>
+          <w:lang w:eastAsia="pt-BR"/>
+          <w14:ligatures w14:val="none"/>
+        </w:rPr>
         <w:t>Documentation</w:t>
       </w:r>
       <w:proofErr w:type="spellEnd"/>
       <w:r>
         <w:rPr>
           <w:rFonts w:ascii="Arial" w:eastAsia="Times New Roman" w:hAnsi="Arial" w:cs="Arial"/>
+          <w:b/>
+          <w:bCs/>
+          <w:kern w:val="0"/>
+          <w:lang w:eastAsia="pt-BR"/>
+          <w14:ligatures w14:val="none"/>
+        </w:rPr>
+        <w:t xml:space="preserve">: </w:t>
+      </w:r>
+      <w:hyperlink r:id="rId9" w:history="1">
+        <w:r>
+          <w:rPr>
+            <w:rStyle w:val="Hyperlink"/>
+            <w:rFonts w:ascii="Arial" w:eastAsia="Times New Roman" w:hAnsi="Arial" w:cs="Arial"/>
+            <w:color w:val="000000" w:themeColor="text1"/>
+            <w:kern w:val="0"/>
+            <w:lang w:eastAsia="pt-BR"/>
+            <w14:ligatures w14:val="none"/>
+          </w:rPr>
+          <w:t>https://pyserial.readthedocs.io/en/latest/</w:t>
+        </w:r>
+      </w:hyperlink>
+      <w:r>
+        <w:rPr>
+          <w:rFonts w:ascii="Arial" w:eastAsia="Times New Roman" w:hAnsi="Arial" w:cs="Arial"/>
+          <w:kern w:val="0"/>
+          <w:lang w:eastAsia="pt-BR"/>
+          <w14:ligatures w14:val="none"/>
+        </w:rPr>
+        <w:t>. Acesso em 01 jan. 2026.</w:t>
+      </w:r>
+    </w:p>
+    <w:p>
+      <w:pPr>
+        <w:spacing w:before="100" w:beforeAutospacing="1" w:after="100" w:afterAutospacing="1" w:line="240" w:lineRule="auto"/>
+        <w:jc w:val="both"/>
+        <w:rPr>
+          <w:rFonts w:ascii="Arial" w:eastAsia="Times New Roman" w:hAnsi="Arial" w:cs="Arial"/>
+          <w:kern w:val="0"/>
+          <w:lang w:eastAsia="pt-BR"/>
+          <w14:ligatures w14:val="none"/>
+        </w:rPr>
+      </w:pPr>
+      <w:r>
+        <w:rPr>
+          <w:rFonts w:ascii="Arial" w:eastAsia="Times New Roman" w:hAnsi="Arial" w:cs="Arial"/>
+          <w:kern w:val="0"/>
+          <w:lang w:eastAsia="pt-BR"/>
+          <w14:ligatures w14:val="none"/>
+        </w:rPr>
+        <w:t xml:space="preserve">PYTHON SOFTWARE FOUNDATION. </w:t>
+      </w:r>
+      <w:r>
+        <w:rPr>
+          <w:rFonts w:ascii="Arial" w:eastAsia="Times New Roman" w:hAnsi="Arial" w:cs="Arial"/>
+          <w:b/>
+          <w:bCs/>
+          <w:kern w:val="0"/>
+          <w:lang w:eastAsia="pt-BR"/>
+          <w14:ligatures w14:val="none"/>
+        </w:rPr>
+        <w:t xml:space="preserve">Python </w:t>
+      </w:r>
+      <w:proofErr w:type="spellStart"/>
+      <w:r>
+        <w:rPr>
+          <w:rFonts w:ascii="Arial" w:eastAsia="Times New Roman" w:hAnsi="Arial" w:cs="Arial"/>
+          <w:b/>
+          <w:bCs/>
+          <w:kern w:val="0"/>
+          <w:lang w:eastAsia="pt-BR"/>
+          <w14:ligatures w14:val="none"/>
+        </w:rPr>
+        <w:t>Documentation</w:t>
+      </w:r>
+      <w:proofErr w:type="spellEnd"/>
+      <w:r>
+        <w:rPr>
+          <w:rFonts w:ascii="Arial" w:eastAsia="Times New Roman" w:hAnsi="Arial" w:cs="Arial"/>
           <w:kern w:val="0"/>
           <w:lang w:eastAsia="pt-BR"/>
           <w14:ligatures w14:val="none"/>
         </w:rPr>
         <w:t xml:space="preserve">. Disponível em: </w:t>
       </w:r>
-      <w:hyperlink r:id="rId8" w:tgtFrame="_new" w:history="1">
+      <w:r>
+        <w:rPr>
+          <w:color w:val="000000" w:themeColor="text1"/>
+        </w:rPr>
+        <w:fldChar w:fldCharType="begin"/>
+      </w:r>
+      <w:r>
+        <w:rPr>
+          <w:color w:val="000000" w:themeColor="text1"/>
+        </w:rPr>
+        <w:instrText>HYPERLINK "https://docs.python.org/" \t "_new"</w:instrText>
+      </w:r>
+      <w:r>
+        <w:rPr>
+          <w:color w:val="000000" w:themeColor="text1"/>
+        </w:rPr>
+      </w:r>
+      <w:r>
+        <w:rPr>
+          <w:color w:val="000000" w:themeColor="text1"/>
+        </w:rPr>
+        <w:fldChar w:fldCharType="separate"/>
+      </w:r>
+      <w:r>
+        <w:rPr>
+          <w:rFonts w:ascii="Arial" w:eastAsia="Times New Roman" w:hAnsi="Arial" w:cs="Arial"/>
+          <w:color w:val="000000" w:themeColor="text1"/>
+          <w:kern w:val="0"/>
+          <w:u w:val="single"/>
+          <w:lang w:eastAsia="pt-BR"/>
+          <w14:ligatures w14:val="none"/>
+        </w:rPr>
+        <w:t>https://docs.python.org/</w:t>
+      </w:r>
+      <w:r>
+        <w:rPr>
+          <w:color w:val="000000" w:themeColor="text1"/>
+        </w:rPr>
+        <w:fldChar w:fldCharType="end"/>
+      </w:r>
+      <w:r>
+        <w:rPr>
+          <w:rFonts w:ascii="Arial" w:eastAsia="Times New Roman" w:hAnsi="Arial" w:cs="Arial"/>
+          <w:kern w:val="0"/>
+          <w:lang w:eastAsia="pt-BR"/>
+          <w14:ligatures w14:val="none"/>
+        </w:rPr>
+        <w:t xml:space="preserve">. Acesso em: </w:t>
+      </w:r>
+      <w:r>
+        <w:rPr>
+          <w:rFonts w:ascii="Arial" w:eastAsia="Times New Roman" w:hAnsi="Arial" w:cs="Arial"/>
+          <w:kern w:val="0"/>
+          <w:lang w:eastAsia="pt-BR"/>
+          <w14:ligatures w14:val="none"/>
+        </w:rPr>
+        <w:t>12</w:t>
+      </w:r>
+      <w:r>
+        <w:rPr>
+          <w:rFonts w:ascii="Arial" w:eastAsia="Times New Roman" w:hAnsi="Arial" w:cs="Arial"/>
+          <w:kern w:val="0"/>
+          <w:lang w:eastAsia="pt-BR"/>
+          <w14:ligatures w14:val="none"/>
+        </w:rPr>
+        <w:t xml:space="preserve"> fev. 2026.</w:t>
+      </w:r>
+    </w:p>
+    <w:p>
+      <w:pPr>
+        <w:spacing w:before="100" w:beforeAutospacing="1" w:after="100" w:afterAutospacing="1" w:line="240" w:lineRule="auto"/>
+        <w:jc w:val="both"/>
+        <w:rPr>
+          <w:rFonts w:ascii="Arial" w:eastAsia="Times New Roman" w:hAnsi="Arial" w:cs="Arial"/>
+          <w:kern w:val="0"/>
+          <w:lang w:eastAsia="pt-BR"/>
+          <w14:ligatures w14:val="none"/>
+        </w:rPr>
+      </w:pPr>
+      <w:r>
+        <w:rPr>
+          <w:rFonts w:ascii="Arial" w:eastAsia="Times New Roman" w:hAnsi="Arial" w:cs="Arial"/>
+          <w:kern w:val="0"/>
+          <w:lang w:eastAsia="pt-BR"/>
+          <w14:ligatures w14:val="none"/>
+        </w:rPr>
+        <w:t xml:space="preserve">Ribeiro, A. P., Rezende, B. N., </w:t>
+      </w:r>
+      <w:proofErr w:type="spellStart"/>
+      <w:r>
+        <w:rPr>
+          <w:rFonts w:ascii="Arial" w:eastAsia="Times New Roman" w:hAnsi="Arial" w:cs="Arial"/>
+          <w:kern w:val="0"/>
+          <w:lang w:eastAsia="pt-BR"/>
+          <w14:ligatures w14:val="none"/>
+        </w:rPr>
+        <w:t>Menegali</w:t>
+      </w:r>
+      <w:proofErr w:type="spellEnd"/>
+      <w:r>
+        <w:rPr>
+          <w:rFonts w:ascii="Arial" w:eastAsia="Times New Roman" w:hAnsi="Arial" w:cs="Arial"/>
+          <w:kern w:val="0"/>
+          <w:lang w:eastAsia="pt-BR"/>
+          <w14:ligatures w14:val="none"/>
+        </w:rPr>
+        <w:t>, I., &amp; Pereira, S. (2016</w:t>
+      </w:r>
+      <w:r>
+        <w:rPr>
+          <w:rFonts w:ascii="Arial" w:eastAsia="Times New Roman" w:hAnsi="Arial" w:cs="Arial"/>
+          <w:b/>
+          <w:bCs/>
+          <w:kern w:val="0"/>
+          <w:lang w:eastAsia="pt-BR"/>
+          <w14:ligatures w14:val="none"/>
+        </w:rPr>
+        <w:t>). Avaliação de temperatura e umidade utilizando o sensor DHT22 controlado por Arduino</w:t>
+      </w:r>
+      <w:r>
+        <w:rPr>
+          <w:rFonts w:ascii="Arial" w:eastAsia="Times New Roman" w:hAnsi="Arial" w:cs="Arial"/>
+          <w:kern w:val="0"/>
+          <w:lang w:eastAsia="pt-BR"/>
+          <w14:ligatures w14:val="none"/>
+        </w:rPr>
+        <w:t xml:space="preserve"> (CONTECC’2016).</w:t>
+      </w:r>
+      <w:r>
+        <w:rPr>
+          <w:rFonts w:ascii="Arial" w:eastAsia="Times New Roman" w:hAnsi="Arial" w:cs="Arial"/>
+          <w:kern w:val="0"/>
+          <w:lang w:eastAsia="pt-BR"/>
+          <w14:ligatures w14:val="none"/>
+        </w:rPr>
+        <w:t xml:space="preserve"> Acesso em: 28 dez. 2025.</w:t>
+      </w:r>
+    </w:p>
+    <w:p>
+      <w:pPr>
+        <w:spacing w:before="100" w:beforeAutospacing="1" w:after="100" w:afterAutospacing="1" w:line="240" w:lineRule="auto"/>
+        <w:jc w:val="both"/>
+        <w:rPr>
+          <w:rFonts w:ascii="Arial" w:eastAsia="Times New Roman" w:hAnsi="Arial" w:cs="Arial"/>
+          <w:kern w:val="0"/>
+          <w:lang w:eastAsia="pt-BR"/>
+          <w14:ligatures w14:val="none"/>
+        </w:rPr>
+      </w:pPr>
+      <w:r>
+        <w:rPr>
+          <w:rFonts w:ascii="Arial" w:eastAsia="Times New Roman" w:hAnsi="Arial" w:cs="Arial"/>
+          <w:kern w:val="0"/>
+          <w:lang w:eastAsia="pt-BR"/>
+          <w14:ligatures w14:val="none"/>
+        </w:rPr>
+        <w:t xml:space="preserve">SCIKIT-LEARN. </w:t>
+      </w:r>
+      <w:proofErr w:type="spellStart"/>
+      <w:r>
+        <w:rPr>
+          <w:rFonts w:ascii="Arial" w:eastAsia="Times New Roman" w:hAnsi="Arial" w:cs="Arial"/>
+          <w:b/>
+          <w:bCs/>
+          <w:kern w:val="0"/>
+          <w:lang w:eastAsia="pt-BR"/>
+          <w14:ligatures w14:val="none"/>
+        </w:rPr>
+        <w:t>User</w:t>
+      </w:r>
+      <w:proofErr w:type="spellEnd"/>
+      <w:r>
+        <w:rPr>
+          <w:rFonts w:ascii="Arial" w:eastAsia="Times New Roman" w:hAnsi="Arial" w:cs="Arial"/>
+          <w:b/>
+          <w:bCs/>
+          <w:kern w:val="0"/>
+          <w:lang w:eastAsia="pt-BR"/>
+          <w14:ligatures w14:val="none"/>
+        </w:rPr>
+        <w:t xml:space="preserve"> </w:t>
+      </w:r>
+      <w:proofErr w:type="spellStart"/>
+      <w:r>
+        <w:rPr>
+          <w:rFonts w:ascii="Arial" w:eastAsia="Times New Roman" w:hAnsi="Arial" w:cs="Arial"/>
+          <w:b/>
+          <w:bCs/>
+          <w:kern w:val="0"/>
+          <w:lang w:eastAsia="pt-BR"/>
+          <w14:ligatures w14:val="none"/>
+        </w:rPr>
+        <w:t>Guide</w:t>
+      </w:r>
+      <w:proofErr w:type="spellEnd"/>
+      <w:r>
+        <w:rPr>
+          <w:rFonts w:ascii="Arial" w:eastAsia="Times New Roman" w:hAnsi="Arial" w:cs="Arial"/>
+          <w:b/>
+          <w:bCs/>
+          <w:kern w:val="0"/>
+          <w:lang w:eastAsia="pt-BR"/>
+          <w14:ligatures w14:val="none"/>
+        </w:rPr>
+        <w:t xml:space="preserve"> </w:t>
+      </w:r>
+      <w:proofErr w:type="spellStart"/>
+      <w:r>
+        <w:rPr>
+          <w:rFonts w:ascii="Arial" w:eastAsia="Times New Roman" w:hAnsi="Arial" w:cs="Arial"/>
+          <w:b/>
+          <w:bCs/>
+          <w:kern w:val="0"/>
+          <w:lang w:eastAsia="pt-BR"/>
+          <w14:ligatures w14:val="none"/>
+        </w:rPr>
+        <w:t>and</w:t>
+      </w:r>
+      <w:proofErr w:type="spellEnd"/>
+      <w:r>
+        <w:rPr>
+          <w:rFonts w:ascii="Arial" w:eastAsia="Times New Roman" w:hAnsi="Arial" w:cs="Arial"/>
+          <w:b/>
+          <w:bCs/>
+          <w:kern w:val="0"/>
+          <w:lang w:eastAsia="pt-BR"/>
+          <w14:ligatures w14:val="none"/>
+        </w:rPr>
+        <w:t xml:space="preserve"> API </w:t>
+      </w:r>
+      <w:proofErr w:type="spellStart"/>
+      <w:r>
+        <w:rPr>
+          <w:rFonts w:ascii="Arial" w:eastAsia="Times New Roman" w:hAnsi="Arial" w:cs="Arial"/>
+          <w:b/>
+          <w:bCs/>
+          <w:kern w:val="0"/>
+          <w:lang w:eastAsia="pt-BR"/>
+          <w14:ligatures w14:val="none"/>
+        </w:rPr>
+        <w:t>Reference</w:t>
+      </w:r>
+      <w:proofErr w:type="spellEnd"/>
+      <w:r>
+        <w:rPr>
+          <w:rFonts w:ascii="Arial" w:eastAsia="Times New Roman" w:hAnsi="Arial" w:cs="Arial"/>
+          <w:kern w:val="0"/>
+          <w:lang w:eastAsia="pt-BR"/>
+          <w14:ligatures w14:val="none"/>
+        </w:rPr>
+        <w:t xml:space="preserve">. Disponível em: </w:t>
+      </w:r>
+      <w:hyperlink r:id="rId10" w:tgtFrame="_new" w:history="1">
         <w:r>
           <w:rPr>
             <w:rFonts w:ascii="Arial" w:eastAsia="Times New Roman" w:hAnsi="Arial" w:cs="Arial"/>
-            <w:color w:val="0000FF"/>
+            <w:color w:val="000000" w:themeColor="text1"/>
             <w:kern w:val="0"/>
             <w:u w:val="single"/>
             <w:lang w:eastAsia="pt-BR"/>
             <w14:ligatures w14:val="none"/>
           </w:rPr>
-          <w:t>https://docs.arduino.cc/</w:t>
+          <w:t>https</w:t>
         </w:r>
-      </w:hyperlink>
-      <w:r>
-        <w:rPr>
-          <w:rFonts w:ascii="Arial" w:eastAsia="Times New Roman" w:hAnsi="Arial" w:cs="Arial"/>
-          <w:kern w:val="0"/>
-          <w:lang w:eastAsia="pt-BR"/>
-          <w14:ligatures w14:val="none"/>
-        </w:rPr>
-        <w:t>. Acesso em: 10 fev. 2026.</w:t>
-      </w:r>
-    </w:p>
-    <w:p>
-      <w:pPr>
-        <w:spacing w:before="100" w:beforeAutospacing="1" w:after="100" w:afterAutospacing="1" w:line="240" w:lineRule="auto"/>
-        <w:rPr>
-          <w:rFonts w:ascii="Arial" w:eastAsia="Times New Roman" w:hAnsi="Arial" w:cs="Arial"/>
-          <w:kern w:val="0"/>
-          <w:lang w:eastAsia="pt-BR"/>
-          <w14:ligatures w14:val="none"/>
-        </w:rPr>
-      </w:pPr>
-      <w:r>
-        <w:rPr>
-          <w:rFonts w:ascii="Arial" w:eastAsia="Times New Roman" w:hAnsi="Arial" w:cs="Arial"/>
-          <w:kern w:val="0"/>
-          <w:lang w:eastAsia="pt-BR"/>
-          <w14:ligatures w14:val="none"/>
-        </w:rPr>
-        <w:t xml:space="preserve">GOLDSCHMIDT, Roberto; PASSOS, Eduardo. </w:t>
-      </w:r>
-      <w:r>
-        <w:rPr>
-          <w:rFonts w:ascii="Arial" w:eastAsia="Times New Roman" w:hAnsi="Arial" w:cs="Arial"/>
-          <w:b/>
-          <w:bCs/>
-          <w:kern w:val="0"/>
-          <w:lang w:eastAsia="pt-BR"/>
-          <w14:ligatures w14:val="none"/>
-        </w:rPr>
-        <w:t>Sistemas Embarcados: hardware, software e aplicações</w:t>
-      </w:r>
-      <w:r>
-        <w:rPr>
-          <w:rFonts w:ascii="Arial" w:eastAsia="Times New Roman" w:hAnsi="Arial" w:cs="Arial"/>
-          <w:kern w:val="0"/>
-          <w:lang w:eastAsia="pt-BR"/>
-          <w14:ligatures w14:val="none"/>
-        </w:rPr>
-        <w:t>. São Paulo: Editora Érica, 2013.</w:t>
-      </w:r>
-    </w:p>
-    <w:p>
-      <w:pPr>
-        <w:spacing w:before="100" w:beforeAutospacing="1" w:after="100" w:afterAutospacing="1" w:line="240" w:lineRule="auto"/>
-        <w:rPr>
-          <w:rFonts w:ascii="Arial" w:eastAsia="Times New Roman" w:hAnsi="Arial" w:cs="Arial"/>
-          <w:kern w:val="0"/>
-          <w:lang w:eastAsia="pt-BR"/>
-          <w14:ligatures w14:val="none"/>
-        </w:rPr>
-      </w:pPr>
-      <w:r>
-        <w:rPr>
-          <w:rFonts w:ascii="Arial" w:eastAsia="Times New Roman" w:hAnsi="Arial" w:cs="Arial"/>
-          <w:kern w:val="0"/>
-          <w:lang w:eastAsia="pt-BR"/>
-          <w14:ligatures w14:val="none"/>
-        </w:rPr>
-        <w:t xml:space="preserve">HAYKIN, Simon. </w:t>
-      </w:r>
-      <w:r>
-        <w:rPr>
-          <w:rFonts w:ascii="Arial" w:eastAsia="Times New Roman" w:hAnsi="Arial" w:cs="Arial"/>
-          <w:b/>
-          <w:bCs/>
-          <w:kern w:val="0"/>
-          <w:lang w:eastAsia="pt-BR"/>
-          <w14:ligatures w14:val="none"/>
-        </w:rPr>
-        <w:t xml:space="preserve">Neural Networks </w:t>
-      </w:r>
-      <w:proofErr w:type="spellStart"/>
-      <w:r>
-        <w:rPr>
-          <w:rFonts w:ascii="Arial" w:eastAsia="Times New Roman" w:hAnsi="Arial" w:cs="Arial"/>
-          <w:b/>
-          <w:bCs/>
-          <w:kern w:val="0"/>
-          <w:lang w:eastAsia="pt-BR"/>
-          <w14:ligatures w14:val="none"/>
-        </w:rPr>
-        <w:t>and</w:t>
-      </w:r>
-      <w:proofErr w:type="spellEnd"/>
-      <w:r>
-        <w:rPr>
-          <w:rFonts w:ascii="Arial" w:eastAsia="Times New Roman" w:hAnsi="Arial" w:cs="Arial"/>
-          <w:b/>
-          <w:bCs/>
-          <w:kern w:val="0"/>
-          <w:lang w:eastAsia="pt-BR"/>
-          <w14:ligatures w14:val="none"/>
-        </w:rPr>
-        <w:t xml:space="preserve"> Learning </w:t>
-      </w:r>
-      <w:proofErr w:type="spellStart"/>
-      <w:r>
-        <w:rPr>
-          <w:rFonts w:ascii="Arial" w:eastAsia="Times New Roman" w:hAnsi="Arial" w:cs="Arial"/>
-          <w:b/>
-          <w:bCs/>
-          <w:kern w:val="0"/>
-          <w:lang w:eastAsia="pt-BR"/>
-          <w14:ligatures w14:val="none"/>
-        </w:rPr>
-        <w:t>Machines</w:t>
-      </w:r>
-      <w:proofErr w:type="spellEnd"/>
-      <w:r>
-        <w:rPr>
-          <w:rFonts w:ascii="Arial" w:eastAsia="Times New Roman" w:hAnsi="Arial" w:cs="Arial"/>
-          <w:kern w:val="0"/>
-          <w:lang w:eastAsia="pt-BR"/>
-          <w14:ligatures w14:val="none"/>
-        </w:rPr>
-        <w:t>. 3. ed. New Jersey: Pearson, 2009.</w:t>
-      </w:r>
-    </w:p>
-    <w:p>
-      <w:pPr>
-        <w:spacing w:before="100" w:beforeAutospacing="1" w:after="100" w:afterAutospacing="1" w:line="240" w:lineRule="auto"/>
-        <w:rPr>
-          <w:rFonts w:ascii="Arial" w:eastAsia="Times New Roman" w:hAnsi="Arial" w:cs="Arial"/>
-          <w:kern w:val="0"/>
-          <w:lang w:eastAsia="pt-BR"/>
-          <w14:ligatures w14:val="none"/>
-        </w:rPr>
-      </w:pPr>
-      <w:r>
-        <w:rPr>
-          <w:rFonts w:ascii="Arial" w:eastAsia="Times New Roman" w:hAnsi="Arial" w:cs="Arial"/>
-          <w:kern w:val="0"/>
-          <w:lang w:eastAsia="pt-BR"/>
-          <w14:ligatures w14:val="none"/>
-        </w:rPr>
-        <w:t xml:space="preserve">JAIN, Anil; MURTY, </w:t>
-      </w:r>
-      <w:proofErr w:type="spellStart"/>
-      <w:r>
-        <w:rPr>
-          <w:rFonts w:ascii="Arial" w:eastAsia="Times New Roman" w:hAnsi="Arial" w:cs="Arial"/>
-          <w:kern w:val="0"/>
-          <w:lang w:eastAsia="pt-BR"/>
-          <w14:ligatures w14:val="none"/>
-        </w:rPr>
-        <w:t>Narasimha</w:t>
-      </w:r>
-      <w:proofErr w:type="spellEnd"/>
-      <w:r>
-        <w:rPr>
-          <w:rFonts w:ascii="Arial" w:eastAsia="Times New Roman" w:hAnsi="Arial" w:cs="Arial"/>
-          <w:kern w:val="0"/>
-          <w:lang w:eastAsia="pt-BR"/>
-          <w14:ligatures w14:val="none"/>
-        </w:rPr>
-        <w:t xml:space="preserve">; FLYNN, Patrick. Data </w:t>
-      </w:r>
-      <w:proofErr w:type="spellStart"/>
-      <w:r>
-        <w:rPr>
-          <w:rFonts w:ascii="Arial" w:eastAsia="Times New Roman" w:hAnsi="Arial" w:cs="Arial"/>
-          <w:kern w:val="0"/>
-          <w:lang w:eastAsia="pt-BR"/>
-          <w14:ligatures w14:val="none"/>
-        </w:rPr>
-        <w:t>clustering</w:t>
-      </w:r>
-      <w:proofErr w:type="spellEnd"/>
-      <w:r>
-        <w:rPr>
-          <w:rFonts w:ascii="Arial" w:eastAsia="Times New Roman" w:hAnsi="Arial" w:cs="Arial"/>
-          <w:kern w:val="0"/>
-          <w:lang w:eastAsia="pt-BR"/>
-          <w14:ligatures w14:val="none"/>
-        </w:rPr>
-        <w:t xml:space="preserve">: a review. </w:t>
-      </w:r>
-      <w:r>
-        <w:rPr>
-          <w:rFonts w:ascii="Arial" w:eastAsia="Times New Roman" w:hAnsi="Arial" w:cs="Arial"/>
-          <w:i/>
-          <w:iCs/>
-          <w:kern w:val="0"/>
-          <w:lang w:eastAsia="pt-BR"/>
-          <w14:ligatures w14:val="none"/>
-        </w:rPr>
-        <w:t xml:space="preserve">ACM </w:t>
-      </w:r>
-      <w:proofErr w:type="spellStart"/>
-      <w:r>
-        <w:rPr>
-          <w:rFonts w:ascii="Arial" w:eastAsia="Times New Roman" w:hAnsi="Arial" w:cs="Arial"/>
-          <w:i/>
-          <w:iCs/>
-          <w:kern w:val="0"/>
-          <w:lang w:eastAsia="pt-BR"/>
-          <w14:ligatures w14:val="none"/>
-        </w:rPr>
-        <w:t>Computing</w:t>
-      </w:r>
-      <w:proofErr w:type="spellEnd"/>
-      <w:r>
-        <w:rPr>
-          <w:rFonts w:ascii="Arial" w:eastAsia="Times New Roman" w:hAnsi="Arial" w:cs="Arial"/>
-          <w:i/>
-          <w:iCs/>
-          <w:kern w:val="0"/>
-          <w:lang w:eastAsia="pt-BR"/>
-          <w14:ligatures w14:val="none"/>
-        </w:rPr>
-        <w:t xml:space="preserve"> </w:t>
-      </w:r>
-      <w:proofErr w:type="spellStart"/>
-      <w:r>
-        <w:rPr>
-          <w:rFonts w:ascii="Arial" w:eastAsia="Times New Roman" w:hAnsi="Arial" w:cs="Arial"/>
-          <w:i/>
-          <w:iCs/>
-          <w:kern w:val="0"/>
-          <w:lang w:eastAsia="pt-BR"/>
-          <w14:ligatures w14:val="none"/>
-        </w:rPr>
-        <w:t>Surveys</w:t>
-      </w:r>
-      <w:proofErr w:type="spellEnd"/>
-      <w:r>
-        <w:rPr>
-          <w:rFonts w:ascii="Arial" w:eastAsia="Times New Roman" w:hAnsi="Arial" w:cs="Arial"/>
-          <w:kern w:val="0"/>
-          <w:lang w:eastAsia="pt-BR"/>
-          <w14:ligatures w14:val="none"/>
-        </w:rPr>
-        <w:t>, v. 31, n. 3, p. 264–323, 1999.</w:t>
-      </w:r>
-    </w:p>
-    <w:p>
-      <w:pPr>
-        <w:spacing w:before="100" w:beforeAutospacing="1" w:after="100" w:afterAutospacing="1" w:line="240" w:lineRule="auto"/>
-        <w:rPr>
-          <w:rFonts w:ascii="Arial" w:eastAsia="Times New Roman" w:hAnsi="Arial" w:cs="Arial"/>
-          <w:kern w:val="0"/>
-          <w:lang w:eastAsia="pt-BR"/>
-          <w14:ligatures w14:val="none"/>
-        </w:rPr>
-      </w:pPr>
-      <w:r>
-        <w:rPr>
-          <w:rFonts w:ascii="Arial" w:eastAsia="Times New Roman" w:hAnsi="Arial" w:cs="Arial"/>
-          <w:kern w:val="0"/>
-          <w:lang w:eastAsia="pt-BR"/>
-          <w14:ligatures w14:val="none"/>
-        </w:rPr>
-        <w:t xml:space="preserve">MQ GAS SENSORS. </w:t>
-      </w:r>
-      <w:r>
-        <w:rPr>
-          <w:rFonts w:ascii="Arial" w:eastAsia="Times New Roman" w:hAnsi="Arial" w:cs="Arial"/>
-          <w:b/>
-          <w:bCs/>
-          <w:kern w:val="0"/>
-          <w:lang w:eastAsia="pt-BR"/>
-          <w14:ligatures w14:val="none"/>
-        </w:rPr>
-        <w:t xml:space="preserve">Datasheets MQ2 </w:t>
-      </w:r>
-      <w:proofErr w:type="spellStart"/>
-      <w:r>
-        <w:rPr>
-          <w:rFonts w:ascii="Arial" w:eastAsia="Times New Roman" w:hAnsi="Arial" w:cs="Arial"/>
-          <w:b/>
-          <w:bCs/>
-          <w:kern w:val="0"/>
-          <w:lang w:eastAsia="pt-BR"/>
-          <w14:ligatures w14:val="none"/>
-        </w:rPr>
-        <w:t>and</w:t>
-      </w:r>
-      <w:proofErr w:type="spellEnd"/>
-      <w:r>
-        <w:rPr>
-          <w:rFonts w:ascii="Arial" w:eastAsia="Times New Roman" w:hAnsi="Arial" w:cs="Arial"/>
-          <w:b/>
-          <w:bCs/>
-          <w:kern w:val="0"/>
-          <w:lang w:eastAsia="pt-BR"/>
-          <w14:ligatures w14:val="none"/>
-        </w:rPr>
-        <w:t xml:space="preserve"> MQ7</w:t>
-      </w:r>
-      <w:r>
-        <w:rPr>
-          <w:rFonts w:ascii="Arial" w:eastAsia="Times New Roman" w:hAnsi="Arial" w:cs="Arial"/>
-          <w:kern w:val="0"/>
-          <w:lang w:eastAsia="pt-BR"/>
-          <w14:ligatures w14:val="none"/>
-        </w:rPr>
-        <w:t xml:space="preserve">. Henan </w:t>
-      </w:r>
-      <w:proofErr w:type="spellStart"/>
-      <w:r>
-        <w:rPr>
-          <w:rFonts w:ascii="Arial" w:eastAsia="Times New Roman" w:hAnsi="Arial" w:cs="Arial"/>
-          <w:kern w:val="0"/>
-          <w:lang w:eastAsia="pt-BR"/>
-          <w14:ligatures w14:val="none"/>
-        </w:rPr>
-        <w:t>Hanwei</w:t>
-      </w:r>
-      <w:proofErr w:type="spellEnd"/>
-      <w:r>
-        <w:rPr>
-          <w:rFonts w:ascii="Arial" w:eastAsia="Times New Roman" w:hAnsi="Arial" w:cs="Arial"/>
-          <w:kern w:val="0"/>
-          <w:lang w:eastAsia="pt-BR"/>
-          <w14:ligatures w14:val="none"/>
-        </w:rPr>
-        <w:t xml:space="preserve"> </w:t>
-      </w:r>
-      <w:proofErr w:type="spellStart"/>
-      <w:r>
-        <w:rPr>
-          <w:rFonts w:ascii="Arial" w:eastAsia="Times New Roman" w:hAnsi="Arial" w:cs="Arial"/>
-          <w:kern w:val="0"/>
-          <w:lang w:eastAsia="pt-BR"/>
-          <w14:ligatures w14:val="none"/>
-        </w:rPr>
-        <w:t>Electronics</w:t>
-      </w:r>
-      <w:proofErr w:type="spellEnd"/>
-      <w:r>
-        <w:rPr>
-          <w:rFonts w:ascii="Arial" w:eastAsia="Times New Roman" w:hAnsi="Arial" w:cs="Arial"/>
-          <w:kern w:val="0"/>
-          <w:lang w:eastAsia="pt-BR"/>
-          <w14:ligatures w14:val="none"/>
-        </w:rPr>
-        <w:t xml:space="preserve"> Co. Ltd. Disponível em: </w:t>
-      </w:r>
-      <w:hyperlink r:id="rId9" w:tgtFrame="_new" w:history="1">
         <w:r>
           <w:rPr>
             <w:rFonts w:ascii="Arial" w:eastAsia="Times New Roman" w:hAnsi="Arial" w:cs="Arial"/>
-            <w:color w:val="0000FF"/>
+            <w:color w:val="000000" w:themeColor="text1"/>
             <w:kern w:val="0"/>
             <w:u w:val="single"/>
             <w:lang w:eastAsia="pt-BR"/>
             <w14:ligatures w14:val="none"/>
           </w:rPr>
-          <w:t>https://www.hwsensor.com/</w:t>
+          <w:t>://scikit-learn.org/</w:t>
         </w:r>
       </w:hyperlink>
       <w:r>
         <w:rPr>
           <w:rFonts w:ascii="Arial" w:eastAsia="Times New Roman" w:hAnsi="Arial" w:cs="Arial"/>
-          <w:kern w:val="0"/>
-          <w:lang w:eastAsia="pt-BR"/>
-          <w14:ligatures w14:val="none"/>
-        </w:rPr>
-        <w:t>. Acesso em: 10 fev. 2026.</w:t>
-      </w:r>
-    </w:p>
-    <w:p>
-      <w:pPr>
-        <w:spacing w:before="100" w:beforeAutospacing="1" w:after="100" w:afterAutospacing="1" w:line="240" w:lineRule="auto"/>
-        <w:rPr>
-          <w:rFonts w:ascii="Arial" w:eastAsia="Times New Roman" w:hAnsi="Arial" w:cs="Arial"/>
-          <w:kern w:val="0"/>
-          <w:lang w:eastAsia="pt-BR"/>
-          <w14:ligatures w14:val="none"/>
-        </w:rPr>
-      </w:pPr>
-      <w:r>
-        <w:rPr>
-          <w:rFonts w:ascii="Arial" w:eastAsia="Times New Roman" w:hAnsi="Arial" w:cs="Arial"/>
-          <w:kern w:val="0"/>
-          <w:lang w:eastAsia="pt-BR"/>
-          <w14:ligatures w14:val="none"/>
-        </w:rPr>
-        <w:t xml:space="preserve">PYTHON SOFTWARE FOUNDATION. </w:t>
+          <w:color w:val="000000" w:themeColor="text1"/>
+          <w:kern w:val="0"/>
+          <w:lang w:eastAsia="pt-BR"/>
+          <w14:ligatures w14:val="none"/>
+        </w:rPr>
+        <w:t xml:space="preserve">. </w:t>
+      </w:r>
+      <w:r>
+        <w:rPr>
+          <w:rFonts w:ascii="Arial" w:eastAsia="Times New Roman" w:hAnsi="Arial" w:cs="Arial"/>
+          <w:kern w:val="0"/>
+          <w:lang w:eastAsia="pt-BR"/>
+          <w14:ligatures w14:val="none"/>
+        </w:rPr>
+        <w:t xml:space="preserve">Acesso em: </w:t>
+      </w:r>
+      <w:r>
+        <w:rPr>
+          <w:rFonts w:ascii="Arial" w:eastAsia="Times New Roman" w:hAnsi="Arial" w:cs="Arial"/>
+          <w:kern w:val="0"/>
+          <w:lang w:eastAsia="pt-BR"/>
+          <w14:ligatures w14:val="none"/>
+        </w:rPr>
+        <w:t>05</w:t>
+      </w:r>
+      <w:r>
+        <w:rPr>
+          <w:rFonts w:ascii="Arial" w:eastAsia="Times New Roman" w:hAnsi="Arial" w:cs="Arial"/>
+          <w:kern w:val="0"/>
+          <w:lang w:eastAsia="pt-BR"/>
+          <w14:ligatures w14:val="none"/>
+        </w:rPr>
+        <w:t xml:space="preserve"> </w:t>
+      </w:r>
+      <w:r>
+        <w:rPr>
+          <w:rFonts w:ascii="Arial" w:eastAsia="Times New Roman" w:hAnsi="Arial" w:cs="Arial"/>
+          <w:kern w:val="0"/>
+          <w:lang w:eastAsia="pt-BR"/>
+          <w14:ligatures w14:val="none"/>
+        </w:rPr>
+        <w:t>jan</w:t>
+      </w:r>
+      <w:r>
+        <w:rPr>
+          <w:rFonts w:ascii="Arial" w:eastAsia="Times New Roman" w:hAnsi="Arial" w:cs="Arial"/>
+          <w:kern w:val="0"/>
+          <w:lang w:eastAsia="pt-BR"/>
+          <w14:ligatures w14:val="none"/>
+        </w:rPr>
+        <w:t>. 2026.</w:t>
+      </w:r>
+    </w:p>
+    <w:p>
+      <w:pPr>
+        <w:spacing w:before="100" w:beforeAutospacing="1" w:after="100" w:afterAutospacing="1" w:line="240" w:lineRule="auto"/>
+        <w:jc w:val="both"/>
+        <w:rPr>
+          <w:rFonts w:ascii="Arial" w:eastAsia="Times New Roman" w:hAnsi="Arial" w:cs="Arial"/>
+          <w:kern w:val="0"/>
+          <w:lang w:eastAsia="pt-BR"/>
+          <w14:ligatures w14:val="none"/>
+        </w:rPr>
+      </w:pPr>
+      <w:proofErr w:type="spellStart"/>
+      <w:r>
+        <w:rPr>
+          <w:rFonts w:ascii="Arial" w:eastAsia="Times New Roman" w:hAnsi="Arial" w:cs="Arial"/>
+          <w:kern w:val="0"/>
+          <w:lang w:eastAsia="pt-BR"/>
+          <w14:ligatures w14:val="none"/>
+        </w:rPr>
+        <w:t>Strelow</w:t>
+      </w:r>
+      <w:proofErr w:type="spellEnd"/>
+      <w:r>
+        <w:rPr>
+          <w:rFonts w:ascii="Arial" w:eastAsia="Times New Roman" w:hAnsi="Arial" w:cs="Arial"/>
+          <w:kern w:val="0"/>
+          <w:lang w:eastAsia="pt-BR"/>
+          <w14:ligatures w14:val="none"/>
+        </w:rPr>
+        <w:t xml:space="preserve">, F. H., &amp; Mendes, R. S. (2015). </w:t>
       </w:r>
       <w:r>
         <w:rPr>
@@ -9120,174 +9565,70 @@
           <w:lang w:eastAsia="pt-BR"/>
           <w14:ligatures w14:val="none"/>
         </w:rPr>
-        <w:t xml:space="preserve">Python </w:t>
-      </w:r>
-      <w:proofErr w:type="spellStart"/>
-      <w:r>
-        <w:rPr>
-          <w:rFonts w:ascii="Arial" w:eastAsia="Times New Roman" w:hAnsi="Arial" w:cs="Arial"/>
-          <w:b/>
-          <w:bCs/>
-          <w:kern w:val="0"/>
-          <w:lang w:eastAsia="pt-BR"/>
-          <w14:ligatures w14:val="none"/>
-        </w:rPr>
-        <w:t>Documentation</w:t>
-      </w:r>
-      <w:proofErr w:type="spellEnd"/>
-      <w:r>
-        <w:rPr>
-          <w:rFonts w:ascii="Arial" w:eastAsia="Times New Roman" w:hAnsi="Arial" w:cs="Arial"/>
-          <w:kern w:val="0"/>
-          <w:lang w:eastAsia="pt-BR"/>
-          <w14:ligatures w14:val="none"/>
-        </w:rPr>
-        <w:t xml:space="preserve">. Disponível em: </w:t>
-      </w:r>
-      <w:hyperlink r:id="rId10" w:tgtFrame="_new" w:history="1">
-        <w:r>
-          <w:rPr>
-            <w:rFonts w:ascii="Arial" w:eastAsia="Times New Roman" w:hAnsi="Arial" w:cs="Arial"/>
-            <w:color w:val="0000FF"/>
-            <w:kern w:val="0"/>
-            <w:u w:val="single"/>
-            <w:lang w:eastAsia="pt-BR"/>
-            <w14:ligatures w14:val="none"/>
-          </w:rPr>
-          <w:t>https://docs.python.org/</w:t>
-        </w:r>
-      </w:hyperlink>
-      <w:r>
-        <w:rPr>
-          <w:rFonts w:ascii="Arial" w:eastAsia="Times New Roman" w:hAnsi="Arial" w:cs="Arial"/>
-          <w:kern w:val="0"/>
-          <w:lang w:eastAsia="pt-BR"/>
-          <w14:ligatures w14:val="none"/>
-        </w:rPr>
-        <w:t>. Acesso em: 10 fev. 2026.</w:t>
-      </w:r>
-    </w:p>
-    <w:p>
-      <w:pPr>
-        <w:spacing w:before="100" w:beforeAutospacing="1" w:after="100" w:afterAutospacing="1" w:line="240" w:lineRule="auto"/>
-        <w:rPr>
-          <w:rFonts w:ascii="Arial" w:eastAsia="Times New Roman" w:hAnsi="Arial" w:cs="Arial"/>
-          <w:kern w:val="0"/>
-          <w:lang w:eastAsia="pt-BR"/>
-          <w14:ligatures w14:val="none"/>
-        </w:rPr>
-      </w:pPr>
-      <w:r>
-        <w:rPr>
-          <w:rFonts w:ascii="Arial" w:eastAsia="Times New Roman" w:hAnsi="Arial" w:cs="Arial"/>
-          <w:kern w:val="0"/>
-          <w:lang w:eastAsia="pt-BR"/>
-          <w14:ligatures w14:val="none"/>
-        </w:rPr>
-        <w:t xml:space="preserve">SCIKIT-LEARN. </w:t>
-      </w:r>
-      <w:r>
-        <w:rPr>
-          <w:rFonts w:ascii="Arial" w:eastAsia="Times New Roman" w:hAnsi="Arial" w:cs="Arial"/>
-          <w:b/>
-          <w:bCs/>
-          <w:kern w:val="0"/>
-          <w:lang w:eastAsia="pt-BR"/>
-          <w14:ligatures w14:val="none"/>
-        </w:rPr>
-        <w:t xml:space="preserve">User </w:t>
-      </w:r>
-      <w:proofErr w:type="spellStart"/>
-      <w:r>
-        <w:rPr>
-          <w:rFonts w:ascii="Arial" w:eastAsia="Times New Roman" w:hAnsi="Arial" w:cs="Arial"/>
-          <w:b/>
-          <w:bCs/>
-          <w:kern w:val="0"/>
-          <w:lang w:eastAsia="pt-BR"/>
-          <w14:ligatures w14:val="none"/>
-        </w:rPr>
-        <w:t>Guide</w:t>
-      </w:r>
-      <w:proofErr w:type="spellEnd"/>
-      <w:r>
-        <w:rPr>
-          <w:rFonts w:ascii="Arial" w:eastAsia="Times New Roman" w:hAnsi="Arial" w:cs="Arial"/>
-          <w:b/>
-          <w:bCs/>
+        <w:t>Monitoramento de gases por meio de rede de sensores controlados com Arduino</w:t>
+      </w:r>
+      <w:r>
+        <w:rPr>
+          <w:rFonts w:ascii="Arial" w:eastAsia="Times New Roman" w:hAnsi="Arial" w:cs="Arial"/>
           <w:kern w:val="0"/>
           <w:lang w:eastAsia="pt-BR"/>
           <w14:ligatures w14:val="none"/>
         </w:rPr>
         <w:t xml:space="preserve"> </w:t>
       </w:r>
-      <w:proofErr w:type="spellStart"/>
-      <w:r>
-        <w:rPr>
-          <w:rFonts w:ascii="Arial" w:eastAsia="Times New Roman" w:hAnsi="Arial" w:cs="Arial"/>
-          <w:b/>
-          <w:bCs/>
-          <w:kern w:val="0"/>
-          <w:lang w:eastAsia="pt-BR"/>
-          <w14:ligatures w14:val="none"/>
-        </w:rPr>
-        <w:t>and</w:t>
-      </w:r>
-      <w:proofErr w:type="spellEnd"/>
-      <w:r>
-        <w:rPr>
-          <w:rFonts w:ascii="Arial" w:eastAsia="Times New Roman" w:hAnsi="Arial" w:cs="Arial"/>
-          <w:b/>
-          <w:bCs/>
-          <w:kern w:val="0"/>
-          <w:lang w:eastAsia="pt-BR"/>
-          <w14:ligatures w14:val="none"/>
-        </w:rPr>
-        <w:t xml:space="preserve"> API </w:t>
-      </w:r>
-      <w:proofErr w:type="spellStart"/>
-      <w:r>
-        <w:rPr>
-          <w:rFonts w:ascii="Arial" w:eastAsia="Times New Roman" w:hAnsi="Arial" w:cs="Arial"/>
-          <w:b/>
-          <w:bCs/>
-          <w:kern w:val="0"/>
-          <w:lang w:eastAsia="pt-BR"/>
-          <w14:ligatures w14:val="none"/>
-        </w:rPr>
-        <w:t>Reference</w:t>
-      </w:r>
-      <w:proofErr w:type="spellEnd"/>
-      <w:r>
-        <w:rPr>
-          <w:rFonts w:ascii="Arial" w:eastAsia="Times New Roman" w:hAnsi="Arial" w:cs="Arial"/>
-          <w:kern w:val="0"/>
-          <w:lang w:eastAsia="pt-BR"/>
-          <w14:ligatures w14:val="none"/>
-        </w:rPr>
-        <w:t xml:space="preserve">. Disponível em: </w:t>
-      </w:r>
-      <w:hyperlink r:id="rId11" w:tgtFrame="_new" w:history="1">
-        <w:r>
-          <w:rPr>
-            <w:rFonts w:ascii="Arial" w:eastAsia="Times New Roman" w:hAnsi="Arial" w:cs="Arial"/>
-            <w:color w:val="0000FF"/>
-            <w:kern w:val="0"/>
-            <w:u w:val="single"/>
-            <w:lang w:eastAsia="pt-BR"/>
-            <w14:ligatures w14:val="none"/>
-          </w:rPr>
-          <w:t>https://scikit-learn.org/</w:t>
-        </w:r>
-      </w:hyperlink>
-      <w:r>
-        <w:rPr>
-          <w:rFonts w:ascii="Arial" w:eastAsia="Times New Roman" w:hAnsi="Arial" w:cs="Arial"/>
-          <w:kern w:val="0"/>
-          <w:lang w:eastAsia="pt-BR"/>
-          <w14:ligatures w14:val="none"/>
-        </w:rPr>
-        <w:t>. Acesso em: 10 fev. 2026.</w:t>
+      <w:r>
+        <w:rPr>
+          <w:rFonts w:ascii="Arial" w:eastAsia="Times New Roman" w:hAnsi="Arial" w:cs="Arial"/>
+          <w:kern w:val="0"/>
+          <w:lang w:eastAsia="pt-BR"/>
+          <w14:ligatures w14:val="none"/>
+        </w:rPr>
+        <w:t>(</w:t>
+      </w:r>
+      <w:r>
+        <w:rPr>
+          <w:rFonts w:ascii="Arial" w:eastAsia="Times New Roman" w:hAnsi="Arial" w:cs="Arial"/>
+          <w:kern w:val="0"/>
+          <w:lang w:eastAsia="pt-BR"/>
+          <w14:ligatures w14:val="none"/>
+        </w:rPr>
+        <w:t>Universidade Tecnológica Federal do Paraná</w:t>
+      </w:r>
+      <w:r>
+        <w:rPr>
+          <w:rFonts w:ascii="Arial" w:eastAsia="Times New Roman" w:hAnsi="Arial" w:cs="Arial"/>
+          <w:kern w:val="0"/>
+          <w:lang w:eastAsia="pt-BR"/>
+          <w14:ligatures w14:val="none"/>
+        </w:rPr>
+        <w:t>)</w:t>
+      </w:r>
+      <w:r>
+        <w:rPr>
+          <w:rFonts w:ascii="Arial" w:eastAsia="Times New Roman" w:hAnsi="Arial" w:cs="Arial"/>
+          <w:kern w:val="0"/>
+          <w:lang w:eastAsia="pt-BR"/>
+          <w14:ligatures w14:val="none"/>
+        </w:rPr>
+        <w:t>. Medianeira.</w:t>
+      </w:r>
+      <w:r>
+        <w:rPr>
+          <w:rFonts w:ascii="Arial" w:eastAsia="Times New Roman" w:hAnsi="Arial" w:cs="Arial"/>
+          <w:kern w:val="0"/>
+          <w:lang w:eastAsia="pt-BR"/>
+          <w14:ligatures w14:val="none"/>
+        </w:rPr>
+        <w:t xml:space="preserve"> A</w:t>
+      </w:r>
+      <w:r>
+        <w:rPr>
+          <w:rFonts w:ascii="Arial" w:eastAsia="Times New Roman" w:hAnsi="Arial" w:cs="Arial"/>
+          <w:kern w:val="0"/>
+          <w:lang w:eastAsia="pt-BR"/>
+          <w14:ligatures w14:val="none"/>
+        </w:rPr>
+        <w:t>cesso em: 18 jan. 2025.</w:t>
       </w:r>
     </w:p>
     <w:p>
@@ -9298,7 +9639,7 @@
       </w:pPr>
     </w:p>
     <w:sectPr>
-      <w:headerReference w:type="default" r:id="rId12"/>
+      <w:headerReference w:type="default" r:id="rId11"/>
       <w:pgSz w:w="11906" w:h="16838"/>
       <w:pgMar w:top="1417" w:right="1701" w:bottom="1417" w:left="1701" w:header="454" w:footer="708" w:gutter="0"/>
       <w:cols w:space="708"/>
@@ -9309,7 +9650,7 @@
 </file>
 
 <file path=word/endnotes.xml><?xml version="1.0" encoding="utf-8"?>
-<w:endnotes xmlns:wpc="http://schemas.microsoft.com/office/word/2010/wordprocessingCanvas" xmlns:cx="http://schemas.microsoft.com/office/drawing/2014/chartex" xmlns:cx1="http://schemas.microsoft.com/office/drawing/2015/9/8/chartex" xmlns:cx2="http://schemas.microsoft.com/office/drawing/2015/10/21/chartex" xmlns:cx3="http://schemas.microsoft.com/office/drawing/2016/5/9/chartex" xmlns:cx4="http://schemas.microsoft.com/office/drawing/2016/5/10/chartex" xmlns:cx5="http://schemas.microsoft.com/office/drawing/2016/5/11/chartex" xmlns:cx6="http://schemas.microsoft.com/office/drawing/2016/5/12/chartex" xmlns:cx7="http://schemas.microsoft.com/office/drawing/2016/5/13/chartex" xmlns:cx8="http://schemas.microsoft.com/office/drawing/2016/5/14/chartex" xmlns:mc="http://schemas.openxmlformats.org/markup-compatibility/2006" xmlns:aink="http://schemas.microsoft.com/office/drawing/2016/ink" xmlns:am3d="http://schemas.microsoft.com/office/drawing/2017/model3d" xmlns:o="urn:schemas-microsoft-com:office:office" xmlns:oel="http://schemas.microsoft.com/office/2019/extlst" xmlns:r="http://schemas.openxmlformats.org/officeDocument/2006/relationships" xmlns:m="http://schemas.openxmlformats.org/officeDocument/2006/math" xmlns:v="urn:schemas-microsoft-com:vml" xmlns:wp14="http://schemas.microsoft.com/office/word/2010/wordprocessingDrawing" xmlns:wp="http://schemas.openxmlformats.org/drawingml/2006/wordprocessingDrawing" xmlns:w10="urn:schemas-microsoft-com:office:word" xmlns:w="http://schemas.openxmlformats.org/wordprocessingml/2006/main" xmlns:w14="http://schemas.microsoft.com/office/word/2010/wordml" xmlns:w15="http://schemas.microsoft.com/office/word/2012/wordml" xmlns:w16cex="http://schemas.microsoft.com/office/word/2018/wordml/cex" xmlns:w16cid="http://schemas.microsoft.com/office/word/2016/wordml/cid" xmlns:w16="http://schemas.microsoft.com/office/word/2018/wordml" xmlns:w16sdtdh="http://schemas.microsoft.com/office/word/2020/wordml/sdtdatahash" xmlns:w16se="http://schemas.microsoft.com/office/word/2015/wordml/symex" xmlns:wpg="http://schemas.microsoft.com/office/word/2010/wordprocessingGroup" xmlns:wpi="http://schemas.microsoft.com/office/word/2010/wordprocessingInk" xmlns:wne="http://schemas.microsoft.com/office/word/2006/wordml" xmlns:wps="http://schemas.microsoft.com/office/word/2010/wordprocessingShape" mc:Ignorable="w14 w15 w16se w16cid w16 w16cex w16sdtdh wp14">
+<w:endnotes xmlns:wpc="http://schemas.microsoft.com/office/word/2010/wordprocessingCanvas" xmlns:cx="http://schemas.microsoft.com/office/drawing/2014/chartex" xmlns:cx1="http://schemas.microsoft.com/office/drawing/2015/9/8/chartex" xmlns:cx2="http://schemas.microsoft.com/office/drawing/2015/10/21/chartex" xmlns:cx3="http://schemas.microsoft.com/office/drawing/2016/5/9/chartex" xmlns:cx4="http://schemas.microsoft.com/office/drawing/2016/5/10/chartex" xmlns:cx5="http://schemas.microsoft.com/office/drawing/2016/5/11/chartex" xmlns:cx6="http://schemas.microsoft.com/office/drawing/2016/5/12/chartex" xmlns:cx7="http://schemas.microsoft.com/office/drawing/2016/5/13/chartex" xmlns:cx8="http://schemas.microsoft.com/office/drawing/2016/5/14/chartex" xmlns:mc="http://schemas.openxmlformats.org/markup-compatibility/2006" xmlns:aink="http://schemas.microsoft.com/office/drawing/2016/ink" xmlns:am3d="http://schemas.microsoft.com/office/drawing/2017/model3d" xmlns:o="urn:schemas-microsoft-com:office:office" xmlns:oel="http://schemas.microsoft.com/office/2019/extlst" xmlns:r="http://schemas.openxmlformats.org/officeDocument/2006/relationships" xmlns:m="http://schemas.openxmlformats.org/officeDocument/2006/math" xmlns:v="urn:schemas-microsoft-com:vml" xmlns:wp14="http://schemas.microsoft.com/office/word/2010/wordprocessingDrawing" xmlns:wp="http://schemas.openxmlformats.org/drawingml/2006/wordprocessingDrawing" xmlns:w10="urn:schemas-microsoft-com:office:word" xmlns:w="http://schemas.openxmlformats.org/wordprocessingml/2006/main" xmlns:w14="http://schemas.microsoft.com/office/word/2010/wordml" xmlns:w15="http://schemas.microsoft.com/office/word/2012/wordml" xmlns:w16cex="http://schemas.microsoft.com/office/word/2018/wordml/cex" xmlns:w16cid="http://schemas.microsoft.com/office/word/2016/wordml/cid" xmlns:w16="http://schemas.microsoft.com/office/word/2018/wordml" xmlns:w16du="http://schemas.microsoft.com/office/word/2023/wordml/word16du" xmlns:w16sdtdh="http://schemas.microsoft.com/office/word/2020/wordml/sdtdatahash" xmlns:w16sdtfl="http://schemas.microsoft.com/office/word/2024/wordml/sdtformatlock" xmlns:w16se="http://schemas.microsoft.com/office/word/2015/wordml/symex" xmlns:wpg="http://schemas.microsoft.com/office/word/2010/wordprocessingGroup" xmlns:wpi="http://schemas.microsoft.com/office/word/2010/wordprocessingInk" xmlns:wne="http://schemas.microsoft.com/office/word/2006/wordml" xmlns:wps="http://schemas.microsoft.com/office/word/2010/wordprocessingShape" mc:Ignorable="w14 w15 w16se w16cid w16 w16cex w16sdtdh w16sdtfl w16du wp14">
   <w:endnote w:type="separator" w:id="-1">
     <w:p>
       <w:pPr>
@@ -9334,7 +9675,7 @@
 </file>
 
 <file path=word/footnotes.xml><?xml version="1.0" encoding="utf-8"?>
-<w:footnotes xmlns:wpc="http://schemas.microsoft.com/office/word/2010/wordprocessingCanvas" xmlns:cx="http://schemas.microsoft.com/office/drawing/2014/chartex" xmlns:cx1="http://schemas.microsoft.com/office/drawing/2015/9/8/chartex" xmlns:cx2="http://schemas.microsoft.com/office/drawing/2015/10/21/chartex" xmlns:cx3="http://schemas.microsoft.com/office/drawing/2016/5/9/chartex" xmlns:cx4="http://schemas.microsoft.com/office/drawing/2016/5/10/chartex" xmlns:cx5="http://schemas.microsoft.com/office/drawing/2016/5/11/chartex" xmlns:cx6="http://schemas.microsoft.com/office/drawing/2016/5/12/chartex" xmlns:cx7="http://schemas.microsoft.com/office/drawing/2016/5/13/chartex" xmlns:cx8="http://schemas.microsoft.com/office/drawing/2016/5/14/chartex" xmlns:mc="http://schemas.openxmlformats.org/markup-compatibility/2006" xmlns:aink="http://schemas.microsoft.com/office/drawing/2016/ink" xmlns:am3d="http://schemas.microsoft.com/office/drawing/2017/model3d" xmlns:o="urn:schemas-microsoft-com:office:office" xmlns:oel="http://schemas.microsoft.com/office/2019/extlst" xmlns:r="http://schemas.openxmlformats.org/officeDocument/2006/relationships" xmlns:m="http://schemas.openxmlformats.org/officeDocument/2006/math" xmlns:v="urn:schemas-microsoft-com:vml" xmlns:wp14="http://schemas.microsoft.com/office/word/2010/wordprocessingDrawing" xmlns:wp="http://schemas.openxmlformats.org/drawingml/2006/wordprocessingDrawing" xmlns:w10="urn:schemas-microsoft-com:office:word" xmlns:w="http://schemas.openxmlformats.org/wordprocessingml/2006/main" xmlns:w14="http://schemas.microsoft.com/office/word/2010/wordml" xmlns:w15="http://schemas.microsoft.com/office/word/2012/wordml" xmlns:w16cex="http://schemas.microsoft.com/office/word/2018/wordml/cex" xmlns:w16cid="http://schemas.microsoft.com/office/word/2016/wordml/cid" xmlns:w16="http://schemas.microsoft.com/office/word/2018/wordml" xmlns:w16sdtdh="http://schemas.microsoft.com/office/word/2020/wordml/sdtdatahash" xmlns:w16se="http://schemas.microsoft.com/office/word/2015/wordml/symex" xmlns:wpg="http://schemas.microsoft.com/office/word/2010/wordprocessingGroup" xmlns:wpi="http://schemas.microsoft.com/office/word/2010/wordprocessingInk" xmlns:wne="http://schemas.microsoft.com/office/word/2006/wordml" xmlns:wps="http://schemas.microsoft.com/office/word/2010/wordprocessingShape" mc:Ignorable="w14 w15 w16se w16cid w16 w16cex w16sdtdh wp14">
+<w:footnotes xmlns:wpc="http://schemas.microsoft.com/office/word/2010/wordprocessingCanvas" xmlns:cx="http://schemas.microsoft.com/office/drawing/2014/chartex" xmlns:cx1="http://schemas.microsoft.com/office/drawing/2015/9/8/chartex" xmlns:cx2="http://schemas.microsoft.com/office/drawing/2015/10/21/chartex" xmlns:cx3="http://schemas.microsoft.com/office/drawing/2016/5/9/chartex" xmlns:cx4="http://schemas.microsoft.com/office/drawing/2016/5/10/chartex" xmlns:cx5="http://schemas.microsoft.com/office/drawing/2016/5/11/chartex" xmlns:cx6="http://schemas.microsoft.com/office/drawing/2016/5/12/chartex" xmlns:cx7="http://schemas.microsoft.com/office/drawing/2016/5/13/chartex" xmlns:cx8="http://schemas.microsoft.com/office/drawing/2016/5/14/chartex" xmlns:mc="http://schemas.openxmlformats.org/markup-compatibility/2006" xmlns:aink="http://schemas.microsoft.com/office/drawing/2016/ink" xmlns:am3d="http://schemas.microsoft.com/office/drawing/2017/model3d" xmlns:o="urn:schemas-microsoft-com:office:office" xmlns:oel="http://schemas.microsoft.com/office/2019/extlst" xmlns:r="http://schemas.openxmlformats.org/officeDocument/2006/relationships" xmlns:m="http://schemas.openxmlformats.org/officeDocument/2006/math" xmlns:v="urn:schemas-microsoft-com:vml" xmlns:wp14="http://schemas.microsoft.com/office/word/2010/wordprocessingDrawing" xmlns:wp="http://schemas.openxmlformats.org/drawingml/2006/wordprocessingDrawing" xmlns:w10="urn:schemas-microsoft-com:office:word" xmlns:w="http://schemas.openxmlformats.org/wordprocessingml/2006/main" xmlns:w14="http://schemas.microsoft.com/office/word/2010/wordml" xmlns:w15="http://schemas.microsoft.com/office/word/2012/wordml" xmlns:w16cex="http://schemas.microsoft.com/office/word/2018/wordml/cex" xmlns:w16cid="http://schemas.microsoft.com/office/word/2016/wordml/cid" xmlns:w16="http://schemas.microsoft.com/office/word/2018/wordml" xmlns:w16du="http://schemas.microsoft.com/office/word/2023/wordml/word16du" xmlns:w16sdtdh="http://schemas.microsoft.com/office/word/2020/wordml/sdtdatahash" xmlns:w16sdtfl="http://schemas.microsoft.com/office/word/2024/wordml/sdtformatlock" xmlns:w16se="http://schemas.microsoft.com/office/word/2015/wordml/symex" xmlns:wpg="http://schemas.microsoft.com/office/word/2010/wordprocessingGroup" xmlns:wpi="http://schemas.microsoft.com/office/word/2010/wordprocessingInk" xmlns:wne="http://schemas.microsoft.com/office/word/2006/wordml" xmlns:wps="http://schemas.microsoft.com/office/word/2010/wordprocessingShape" mc:Ignorable="w14 w15 w16se w16cid w16 w16cex w16sdtdh w16sdtfl w16du wp14">
   <w:footnote w:type="separator" w:id="-1">
     <w:p>
       <w:pPr>
@@ -9359,7 +9700,7 @@
 </file>
 
 <file path=word/header1.xml><?xml version="1.0" encoding="utf-8"?>
-<w:hdr xmlns:wpc="http://schemas.microsoft.com/office/word/2010/wordprocessingCanvas" xmlns:cx="http://schemas.microsoft.com/office/drawing/2014/chartex" xmlns:cx1="http://schemas.microsoft.com/office/drawing/2015/9/8/chartex" xmlns:cx2="http://schemas.microsoft.com/office/drawing/2015/10/21/chartex" xmlns:cx3="http://schemas.microsoft.com/office/drawing/2016/5/9/chartex" xmlns:cx4="http://schemas.microsoft.com/office/drawing/2016/5/10/chartex" xmlns:cx5="http://schemas.microsoft.com/office/drawing/2016/5/11/chartex" xmlns:cx6="http://schemas.microsoft.com/office/drawing/2016/5/12/chartex" xmlns:cx7="http://schemas.microsoft.com/office/drawing/2016/5/13/chartex" xmlns:cx8="http://schemas.microsoft.com/office/drawing/2016/5/14/chartex" xmlns:mc="http://schemas.openxmlformats.org/markup-compatibility/2006" xmlns:aink="http://schemas.microsoft.com/office/drawing/2016/ink" xmlns:am3d="http://schemas.microsoft.com/office/drawing/2017/model3d" xmlns:o="urn:schemas-microsoft-com:office:office" xmlns:oel="http://schemas.microsoft.com/office/2019/extlst" xmlns:r="http://schemas.openxmlformats.org/officeDocument/2006/relationships" xmlns:m="http://schemas.openxmlformats.org/officeDocument/2006/math" xmlns:v="urn:schemas-microsoft-com:vml" xmlns:wp14="http://schemas.microsoft.com/office/word/2010/wordprocessingDrawing" xmlns:wp="http://schemas.openxmlformats.org/drawingml/2006/wordprocessingDrawing" xmlns:w10="urn:schemas-microsoft-com:office:word" xmlns:w="http://schemas.openxmlformats.org/wordprocessingml/2006/main" xmlns:w14="http://schemas.microsoft.com/office/word/2010/wordml" xmlns:w15="http://schemas.microsoft.com/office/word/2012/wordml" xmlns:w16cex="http://schemas.microsoft.com/office/word/2018/wordml/cex" xmlns:w16cid="http://schemas.microsoft.com/office/word/2016/wordml/cid" xmlns:w16="http://schemas.microsoft.com/office/word/2018/wordml" xmlns:w16sdtdh="http://schemas.microsoft.com/office/word/2020/wordml/sdtdatahash" xmlns:w16se="http://schemas.microsoft.com/office/word/2015/wordml/symex" xmlns:wpg="http://schemas.microsoft.com/office/word/2010/wordprocessingGroup" xmlns:wpi="http://schemas.microsoft.com/office/word/2010/wordprocessingInk" xmlns:wne="http://schemas.microsoft.com/office/word/2006/wordml" xmlns:wps="http://schemas.microsoft.com/office/word/2010/wordprocessingShape" mc:Ignorable="w14 w15 w16se w16cid w16 w16cex w16sdtdh wp14">
+<w:hdr xmlns:wpc="http://schemas.microsoft.com/office/word/2010/wordprocessingCanvas" xmlns:cx="http://schemas.microsoft.com/office/drawing/2014/chartex" xmlns:cx1="http://schemas.microsoft.com/office/drawing/2015/9/8/chartex" xmlns:cx2="http://schemas.microsoft.com/office/drawing/2015/10/21/chartex" xmlns:cx3="http://schemas.microsoft.com/office/drawing/2016/5/9/chartex" xmlns:cx4="http://schemas.microsoft.com/office/drawing/2016/5/10/chartex" xmlns:cx5="http://schemas.microsoft.com/office/drawing/2016/5/11/chartex" xmlns:cx6="http://schemas.microsoft.com/office/drawing/2016/5/12/chartex" xmlns:cx7="http://schemas.microsoft.com/office/drawing/2016/5/13/chartex" xmlns:cx8="http://schemas.microsoft.com/office/drawing/2016/5/14/chartex" xmlns:mc="http://schemas.openxmlformats.org/markup-compatibility/2006" xmlns:aink="http://schemas.microsoft.com/office/drawing/2016/ink" xmlns:am3d="http://schemas.microsoft.com/office/drawing/2017/model3d" xmlns:o="urn:schemas-microsoft-com:office:office" xmlns:oel="http://schemas.microsoft.com/office/2019/extlst" xmlns:r="http://schemas.openxmlformats.org/officeDocument/2006/relationships" xmlns:m="http://schemas.openxmlformats.org/officeDocument/2006/math" xmlns:v="urn:schemas-microsoft-com:vml" xmlns:wp14="http://schemas.microsoft.com/office/word/2010/wordprocessingDrawing" xmlns:wp="http://schemas.openxmlformats.org/drawingml/2006/wordprocessingDrawing" xmlns:w10="urn:schemas-microsoft-com:office:word" xmlns:w="http://schemas.openxmlformats.org/wordprocessingml/2006/main" xmlns:w14="http://schemas.microsoft.com/office/word/2010/wordml" xmlns:w15="http://schemas.microsoft.com/office/word/2012/wordml" xmlns:w16cex="http://schemas.microsoft.com/office/word/2018/wordml/cex" xmlns:w16cid="http://schemas.microsoft.com/office/word/2016/wordml/cid" xmlns:w16="http://schemas.microsoft.com/office/word/2018/wordml" xmlns:w16du="http://schemas.microsoft.com/office/word/2023/wordml/word16du" xmlns:w16sdtdh="http://schemas.microsoft.com/office/word/2020/wordml/sdtdatahash" xmlns:w16sdtfl="http://schemas.microsoft.com/office/word/2024/wordml/sdtformatlock" xmlns:w16se="http://schemas.microsoft.com/office/word/2015/wordml/symex" xmlns:wpg="http://schemas.microsoft.com/office/word/2010/wordprocessingGroup" xmlns:wpi="http://schemas.microsoft.com/office/word/2010/wordprocessingInk" xmlns:wne="http://schemas.microsoft.com/office/word/2006/wordml" xmlns:wps="http://schemas.microsoft.com/office/word/2010/wordprocessingShape" mc:Ignorable="w14 w15 w16se w16cid w16 w16cex w16sdtdh w16sdtfl w16du wp14">
   <w:p>
     <w:pPr>
       <w:pStyle w:val="Cabealho"/>
@@ -9416,7 +9757,7 @@
 </file>
 
 <file path=word/numbering.xml><?xml version="1.0" encoding="utf-8"?>
-<w:numbering xmlns:wpc="http://schemas.microsoft.com/office/word/2010/wordprocessingCanvas" xmlns:cx="http://schemas.microsoft.com/office/drawing/2014/chartex" xmlns:cx1="http://schemas.microsoft.com/office/drawing/2015/9/8/chartex" xmlns:cx2="http://schemas.microsoft.com/office/drawing/2015/10/21/chartex" xmlns:cx3="http://schemas.microsoft.com/office/drawing/2016/5/9/chartex" xmlns:cx4="http://schemas.microsoft.com/office/drawing/2016/5/10/chartex" xmlns:cx5="http://schemas.microsoft.com/office/drawing/2016/5/11/chartex" xmlns:cx6="http://schemas.microsoft.com/office/drawing/2016/5/12/chartex" xmlns:cx7="http://schemas.microsoft.com/office/drawing/2016/5/13/chartex" xmlns:cx8="http://schemas.microsoft.com/office/drawing/2016/5/14/chartex" xmlns:mc="http://schemas.openxmlformats.org/markup-compatibility/2006" xmlns:aink="http://schemas.microsoft.com/office/drawing/2016/ink" xmlns:am3d="http://schemas.microsoft.com/office/drawing/2017/model3d" xmlns:o="urn:schemas-microsoft-com:office:office" xmlns:oel="http://schemas.microsoft.com/office/2019/extlst" xmlns:r="http://schemas.openxmlformats.org/officeDocument/2006/relationships" xmlns:m="http://schemas.openxmlformats.org/officeDocument/2006/math" xmlns:v="urn:schemas-microsoft-com:vml" xmlns:wp14="http://schemas.microsoft.com/office/word/2010/wordprocessingDrawing" xmlns:wp="http://schemas.openxmlformats.org/drawingml/2006/wordprocessingDrawing" xmlns:w10="urn:schemas-microsoft-com:office:word" xmlns:w="http://schemas.openxmlformats.org/wordprocessingml/2006/main" xmlns:w14="http://schemas.microsoft.com/office/word/2010/wordml" xmlns:w15="http://schemas.microsoft.com/office/word/2012/wordml" xmlns:w16cex="http://schemas.microsoft.com/office/word/2018/wordml/cex" xmlns:w16cid="http://schemas.microsoft.com/office/word/2016/wordml/cid" xmlns:w16="http://schemas.microsoft.com/office/word/2018/wordml" xmlns:w16sdtdh="http://schemas.microsoft.com/office/word/2020/wordml/sdtdatahash" xmlns:w16se="http://schemas.microsoft.com/office/word/2015/wordml/symex" xmlns:wpg="http://schemas.microsoft.com/office/word/2010/wordprocessingGroup" xmlns:wpi="http://schemas.microsoft.com/office/word/2010/wordprocessingInk" xmlns:wne="http://schemas.microsoft.com/office/word/2006/wordml" xmlns:wps="http://schemas.microsoft.com/office/word/2010/wordprocessingShape" mc:Ignorable="w14 w15 w16se w16cid w16 w16cex w16sdtdh wp14">
+<w:numbering xmlns:wpc="http://schemas.microsoft.com/office/word/2010/wordprocessingCanvas" xmlns:cx="http://schemas.microsoft.com/office/drawing/2014/chartex" xmlns:cx1="http://schemas.microsoft.com/office/drawing/2015/9/8/chartex" xmlns:cx2="http://schemas.microsoft.com/office/drawing/2015/10/21/chartex" xmlns:cx3="http://schemas.microsoft.com/office/drawing/2016/5/9/chartex" xmlns:cx4="http://schemas.microsoft.com/office/drawing/2016/5/10/chartex" xmlns:cx5="http://schemas.microsoft.com/office/drawing/2016/5/11/chartex" xmlns:cx6="http://schemas.microsoft.com/office/drawing/2016/5/12/chartex" xmlns:cx7="http://schemas.microsoft.com/office/drawing/2016/5/13/chartex" xmlns:cx8="http://schemas.microsoft.com/office/drawing/2016/5/14/chartex" xmlns:mc="http://schemas.openxmlformats.org/markup-compatibility/2006" xmlns:aink="http://schemas.microsoft.com/office/drawing/2016/ink" xmlns:am3d="http://schemas.microsoft.com/office/drawing/2017/model3d" xmlns:o="urn:schemas-microsoft-com:office:office" xmlns:oel="http://schemas.microsoft.com/office/2019/extlst" xmlns:r="http://schemas.openxmlformats.org/officeDocument/2006/relationships" xmlns:m="http://schemas.openxmlformats.org/officeDocument/2006/math" xmlns:v="urn:schemas-microsoft-com:vml" xmlns:wp14="http://schemas.microsoft.com/office/word/2010/wordprocessingDrawing" xmlns:wp="http://schemas.openxmlformats.org/drawingml/2006/wordprocessingDrawing" xmlns:w10="urn:schemas-microsoft-com:office:word" xmlns:w="http://schemas.openxmlformats.org/wordprocessingml/2006/main" xmlns:w14="http://schemas.microsoft.com/office/word/2010/wordml" xmlns:w15="http://schemas.microsoft.com/office/word/2012/wordml" xmlns:w16cex="http://schemas.microsoft.com/office/word/2018/wordml/cex" xmlns:w16cid="http://schemas.microsoft.com/office/word/2016/wordml/cid" xmlns:w16="http://schemas.microsoft.com/office/word/2018/wordml" xmlns:w16du="http://schemas.microsoft.com/office/word/2023/wordml/word16du" xmlns:w16sdtdh="http://schemas.microsoft.com/office/word/2020/wordml/sdtdatahash" xmlns:w16sdtfl="http://schemas.microsoft.com/office/word/2024/wordml/sdtformatlock" xmlns:w16se="http://schemas.microsoft.com/office/word/2015/wordml/symex" xmlns:wpg="http://schemas.microsoft.com/office/word/2010/wordprocessingGroup" xmlns:wpi="http://schemas.microsoft.com/office/word/2010/wordprocessingInk" xmlns:wne="http://schemas.microsoft.com/office/word/2006/wordml" xmlns:wps="http://schemas.microsoft.com/office/word/2010/wordprocessingShape" mc:Ignorable="w14 w15 w16se w16cid w16 w16cex w16sdtdh w16sdtfl w16du wp14">
   <w:abstractNum w:abstractNumId="0" w15:restartNumberingAfterBreak="0">
     <w:nsid w:val="04350B33"/>
     <w:multiLevelType w:val="multilevel"/>
@@ -10705,6 +11046,119 @@
     </w:lvl>
   </w:abstractNum>
   <w:abstractNum w:abstractNumId="9" w15:restartNumberingAfterBreak="0">
+    <w:nsid w:val="31BB1FCC"/>
+    <w:multiLevelType w:val="multilevel"/>
+    <w:tmpl w:val="3F66985E"/>
+    <w:lvl w:ilvl="0">
+      <w:start w:val="1"/>
+      <w:numFmt w:val="decimal"/>
+      <w:lvlText w:val="%1."/>
+      <w:lvlJc w:val="left"/>
+      <w:pPr>
+        <w:tabs>
+          <w:tab w:val="num" w:pos="360"/>
+        </w:tabs>
+        <w:ind w:left="360" w:hanging="360"/>
+      </w:pPr>
+    </w:lvl>
+    <w:lvl w:ilvl="1" w:tentative="1">
+      <w:start w:val="1"/>
+      <w:numFmt w:val="decimal"/>
+      <w:lvlText w:val="%2."/>
+      <w:lvlJc w:val="left"/>
+      <w:pPr>
+        <w:tabs>
+          <w:tab w:val="num" w:pos="1080"/>
+        </w:tabs>
+        <w:ind w:left="1080" w:hanging="360"/>
+      </w:pPr>
+    </w:lvl>
+    <w:lvl w:ilvl="2" w:tentative="1">
+      <w:start w:val="1"/>
+      <w:numFmt w:val="decimal"/>
+      <w:lvlText w:val="%3."/>
+      <w:lvlJc w:val="left"/>
+      <w:pPr>
+        <w:tabs>
+          <w:tab w:val="num" w:pos="1800"/>
+        </w:tabs>
+        <w:ind w:left="1800" w:hanging="360"/>
+      </w:pPr>
+    </w:lvl>
+    <w:lvl w:ilvl="3" w:tentative="1">
+      <w:start w:val="1"/>
+      <w:numFmt w:val="decimal"/>
+      <w:lvlText w:val="%4."/>
+      <w:lvlJc w:val="left"/>
+      <w:pPr>
+        <w:tabs>
+          <w:tab w:val="num" w:pos="2520"/>
+        </w:tabs>
+        <w:ind w:left="2520" w:hanging="360"/>
+      </w:pPr>
+    </w:lvl>
+    <w:lvl w:ilvl="4" w:tentative="1">
+      <w:start w:val="1"/>
+      <w:numFmt w:val="decimal"/>
+      <w:lvlText w:val="%5."/>
+      <w:lvlJc w:val="left"/>
+      <w:pPr>
+        <w:tabs>
+          <w:tab w:val="num" w:pos="3240"/>
+        </w:tabs>
+        <w:ind w:left="3240" w:hanging="360"/>
+      </w:pPr>
+    </w:lvl>
+    <w:lvl w:ilvl="5" w:tentative="1">
+      <w:start w:val="1"/>
+      <w:numFmt w:val="decimal"/>
+      <w:lvlText w:val="%6."/>
+      <w:lvlJc w:val="left"/>
+      <w:pPr>
+        <w:tabs>
+          <w:tab w:val="num" w:pos="3960"/>
+        </w:tabs>
+        <w:ind w:left="3960" w:hanging="360"/>
+      </w:pPr>
+    </w:lvl>
+    <w:lvl w:ilvl="6" w:tentative="1">
+      <w:start w:val="1"/>
+      <w:numFmt w:val="decimal"/>
+      <w:lvlText w:val="%7."/>
+      <w:lvlJc w:val="left"/>
+      <w:pPr>
+        <w:tabs>
+          <w:tab w:val="num" w:pos="4680"/>
+        </w:tabs>
+        <w:ind w:left="4680" w:hanging="360"/>
+      </w:pPr>
+    </w:lvl>
+    <w:lvl w:ilvl="7" w:tentative="1">
+      <w:start w:val="1"/>
+      <w:numFmt w:val="decimal"/>
+      <w:lvlText w:val="%8."/>
+      <w:lvlJc w:val="left"/>
+      <w:pPr>
+        <w:tabs>
+          <w:tab w:val="num" w:pos="5400"/>
+        </w:tabs>
+        <w:ind w:left="5400" w:hanging="360"/>
+      </w:pPr>
+    </w:lvl>
+    <w:lvl w:ilvl="8" w:tentative="1">
+      <w:start w:val="1"/>
+      <w:numFmt w:val="decimal"/>
+      <w:lvlText w:val="%9."/>
+      <w:lvlJc w:val="left"/>
+      <w:pPr>
+        <w:tabs>
+          <w:tab w:val="num" w:pos="6120"/>
+        </w:tabs>
+        <w:ind w:left="6120" w:hanging="360"/>
+      </w:pPr>
+    </w:lvl>
+  </w:abstractNum>
+  <w:abstractNum w:abstractNumId="10" w15:restartNumberingAfterBreak="0">
     <w:nsid w:val="3D9E062B"/>
     <w:multiLevelType w:val="multilevel"/>
     <w:tmpl w:val="AA18FA12"/>
@@ -10853,7 +11307,7 @@
       </w:rPr>
     </w:lvl>
   </w:abstractNum>
-  <w:abstractNum w:abstractNumId="10" w15:restartNumberingAfterBreak="0">
+  <w:abstractNum w:abstractNumId="11" w15:restartNumberingAfterBreak="0">
     <w:nsid w:val="3F3051C8"/>
     <w:multiLevelType w:val="multilevel"/>
     <w:tmpl w:val="34589346"/>
@@ -11002,7 +11456,120 @@
       </w:rPr>
     </w:lvl>
   </w:abstractNum>
-  <w:abstractNum w:abstractNumId="11" w15:restartNumberingAfterBreak="0">
+  <w:abstractNum w:abstractNumId="12" w15:restartNumberingAfterBreak="0">
+    <w:nsid w:val="42AF083B"/>
+    <w:multiLevelType w:val="hybridMultilevel"/>
+    <w:tmpl w:val="DCC2AE88"/>
+    <w:lvl w:ilvl="0" w:tplc="04160001">
+      <w:start w:val="1"/>
+      <w:numFmt w:val="bullet"/>
+      <w:lvlText w:val=""/>
+      <w:lvlJc w:val="left"/>
+      <w:pPr>
+        <w:ind w:left="1434" w:hanging="360"/>
+      </w:pPr>
+      <w:rPr>
+        <w:rFonts w:ascii="Symbol" w:hAnsi="Symbol" w:hint="default"/>
+      </w:rPr>
+    </w:lvl>
+    <w:lvl w:ilvl="1" w:tplc="04160003" w:tentative="1">
+      <w:start w:val="1"/>
+      <w:numFmt w:val="bullet"/>
+      <w:lvlText w:val="o"/>
+      <w:lvlJc w:val="left"/>
+      <w:pPr>
+        <w:ind w:left="2154" w:hanging="360"/>
+      </w:pPr>
+      <w:rPr>
+        <w:rFonts w:ascii="Courier New" w:hAnsi="Courier New" w:cs="Courier New" w:hint="default"/>
+      </w:rPr>
+    </w:lvl>
+    <w:lvl w:ilvl="2" w:tplc="04160005" w:tentative="1">
+      <w:start w:val="1"/>
+      <w:numFmt w:val="bullet"/>
+      <w:lvlText w:val=""/>
+      <w:lvlJc w:val="left"/>
+      <w:pPr>
+        <w:ind w:left="2874" w:hanging="360"/>
+      </w:pPr>
+      <w:rPr>
+        <w:rFonts w:ascii="Wingdings" w:hAnsi="Wingdings" w:hint="default"/>
+      </w:rPr>
+    </w:lvl>
+    <w:lvl w:ilvl="3" w:tplc="04160001" w:tentative="1">
+      <w:start w:val="1"/>
+      <w:numFmt w:val="bullet"/>
+      <w:lvlText w:val=""/>
+      <w:lvlJc w:val="left"/>
+      <w:pPr>
+        <w:ind w:left="3594" w:hanging="360"/>
+      </w:pPr>
+      <w:rPr>
+        <w:rFonts w:ascii="Symbol" w:hAnsi="Symbol" w:hint="default"/>
+      </w:rPr>
+    </w:lvl>
+    <w:lvl w:ilvl="4" w:tplc="04160003" w:tentative="1">
+      <w:start w:val="1"/>
+      <w:numFmt w:val="bullet"/>
+      <w:lvlText w:val="o"/>
+      <w:lvlJc w:val="left"/>
+      <w:pPr>
+        <w:ind w:left="4314" w:hanging="360"/>
+      </w:pPr>
+      <w:rPr>
+        <w:rFonts w:ascii="Courier New" w:hAnsi="Courier New" w:cs="Courier New" w:hint="default"/>
+      </w:rPr>
+    </w:lvl>
+    <w:lvl w:ilvl="5" w:tplc="04160005" w:tentative="1">
+      <w:start w:val="1"/>
+      <w:numFmt w:val="bullet"/>
+      <w:lvlText w:val=""/>
+      <w:lvlJc w:val="left"/>
+      <w:pPr>
+        <w:ind w:left="5034" w:hanging="360"/>
+      </w:pPr>
+      <w:rPr>
+        <w:rFonts w:ascii="Wingdings" w:hAnsi="Wingdings" w:hint="default"/>
+      </w:rPr>
+    </w:lvl>
+    <w:lvl w:ilvl="6" w:tplc="04160001" w:tentative="1">
+      <w:start w:val="1"/>
+      <w:numFmt w:val="bullet"/>
+      <w:lvlText w:val=""/>
+      <w:lvlJc w:val="left"/>
+      <w:pPr>
+        <w:ind w:left="5754" w:hanging="360"/>
+      </w:pPr>
+      <w:rPr>
+        <w:rFonts w:ascii="Symbol" w:hAnsi="Symbol" w:hint="default"/>
+      </w:rPr>
+    </w:lvl>
+    <w:lvl w:ilvl="7" w:tplc="04160003" w:tentative="1">
+      <w:start w:val="1"/>
+      <w:numFmt w:val="bullet"/>
+      <w:lvlText w:val="o"/>
+      <w:lvlJc w:val="left"/>
+      <w:pPr>
+        <w:ind w:left="6474" w:hanging="360"/>
+      </w:pPr>
+      <w:rPr>
+        <w:rFonts w:ascii="Courier New" w:hAnsi="Courier New" w:cs="Courier New" w:hint="default"/>
+      </w:rPr>
+    </w:lvl>
+    <w:lvl w:ilvl="8" w:tplc="04160005" w:tentative="1">
+      <w:start w:val="1"/>
+      <w:numFmt w:val="bullet"/>
+      <w:lvlText w:val=""/>
+      <w:lvlJc w:val="left"/>
+      <w:pPr>
+        <w:ind w:left="7194" w:hanging="360"/>
+      </w:pPr>
+      <w:rPr>
+        <w:rFonts w:ascii="Wingdings" w:hAnsi="Wingdings" w:hint="default"/>
+      </w:rPr>
+    </w:lvl>
+  </w:abstractNum>
+  <w:abstractNum w:abstractNumId="13" w15:restartNumberingAfterBreak="0">
     <w:nsid w:val="5BF80FCA"/>
     <w:multiLevelType w:val="multilevel"/>
     <w:tmpl w:val="EB884A90"/>
@@ -11151,7 +11718,7 @@
       </w:rPr>
     </w:lvl>
   </w:abstractNum>
-  <w:abstractNum w:abstractNumId="12" w15:restartNumberingAfterBreak="0">
+  <w:abstractNum w:abstractNumId="14" w15:restartNumberingAfterBreak="0">
     <w:nsid w:val="5FD52CB0"/>
     <w:multiLevelType w:val="multilevel"/>
     <w:tmpl w:val="4AEC8DDE"/>
@@ -11300,7 +11867,7 @@
       </w:rPr>
     </w:lvl>
   </w:abstractNum>
-  <w:abstractNum w:abstractNumId="13" w15:restartNumberingAfterBreak="0">
+  <w:abstractNum w:abstractNumId="15" w15:restartNumberingAfterBreak="0">
     <w:nsid w:val="687C1936"/>
     <w:multiLevelType w:val="multilevel"/>
     <w:tmpl w:val="9F6A576A"/>
@@ -11449,7 +12016,7 @@
       </w:rPr>
     </w:lvl>
   </w:abstractNum>
-  <w:abstractNum w:abstractNumId="14" w15:restartNumberingAfterBreak="0">
+  <w:abstractNum w:abstractNumId="16" w15:restartNumberingAfterBreak="0">
     <w:nsid w:val="69D43D4F"/>
     <w:multiLevelType w:val="multilevel"/>
     <w:tmpl w:val="A19EC43C"/>
@@ -11598,7 +12165,7 @@
       </w:rPr>
     </w:lvl>
   </w:abstractNum>
-  <w:abstractNum w:abstractNumId="15" w15:restartNumberingAfterBreak="0">
+  <w:abstractNum w:abstractNumId="17" w15:restartNumberingAfterBreak="0">
     <w:nsid w:val="71C01DF2"/>
     <w:multiLevelType w:val="multilevel"/>
     <w:tmpl w:val="05002F88"/>
@@ -11757,7 +12324,7 @@
     <w:abstractNumId w:val="3"/>
   </w:num>
   <w:num w:numId="4" w16cid:durableId="1479692670">
-    <w:abstractNumId w:val="14"/>
+    <w:abstractNumId w:val="16"/>
   </w:num>
   <w:num w:numId="5" w16cid:durableId="711854097">
     <w:abstractNumId w:val="4"/>
@@ -11766,16 +12333,16 @@
     <w:abstractNumId w:val="6"/>
   </w:num>
   <w:num w:numId="7" w16cid:durableId="755201251">
-    <w:abstractNumId w:val="10"/>
+    <w:abstractNumId w:val="11"/>
   </w:num>
   <w:num w:numId="8" w16cid:durableId="1763070424">
-    <w:abstractNumId w:val="15"/>
+    <w:abstractNumId w:val="17"/>
   </w:num>
   <w:num w:numId="9" w16cid:durableId="1822771946">
     <w:abstractNumId w:val="2"/>
   </w:num>
   <w:num w:numId="10" w16cid:durableId="109860867">
-    <w:abstractNumId w:val="9"/>
+    <w:abstractNumId w:val="10"/>
   </w:num>
   <w:num w:numId="11" w16cid:durableId="890726207">
     <w:abstractNumId w:val="8"/>
@@ -11784,22 +12351,28 @@
     <w:abstractNumId w:val="7"/>
   </w:num>
   <w:num w:numId="13" w16cid:durableId="1976638538">
-    <w:abstractNumId w:val="11"/>
+    <w:abstractNumId w:val="13"/>
   </w:num>
   <w:num w:numId="14" w16cid:durableId="1815175476">
-    <w:abstractNumId w:val="13"/>
+    <w:abstractNumId w:val="15"/>
   </w:num>
   <w:num w:numId="15" w16cid:durableId="1929926131">
-    <w:abstractNumId w:val="12"/>
+    <w:abstractNumId w:val="14"/>
   </w:num>
   <w:num w:numId="16" w16cid:durableId="1588072459">
     <w:abstractNumId w:val="0"/>
+  </w:num>
+  <w:num w:numId="17" w16cid:durableId="516887270">
+    <w:abstractNumId w:val="12"/>
+  </w:num>
+  <w:num w:numId="18" w16cid:durableId="1933276861">
+    <w:abstractNumId w:val="9"/>
   </w:num>
 </w:numbering>
 </file>
 
 <file path=word/styles.xml><?xml version="1.0" encoding="utf-8"?>
-<w:styles xmlns:mc="http://schemas.openxmlformats.org/markup-compatibility/2006" xmlns:r="http://schemas.openxmlformats.org/officeDocument/2006/relationships" xmlns:w="http://schemas.openxmlformats.org/wordprocessingml/2006/main" xmlns:w14="http://schemas.microsoft.com/office/word/2010/wordml" xmlns:w15="http://schemas.microsoft.com/office/word/2012/wordml" xmlns:w16cex="http://schemas.microsoft.com/office/word/2018/wordml/cex" xmlns:w16cid="http://schemas.microsoft.com/office/word/2016/wordml/cid" xmlns:w16="http://schemas.microsoft.com/office/word/2018/wordml" xmlns:w16sdtdh="http://schemas.microsoft.com/office/word/2020/wordml/sdtdatahash" xmlns:w16se="http://schemas.microsoft.com/office/word/2015/wordml/symex" mc:Ignorable="w14 w15 w16se w16cid w16 w16cex w16sdtdh">
+<w:styles xmlns:mc="http://schemas.openxmlformats.org/markup-compatibility/2006" xmlns:r="http://schemas.openxmlformats.org/officeDocument/2006/relationships" xmlns:w="http://schemas.openxmlformats.org/wordprocessingml/2006/main" xmlns:w14="http://schemas.microsoft.com/office/word/2010/wordml" xmlns:w15="http://schemas.microsoft.com/office/word/2012/wordml" xmlns:w16cex="http://schemas.microsoft.com/office/word/2018/wordml/cex" xmlns:w16cid="http://schemas.microsoft.com/office/word/2016/wordml/cid" xmlns:w16="http://schemas.microsoft.com/office/word/2018/wordml" xmlns:w16du="http://schemas.microsoft.com/office/word/2023/wordml/word16du" xmlns:w16sdtdh="http://schemas.microsoft.com/office/word/2020/wordml/sdtdatahash" xmlns:w16sdtfl="http://schemas.microsoft.com/office/word/2024/wordml/sdtformatlock" xmlns:w16se="http://schemas.microsoft.com/office/word/2015/wordml/symex" mc:Ignorable="w14 w15 w16se w16cid w16 w16cex w16sdtdh w16sdtfl w16du">
   <w:docDefaults>
     <w:rPrDefault>
       <w:rPr>
@@ -12838,6 +13411,29 @@
       <w:u w:val="single"/>
     </w:rPr>
   </w:style>
+  <w:style w:type="paragraph" w:styleId="NormalWeb">
+    <w:name w:val="Normal (Web)"/>
+    <w:basedOn w:val="Normal"/>
+    <w:uiPriority w:val="99"/>
+    <w:semiHidden/>
+    <w:unhideWhenUsed/>
+    <w:rsid w:val="004664F5"/>
+    <w:rPr>
+      <w:rFonts w:ascii="Times New Roman" w:hAnsi="Times New Roman" w:cs="Times New Roman"/>
+    </w:rPr>
+  </w:style>
+  <w:style w:type="character" w:styleId="MenoPendente">
+    <w:name w:val="Unresolved Mention"/>
+    <w:basedOn w:val="Fontepargpadro"/>
+    <w:uiPriority w:val="99"/>
+    <w:semiHidden/>
+    <w:unhideWhenUsed/>
+    <w:rsid w:val="00282AB8"/>
+    <w:rPr>
+      <w:color w:val="605E5C"/>
+      <w:shd w:val="clear" w:color="auto" w:fill="E1DFDD"/>
+    </w:rPr>
+  </w:style>
 </w:styles>
 </file>
 

</xml_diff>